<commit_message>
Tu Talento: manual 2.1 con datos verificados (ANDA, IMSS, Buró, RESICO, bancos digitales)
Co-Authored-By: Claude Opus 5.5 <noreply@anthropic.com>
Claude-Session: https://claude.ai/code/session_01P5F6YBSbmgYFHyY7RUeBgK
</commit_message>
<xml_diff>
--- a/proyecto-entretenimiento/manual/TTMF_manual_v2.docx
+++ b/proyecto-entretenimiento/manual/TTMF_manual_v2.docx
@@ -32,7 +32,7 @@
           <w:sz w:val="28"/>
           <w:szCs w:val="28"/>
         </w:rPr>
-        <w:t xml:space="preserve">Manual del programa · Versión 2 · Septiembre de 2026</w:t>
+        <w:t xml:space="preserve">Manual del programa · Versión 2.1 · Septiembre de 2026</w:t>
       </w:r>
     </w:p>
     <w:p>
@@ -379,7 +379,7 @@
                 <w:sz w:val="18"/>
                 <w:szCs w:val="18"/>
               </w:rPr>
-              <w:t xml:space="preserve">11 módulos, 68 lecciones de 5 a 10 minutos</w:t>
+              <w:t xml:space="preserve">11 módulos, 72 lecciones de 5 a 10 minutos</w:t>
             </w:r>
           </w:p>
         </w:tc>
@@ -695,7 +695,7 @@
                 <w:sz w:val="18"/>
                 <w:szCs w:val="18"/>
               </w:rPr>
-              <w:t xml:space="preserve">Actor de TV, teatro y streaming. Cobra a veces por Asimilados y a veces factura en RESICO</w:t>
+              <w:t xml:space="preserve">Actor de TV, teatro y streaming. Cobra a veces por Asimilados y a veces factura. No sabe que esa combinación puede sacarlo de RESICO</w:t>
             </w:r>
           </w:p>
         </w:tc>
@@ -1872,7 +1872,69 @@
         <w:t xml:space="preserve">Inversión o cuenta a la vista en un banco</w:t>
       </w:r>
       <w:r>
-        <w:t xml:space="preserve">, incluidos bancos digitales como Nu o Revolut. Verifica que la entidad sea un banco autorizado por la CNBV y que el producto esté protegido por el IPAB (hasta 400,000 UDIS por persona y por banco). [POR CONFIRMAR: el estatus bancario de cada entidad a la fecha de publicación]</w:t>
+        <w:t xml:space="preserve">, incluidos bancos digitales. A septiembre de 2026:</w:t>
+      </w:r>
+    </w:p>
+    <w:p>
+      <w:pPr>
+        <w:pStyle w:val="ListParagraph"/>
+        <w:numPr>
+          <w:ilvl w:val="1"/>
+          <w:numId w:val="2"/>
+        </w:numPr>
+      </w:pPr>
+      <w:r>
+        <w:rPr>
+          <w:b/>
+          <w:bCs/>
+        </w:rPr>
+        <w:t xml:space="preserve">Revolut</w:t>
+      </w:r>
+      <w:r>
+        <w:t xml:space="preserve"> recibió de la CNBV, con aprobación de Banxico, la autorización para operar como institución de banca múltiple; inició con una fase beta antes de su lanzamiento amplio.</w:t>
+      </w:r>
+    </w:p>
+    <w:p>
+      <w:pPr>
+        <w:pStyle w:val="ListParagraph"/>
+        <w:numPr>
+          <w:ilvl w:val="1"/>
+          <w:numId w:val="2"/>
+        </w:numPr>
+      </w:pPr>
+      <w:r>
+        <w:rPr>
+          <w:b/>
+          <w:bCs/>
+        </w:rPr>
+        <w:t xml:space="preserve">Nu México</w:t>
+      </w:r>
+      <w:r>
+        <w:t xml:space="preserve"> era SOFIPO; recibió en abril de 2025 la autorización para constituirse como banco, y en julio de 2026 la CNBV le autorizó iniciar operaciones como banco. [POR CONFIRMAR en el padrón de la CNBV antes de publicar: que todos los productos de ahorro ya estén en el banco y no en la SOFIPO]</w:t>
+      </w:r>
+    </w:p>
+    <w:p>
+      <w:pPr>
+        <w:pStyle w:val="ListParagraph"/>
+        <w:numPr>
+          <w:ilvl w:val="1"/>
+          <w:numId w:val="2"/>
+        </w:numPr>
+      </w:pPr>
+      <w:r>
+        <w:t xml:space="preserve">En cualquier banco, el IPAB protege los depósitos hasta 400,000 UDIS por persona y por banco (unos 3.4 millones de pesos).</w:t>
+      </w:r>
+    </w:p>
+    <w:p>
+      <w:pPr>
+        <w:pStyle w:val="ListParagraph"/>
+        <w:numPr>
+          <w:ilvl w:val="1"/>
+          <w:numId w:val="2"/>
+        </w:numPr>
+      </w:pPr>
+      <w:r>
+        <w:t xml:space="preserve">Regla para la persona: antes de depositar, busca la entidad en el padrón de la CNBV y confirma que el nombre legal del contrato diga "Institución de Banca Múltiple".</w:t>
       </w:r>
     </w:p>
     <w:p>
@@ -2083,7 +2145,7 @@
                 <w:sz w:val="18"/>
                 <w:szCs w:val="18"/>
               </w:rPr>
-              <w:t xml:space="preserve">Tasa de 1% a 2.5% sobre lo que cobras, según tu ingreso del mes. Si facturas a una empresa (persona moral), te retiene 1.25%</w:t>
+              <w:t xml:space="preserve">Tasa de 1% a 2.5% sobre lo que cobras (sin IVA), según tu ingreso del mes. Pagos mensuales definitivos. Si facturas a una empresa (persona moral), te retiene 1.25%, que acreditas en tu pago del mes</w:t>
             </w:r>
           </w:p>
         </w:tc>
@@ -2105,7 +2167,7 @@
                 <w:sz w:val="18"/>
                 <w:szCs w:val="18"/>
               </w:rPr>
-              <w:t xml:space="preserve">No permite deducir gastos</w:t>
+              <w:t xml:space="preserve">No permite deducir gastos ni aplicar deducciones personales</w:t>
             </w:r>
           </w:p>
         </w:tc>
@@ -2125,7 +2187,7 @@
                 <w:sz w:val="18"/>
                 <w:szCs w:val="18"/>
               </w:rPr>
-              <w:t xml:space="preserve">Límite de 3.5 millones al año. Cobras IVA en tus servicios</w:t>
+              <w:t xml:space="preserve">Límite de 3.5 millones al año. Cobras IVA en tus servicios. No pueden entrar, entre otros, socios o accionistas de empresas y quienes cobran honorarios asimilados a salarios</w:t>
             </w:r>
           </w:p>
         </w:tc>
@@ -2313,111 +2375,12 @@
     <w:p/>
     <w:p>
       <w:r>
-        <w:t xml:space="preserve">Tabla mensual de RESICO: hasta 25,000, 1%; hasta 50,000, 1.1%; hasta 83,333.33, 1.5%; hasta 208,333.33, 2%; hasta 3.5 millones al año, 2.5%. [POR CONFIRMAR con la LISR vigente] Gancho: Gael no sabe si le conviene RESICO: gasta mucho en vestuario y cursos, y en RESICO nada de eso se deduce.</w:t>
-      </w:r>
-    </w:p>
-    <w:p>
-      <w:r>
-        <w:rPr>
-          <w:b/>
-          <w:bCs/>
-        </w:rPr>
-        <w:t xml:space="preserve">M2 U02 · El IVA: el dinero que cobras pero no es tuyo</w:t>
-      </w:r>
-      <w:r>
-        <w:t xml:space="preserve"> Objetivo: entender que el IVA que cobras en tus facturas se entera al SAT (menos el que te retengan y el IVA acreditable) y apartarlo de inmediato. Gancho: Valeria facturó 50,000 más IVA y gastó los 58,000.</w:t>
-      </w:r>
-    </w:p>
-    <w:p>
-      <w:r>
-        <w:rPr>
-          <w:b/>
-          <w:bCs/>
-        </w:rPr>
-        <w:t xml:space="preserve">M2 U03 · ¿Qué gastos de mi carrera sí puedo deducir, y en qué régimen?</w:t>
-      </w:r>
-      <w:r>
-        <w:t xml:space="preserve"> Objetivo: armar tu carpeta de comprobantes (CFDI) sabiendo que las deducciones del negocio aplican en Actividad Empresarial, no en RESICO. Categorías: formación (actuación, canto, acento, baile), promoción (headshots, demo reel, sitio web, publicidad en redes), herramientas (instrumentos, equipo de audio o cómputo, vestuario de trabajo) y servicios (contador, abogado, representación).</w:t>
-      </w:r>
-    </w:p>
-    <w:p>
-      <w:r>
-        <w:rPr>
-          <w:b/>
-          <w:bCs/>
-        </w:rPr>
-        <w:t xml:space="preserve">M2 U04 · Facturar, declarar y no atrasarte con el SAT</w:t>
-      </w:r>
-      <w:r>
-        <w:t xml:space="preserve"> Objetivo: conocer tu calendario: facturación CFDI 4.0, declaraciones mensuales, declaración anual y buzón tributario. Gancho: Toño dejó de declarar dos años porque "casi no facturaba" y le llegó una carta invitación del SAT.</w:t>
-      </w:r>
-    </w:p>
-    <w:p>
-      <w:r>
-        <w:rPr>
-          <w:b/>
-          <w:bCs/>
-        </w:rPr>
-        <w:t xml:space="preserve">M2 U05 · Deducciones personales y tu declaración anual</w:t>
-      </w:r>
-      <w:r>
-        <w:t xml:space="preserve"> Objetivo: conocer las deducciones personales (gastos médicos, colegiaturas, aportaciones a retiro) y en qué regímenes aplican. [POR CONFIRMAR: si aplican a personas que tributan en RESICO]</w:t>
-      </w:r>
-    </w:p>
-    <w:p>
-      <w:pPr>
-        <w:pStyle w:val="Heading2"/>
-      </w:pPr>
-      <w:r>
-        <w:t xml:space="preserve">Módulo 3. Contratos, representación y regalías</w:t>
-      </w:r>
-    </w:p>
-    <w:p>
-      <w:r>
-        <w:rPr>
-          <w:b/>
-          <w:bCs/>
-        </w:rPr>
-        <w:t xml:space="preserve">M3 U01 · Lo que revisas antes de firmar un llamado o una exclusividad</w:t>
-      </w:r>
-      <w:r>
-        <w:t xml:space="preserve"> Objetivo: identificar vigencia, territorio, medios, exclusividad, derechos de imagen, penalizaciones y fechas de pago. Gancho: Valeria firmó una campaña "para redes" y su foto apareció en espectaculares durante tres años.</w:t>
-      </w:r>
-    </w:p>
-    <w:p>
-      <w:r>
-        <w:rPr>
-          <w:b/>
-          <w:bCs/>
-        </w:rPr>
-        <w:t xml:space="preserve">M3 U02 · Derechos de imagen y voz: qué cedes y por cuánto tiempo</w:t>
-      </w:r>
-      <w:r>
-        <w:t xml:space="preserve"> Objetivo: distinguir entre ceder, licenciar y autorizar el uso de tu imagen y de tu voz, incluidos usos con inteligencia artificial y doblaje.</w:t>
-      </w:r>
-    </w:p>
-    <w:p>
-      <w:r>
-        <w:rPr>
-          <w:b/>
-          <w:bCs/>
-        </w:rPr>
-        <w:t xml:space="preserve">M3 U03 · Mánagers y agencias: comisiones y cuentas claras</w:t>
-      </w:r>
-      <w:r>
-        <w:t xml:space="preserve"> Objetivo: pactar por escrito la comisión (normalmente entre 10% y 20%), sobre qué monto se cobra, qué gastos se descuentan y cómo te rinden cuentas. Gancho: el mánager de Valeria cobra su comisión sobre el pago con IVA incluido y además descuenta "gastos de representación" sin comprobante.</w:t>
-      </w:r>
-    </w:p>
-    <w:p>
-      <w:r>
-        <w:rPr>
-          <w:b/>
-          <w:bCs/>
-        </w:rPr>
-        <w:t xml:space="preserve">M3 U04 · Regalías: ¿quién cobra qué en México?</w:t>
-      </w:r>
-      <w:r>
-        <w:t xml:space="preserve"> Objetivo: identificar a qué sociedad de gestión colectiva te corresponde afiliarte:</w:t>
+        <w:t xml:space="preserve">Tabla mensual de RESICO (artículo 113-E de la LISR, sin cambios para 2026): hasta 25,000, 1%; hasta 50,000, 1.1%; hasta 83,333.33, 1.5%; hasta 208,333.33, 2%; hasta 3.5 millones al año, 2.5%.</w:t>
+      </w:r>
+    </w:p>
+    <w:p>
+      <w:r>
+        <w:t xml:space="preserve">Tres puntos que la lección aclara:</w:t>
       </w:r>
     </w:p>
     <w:p>
@@ -2433,10 +2396,10 @@
           <w:b/>
           <w:bCs/>
         </w:rPr>
-        <w:t xml:space="preserve">ANDI:</w:t>
-      </w:r>
-      <w:r>
-        <w:t xml:space="preserve"> intérpretes del medio audiovisual (actuación en TV, cine y plataformas).</w:t>
+        <w:t xml:space="preserve">Asimilados y RESICO.</w:t>
+      </w:r>
+      <w:r>
+        <w:t xml:space="preserve"> Si una productora te paga honorarios como asimilados a salarios (porque así lo pediste por escrito o porque le prestas servicios de forma preponderante), la ley te excluye de RESICO. Esa combinación, común en el medio, se revisa con el contador.</w:t>
       </w:r>
     </w:p>
     <w:p>
@@ -2452,10 +2415,10 @@
           <w:b/>
           <w:bCs/>
         </w:rPr>
-        <w:t xml:space="preserve">SACM:</w:t>
-      </w:r>
-      <w:r>
-        <w:t xml:space="preserve"> autores y compositores de música.</w:t>
+        <w:t xml:space="preserve">Sin deducciones.</w:t>
+      </w:r>
+      <w:r>
+        <w:t xml:space="preserve"> RESICO no permite restar gastos del negocio ni deducciones personales (gastos médicos, colegiaturas, PPR).</w:t>
       </w:r>
     </w:p>
     <w:p>
@@ -2471,72 +2434,63 @@
           <w:b/>
           <w:bCs/>
         </w:rPr>
-        <w:t xml:space="preserve">EJE (Sociedad Mexicana de Ejecutantes de Música):</w:t>
-      </w:r>
-      <w:r>
-        <w:t xml:space="preserve"> músicos intérpretes y ejecutantes.</w:t>
-      </w:r>
-    </w:p>
-    <w:p>
-      <w:pPr>
-        <w:pStyle w:val="ListParagraph"/>
-        <w:numPr>
-          <w:ilvl w:val="0"/>
-          <w:numId w:val="2"/>
-        </w:numPr>
-      </w:pPr>
-      <w:r>
-        <w:rPr>
-          <w:b/>
-          <w:bCs/>
-        </w:rPr>
-        <w:t xml:space="preserve">SOMEXFON:</w:t>
-      </w:r>
-      <w:r>
-        <w:t xml:space="preserve"> productores de fonogramas.</w:t>
-      </w:r>
-    </w:p>
-    <w:p>
-      <w:pPr>
-        <w:pStyle w:val="ListParagraph"/>
-        <w:numPr>
-          <w:ilvl w:val="0"/>
-          <w:numId w:val="2"/>
-        </w:numPr>
-      </w:pPr>
-      <w:r>
-        <w:rPr>
-          <w:b/>
-          <w:bCs/>
-        </w:rPr>
-        <w:t xml:space="preserve">ANDA:</w:t>
-      </w:r>
-      <w:r>
-        <w:t xml:space="preserve"> es el sindicato de actores, no una sociedad de gestión de regalías.</w:t>
-      </w:r>
-    </w:p>
-    <w:p>
-      <w:r>
-        <w:rPr>
-          <w:b/>
-          <w:bCs/>
-        </w:rPr>
-        <w:t xml:space="preserve">M3 U05 · Cómo cobro mis regalías y reviso mis pagos</w:t>
-      </w:r>
-      <w:r>
-        <w:t xml:space="preserve"> Objetivo: afiliarte, registrar tus obras o interpretaciones, revisar tus liquidaciones y saber cómo se declaran esos ingresos. [POR CONFIRMAR: tratamiento fiscal de regalías e IVA por derechos de autor]</w:t>
-      </w:r>
-    </w:p>
-    <w:p>
-      <w:r>
-        <w:rPr>
-          <w:b/>
-          <w:bCs/>
-        </w:rPr>
-        <w:t xml:space="preserve">M3 U06 · Cuando la productora no paga</w:t>
-      </w:r>
-      <w:r>
-        <w:t xml:space="preserve"> Objetivo: documentar, reclamar por escrito, conocer penalizaciones pactadas y cuándo acudir a un abogado o a PROFEDET (si hay relación laboral).</w:t>
+        <w:t xml:space="preserve">Declaración anual.</w:t>
+      </w:r>
+      <w:r>
+        <w:t xml:space="preserve"> La ley (artículo 113-G) la pide, pero la Resolución Miscelánea Fiscal ha liberado de presentarla en ciertos casos a partir del ejercicio 2024. [POR CONFIRMAR cada año con la RMF vigente]</w:t>
+      </w:r>
+    </w:p>
+    <w:p>
+      <w:r>
+        <w:t xml:space="preserve">Gancho: Gael no sabe si le conviene RESICO: gasta mucho en vestuario y cursos, que en RESICO no se deducen, y una productora le paga como asimilado.</w:t>
+      </w:r>
+    </w:p>
+    <w:p>
+      <w:r>
+        <w:rPr>
+          <w:b/>
+          <w:bCs/>
+        </w:rPr>
+        <w:t xml:space="preserve">M2 U02 · El IVA: el dinero que cobras pero no es tuyo</w:t>
+      </w:r>
+      <w:r>
+        <w:t xml:space="preserve"> Objetivo: entender que el IVA que cobras en tus facturas se entera al SAT (menos el que te retengan y el IVA acreditable) y apartarlo de inmediato. Gancho: Valeria facturó 50,000 más IVA y gastó los 58,000.</w:t>
+      </w:r>
+    </w:p>
+    <w:p>
+      <w:r>
+        <w:rPr>
+          <w:b/>
+          <w:bCs/>
+        </w:rPr>
+        <w:t xml:space="preserve">M2 U03 · ¿Qué gastos de mi carrera sí puedo deducir, y en qué régimen?</w:t>
+      </w:r>
+      <w:r>
+        <w:t xml:space="preserve"> Objetivo: armar tu carpeta de comprobantes (CFDI) sabiendo que las deducciones del negocio aplican en Actividad Empresarial, no en RESICO. Categorías: formación (actuación, canto, acento, baile), promoción (headshots, demo reel, sitio web, publicidad en redes), herramientas (instrumentos, equipo de audio o cómputo, vestuario de trabajo) y servicios (contador, abogado, representación).</w:t>
+      </w:r>
+    </w:p>
+    <w:p>
+      <w:r>
+        <w:rPr>
+          <w:b/>
+          <w:bCs/>
+        </w:rPr>
+        <w:t xml:space="preserve">M2 U04 · Facturar, declarar y no atrasarte con el SAT</w:t>
+      </w:r>
+      <w:r>
+        <w:t xml:space="preserve"> Objetivo: conocer tu calendario: facturación CFDI 4.0, declaraciones mensuales, declaración anual y buzón tributario. Gancho: Toño dejó de declarar dos años porque "casi no facturaba" y le llegó una carta invitación del SAT.</w:t>
+      </w:r>
+    </w:p>
+    <w:p>
+      <w:r>
+        <w:rPr>
+          <w:b/>
+          <w:bCs/>
+        </w:rPr>
+        <w:t xml:space="preserve">M2 U05 · Deducciones personales y tu declaración anual</w:t>
+      </w:r>
+      <w:r>
+        <w:t xml:space="preserve"> Objetivo: conocer las deducciones personales (gastos médicos, colegiaturas, aportaciones a retiro, PPR) y saber que aplican en la declaración anual de sueldos, asimilados y actividad empresarial, pero no a los ingresos de RESICO.</w:t>
       </w:r>
     </w:p>
     <w:p>
@@ -2544,688 +2498,55 @@
         <w:pStyle w:val="Heading2"/>
       </w:pPr>
       <w:r>
-        <w:t xml:space="preserve">Módulo 4. Conoce el sistema financiero mexicano</w:t>
-      </w:r>
-    </w:p>
-    <w:p>
-      <w:r>
-        <w:rPr>
-          <w:b/>
-          <w:bCs/>
-        </w:rPr>
-        <w:t xml:space="preserve">M4 U01 · ¿Quién es quién en el sistema financiero?</w:t>
-      </w:r>
-      <w:r>
-        <w:t xml:space="preserve"> Objetivo: distinguir a las autoridades (Banxico, SHCP, CNBV, CONDUSEF, IPAB, CNSF) de las instituciones que te ofrecen productos.</w:t>
-      </w:r>
-    </w:p>
-    <w:p>
-      <w:r>
-        <w:rPr>
-          <w:b/>
-          <w:bCs/>
-        </w:rPr>
-        <w:t xml:space="preserve">M4 U02 · Bancos, bancos digitales y otras entidades: ¿cuál es cuál?</w:t>
-      </w:r>
-      <w:r>
-        <w:t xml:space="preserve"> Objetivo: diferenciar un banco (con protección del IPAB) de otras entidades que también prestan o captan dinero: SOFOM, SOFIPO, SOCAP, instituciones de tecnología financiera, tiendas departamentales y casas de empeño. Se explican para que sepas qué contratas, sin recomendarlas. Gancho: Renata tiene cinco "tarjetas de banco"; al revisar, solo dos son de bancos.</w:t>
-      </w:r>
-    </w:p>
-    <w:p>
-      <w:r>
-        <w:rPr>
-          <w:b/>
-          <w:bCs/>
-        </w:rPr>
-        <w:t xml:space="preserve">M4 U03 · ¿Cómo verifico una institución antes de contratar?</w:t>
-      </w:r>
-      <w:r>
-        <w:t xml:space="preserve"> Objetivo: usar el SIPRES (registro de prestadores de servicios financieros), el Buró de Entidades Financieras de CONDUSEF y el padrón de entidades supervisadas de la CNBV.</w:t>
-      </w:r>
-    </w:p>
-    <w:p>
-      <w:r>
-        <w:rPr>
-          <w:b/>
-          <w:bCs/>
-        </w:rPr>
-        <w:t xml:space="preserve">M4 U04 · Tus derechos como usuario</w:t>
-      </w:r>
-      <w:r>
-        <w:t xml:space="preserve"> Objetivo: conocer tus derechos (información clara, contrato registrado, cancelación, reclamación) y cómo reclamar: primero a la Unidad Especializada (UNE) de la institución, luego a CONDUSEF.</w:t>
-      </w:r>
-    </w:p>
-    <w:p>
-      <w:pPr>
-        <w:pStyle w:val="Heading2"/>
-      </w:pPr>
-      <w:r>
-        <w:t xml:space="preserve">Módulo 5. Compara y elige: instituciones y productos</w:t>
-      </w:r>
-    </w:p>
-    <w:p>
-      <w:r>
-        <w:rPr>
-          <w:b/>
-          <w:bCs/>
-        </w:rPr>
-        <w:t xml:space="preserve">M5 U01 · Primero elige la institución</w:t>
-      </w:r>
-      <w:r>
-        <w:t xml:space="preserve"> Objetivo: comparar instituciones por supervisión, protección, calificación en el Buró de Entidades Financieras, reclamaciones, atención y canales.</w:t>
-      </w:r>
-    </w:p>
-    <w:p>
-      <w:r>
-        <w:rPr>
-          <w:b/>
-          <w:bCs/>
-        </w:rPr>
-        <w:t xml:space="preserve">M5 U02 · Elige tu cuenta</w:t>
-      </w:r>
-      <w:r>
-        <w:t xml:space="preserve"> Objetivo: comparar cuentas por comisiones, saldo mínimo, retiros, transferencias y cobros en efectivo. Portabilidad de nómina si cobras por Asimilados.</w:t>
-      </w:r>
-    </w:p>
-    <w:p>
-      <w:r>
-        <w:rPr>
-          <w:b/>
-          <w:bCs/>
-        </w:rPr>
-        <w:t xml:space="preserve">M5 U03 · Elige dónde ahorrar e invertir</w:t>
-      </w:r>
-      <w:r>
-        <w:t xml:space="preserve"> Objetivo: leer la GAT nominal y la GAT real, el plazo, la liquidez y la protección. Cetes, pagarés y cuentas a la vista de bancos.</w:t>
-      </w:r>
-    </w:p>
-    <w:p>
-      <w:r>
-        <w:rPr>
-          <w:b/>
-          <w:bCs/>
-        </w:rPr>
-        <w:t xml:space="preserve">M5 U04 · Elige un seguro</w:t>
-      </w:r>
-      <w:r>
-        <w:t xml:space="preserve"> Objetivo: comparar suma asegurada, deducible, coaseguro, exclusiones y prima con los simuladores de CONDUSEF.</w:t>
-      </w:r>
-    </w:p>
-    <w:p>
-      <w:r>
-        <w:rPr>
-          <w:b/>
-          <w:bCs/>
-        </w:rPr>
-        <w:t xml:space="preserve">M5 U05 · Elige un crédito: los números</w:t>
-      </w:r>
-      <w:r>
-        <w:t xml:space="preserve"> Objetivo: comparar por CAT, tasa, comisiones, pago total y plazo. Distinguir crédito revolvente (tarjeta) de crédito simple (pagos fijos). Gancho: a Toño le ofrecen dos créditos para su estudio con el mismo pago mensual: uno cuesta 18,000 más que el otro.</w:t>
-      </w:r>
-    </w:p>
-    <w:p>
-      <w:r>
-        <w:rPr>
-          <w:b/>
-          <w:bCs/>
-        </w:rPr>
-        <w:t xml:space="preserve">M5 U06 · Elige un crédito: el tipo correcto para cada uso</w:t>
-      </w:r>
-      <w:r>
-        <w:t xml:space="preserve"> Objetivo: relacionar el uso con el producto: equipo de trabajo, emergencia, auto, vivienda. Cuándo no conviene pedir crédito.</w:t>
-      </w:r>
-    </w:p>
-    <w:p>
-      <w:r>
-        <w:rPr>
-          <w:b/>
-          <w:bCs/>
-        </w:rPr>
-        <w:t xml:space="preserve">M5 U07 · Lee el contrato antes de firmar</w:t>
-      </w:r>
-      <w:r>
-        <w:t xml:space="preserve"> Objetivo: revisar la carátula, el CAT, las comisiones, los seguros incluidos y el registro del contrato en el RECA de CONDUSEF.</w:t>
-      </w:r>
-    </w:p>
-    <w:p>
-      <w:pPr>
-        <w:pStyle w:val="Heading2"/>
-      </w:pPr>
-      <w:r>
-        <w:t xml:space="preserve">Módulo 6. El crédito es deuda</w:t>
-      </w:r>
-    </w:p>
-    <w:p>
-      <w:r>
-        <w:rPr>
-          <w:b/>
-          <w:bCs/>
-        </w:rPr>
-        <w:t xml:space="preserve">M6 U01 · Tu línea de crédito no es tu ingreso</w:t>
-      </w:r>
-      <w:r>
-        <w:t xml:space="preserve"> Objetivo: entender que la línea es dinero prestado que se paga con tus ingresos futuros, y que un aumento de línea no es un aumento de sueldo. Gancho: Renata dice "tengo 180,000 disponibles" al sumar las líneas de sus seis tarjetas.</w:t>
-      </w:r>
-    </w:p>
-    <w:p>
-      <w:r>
-        <w:rPr>
-          <w:b/>
-          <w:bCs/>
-        </w:rPr>
-        <w:t xml:space="preserve">M6 U02 · Pago mínimo, pago para no generar intereses y fechas clave</w:t>
-      </w:r>
-      <w:r>
-        <w:t xml:space="preserve"> Objetivo: leer tu estado de cuenta: fecha de corte, fecha límite, pago mínimo y pago para no generar intereses. Cuánto tardas y cuánto pagas si solo cubres el mínimo.</w:t>
-      </w:r>
-    </w:p>
-    <w:p>
-      <w:r>
-        <w:rPr>
-          <w:b/>
-          <w:bCs/>
-        </w:rPr>
-        <w:t xml:space="preserve">M6 U03 · Meses sin intereses: cuándo ayudan y cuándo te atrapan</w:t>
-      </w:r>
-      <w:r>
-        <w:t xml:space="preserve"> Objetivo: usar MSI solo en compras que planeabas (equipo de trabajo, por ejemplo) y sumar todas tus mensualidades antes de agregar otra.</w:t>
-      </w:r>
-    </w:p>
-    <w:p>
-      <w:r>
-        <w:rPr>
-          <w:b/>
-          <w:bCs/>
-        </w:rPr>
-        <w:t xml:space="preserve">M6 U04 · Tu inventario de deudas</w:t>
-      </w:r>
-      <w:r>
-        <w:t xml:space="preserve"> Objetivo: listar cada deuda con institución, tipo, saldo, tasa o CAT, pago mínimo, fecha y si hay atraso.</w:t>
-      </w:r>
-    </w:p>
-    <w:p>
-      <w:r>
-        <w:rPr>
-          <w:b/>
-          <w:bCs/>
-        </w:rPr>
-        <w:t xml:space="preserve">M6 U05 · ¿Cuánta deuda aguanta un ingreso variable?</w:t>
-      </w:r>
-      <w:r>
-        <w:t xml:space="preserve"> Objetivo: medir tus pagos de deuda contra tu mes bajo, no contra tu mejor mes, y fijar tu límite personal.</w:t>
-      </w:r>
-    </w:p>
-    <w:p>
-      <w:r>
-        <w:rPr>
-          <w:b/>
-          <w:bCs/>
-        </w:rPr>
-        <w:t xml:space="preserve">M6 U06 · No uses la tarjeta para vivir la sequía</w:t>
-      </w:r>
-      <w:r>
-        <w:t xml:space="preserve"> Objetivo: diferenciar una emergencia de un faltante recurrente y usar primero el fondo de sequía. Gancho: Gael pagó la renta de cuatro meses sin llamados con la tarjeta y ahora debe 60,000.</w:t>
-      </w:r>
-    </w:p>
-    <w:p>
-      <w:pPr>
-        <w:pStyle w:val="Heading2"/>
-      </w:pPr>
-      <w:r>
-        <w:t xml:space="preserve">Módulo 7. Buró y Círculo de Crédito</w:t>
-      </w:r>
-    </w:p>
-    <w:p>
-      <w:r>
-        <w:rPr>
-          <w:b/>
-          <w:bCs/>
-        </w:rPr>
-        <w:t xml:space="preserve">M7 U01 · ¿Qué son el Buró y el Círculo de Crédito?</w:t>
-      </w:r>
-      <w:r>
-        <w:t xml:space="preserve"> Objetivo: entender que son sociedades de información crediticia que guardan tu historial. No son una "lista negra" ni deciden si te prestan.</w:t>
-      </w:r>
-    </w:p>
-    <w:p>
-      <w:r>
-        <w:rPr>
-          <w:b/>
-          <w:bCs/>
-        </w:rPr>
-        <w:t xml:space="preserve">M7 U02 · Pide tu reporte gratis y léelo</w:t>
-      </w:r>
-      <w:r>
-        <w:t xml:space="preserve"> Objetivo: obtener tu reporte de crédito especial gratis una vez cada 12 meses en cada sociedad, y leer cuentas, saldos, atrasos, claves de observación y consultas.</w:t>
-      </w:r>
-    </w:p>
-    <w:p>
-      <w:r>
-        <w:rPr>
-          <w:b/>
-          <w:bCs/>
-        </w:rPr>
-        <w:t xml:space="preserve">M7 U03 · Tu score: qué lo sube y qué lo baja</w:t>
-      </w:r>
-      <w:r>
-        <w:t xml:space="preserve"> Objetivo: conocer los factores (pagos a tiempo, uso de tu línea, antigüedad, consultas, tipos de crédito) y saber que el score cuesta y es distinto al reporte.</w:t>
-      </w:r>
-    </w:p>
-    <w:p>
-      <w:r>
-        <w:rPr>
-          <w:b/>
-          <w:bCs/>
-        </w:rPr>
-        <w:t xml:space="preserve">M7 U04 · ¿Cuánto tiempo se queda un atraso?</w:t>
-      </w:r>
-      <w:r>
-        <w:t xml:space="preserve"> Objetivo: conocer los plazos de permanencia según el monto de la deuda, medido en UDIS (1, 2, 4 o 6 años). [POR CONFIRMAR con la Ley para Regular las Sociedades de Información Crediticia vigente] Gancho: Toño cree que su atraso de hace siete años "lo tiene marcado de por vida".</w:t>
-      </w:r>
-    </w:p>
-    <w:p>
-      <w:r>
-        <w:rPr>
-          <w:b/>
-          <w:bCs/>
-        </w:rPr>
-        <w:t xml:space="preserve">M7 U05 · Si hay un error: reclama gratis</w:t>
-      </w:r>
-      <w:r>
-        <w:t xml:space="preserve"> Objetivo: presentar una reclamación en línea ante el Buró o el Círculo de Crédito y, si no se resuelve, ante CONDUSEF.</w:t>
-      </w:r>
-    </w:p>
-    <w:p>
-      <w:r>
-        <w:rPr>
-          <w:b/>
-          <w:bCs/>
-        </w:rPr>
-        <w:t xml:space="preserve">M7 U06 · Despachos que "limpian tu Buró": fraude</w:t>
-      </w:r>
-      <w:r>
-        <w:t xml:space="preserve"> Objetivo: reconocer que nadie puede borrar información correcta y que esos cobros son fraude.</w:t>
-      </w:r>
-    </w:p>
-    <w:p>
-      <w:r>
-        <w:rPr>
-          <w:b/>
-          <w:bCs/>
-        </w:rPr>
-        <w:t xml:space="preserve">M7 U07 · Cómo mejorar tu historial paso a paso</w:t>
-      </w:r>
-      <w:r>
-        <w:t xml:space="preserve"> Objetivo: seguir un plan de 6 a 12 meses: pagar a tiempo, bajar el uso de tus tarjetas, no pedir créditos seguidos y regularizar los atrasos.</w:t>
-      </w:r>
-    </w:p>
-    <w:p>
-      <w:pPr>
-        <w:pStyle w:val="Heading2"/>
-      </w:pPr>
-      <w:r>
-        <w:t xml:space="preserve">Módulo 8. Sal de deudas</w:t>
-      </w:r>
-    </w:p>
-    <w:p>
-      <w:r>
-        <w:rPr>
-          <w:b/>
-          <w:bCs/>
-        </w:rPr>
-        <w:t xml:space="preserve">M8 U01 · Elige tu método: avalancha o bola de nieve</w:t>
-      </w:r>
-      <w:r>
-        <w:t xml:space="preserve"> Objetivo: ordenar tus deudas por costo (avalancha) o por saldo (bola de nieve) y sostener el plan con tu mes bajo.</w:t>
-      </w:r>
-    </w:p>
-    <w:p>
-      <w:r>
-        <w:rPr>
-          <w:b/>
-          <w:bCs/>
-        </w:rPr>
-        <w:t xml:space="preserve">M8 U02 · Negociar con el banco: reestructura, convenio o quita</w:t>
-      </w:r>
-      <w:r>
-        <w:t xml:space="preserve"> Objetivo: entender cada opción, qué pedir por escrito y cómo aparece en tu historial (una quita puede dejar una clave de observación). Gancho: a Toño le ofrecen pagar 40% de su deuda "para liquidar"; no sabe qué pasará con su Buró.</w:t>
-      </w:r>
-    </w:p>
-    <w:p>
-      <w:r>
-        <w:rPr>
-          <w:b/>
-          <w:bCs/>
-        </w:rPr>
-        <w:t xml:space="preserve">M8 U03 · ¿Consolidar deudas me conviene?</w:t>
-      </w:r>
-      <w:r>
-        <w:t xml:space="preserve"> Objetivo: comparar el costo total de consolidar contra seguir pagando, y evitar volver a usar las tarjetas liberadas.</w:t>
-      </w:r>
-    </w:p>
-    <w:p>
-      <w:r>
-        <w:rPr>
-          <w:b/>
-          <w:bCs/>
-        </w:rPr>
-        <w:t xml:space="preserve">M8 U04 · Cobranza: tus derechos</w:t>
-      </w:r>
-      <w:r>
-        <w:t xml:space="preserve"> Objetivo: conocer lo que un despacho puede y no puede hacer, verificarlo en el REDECO de CONDUSEF y presentar una queja si hay abuso.</w:t>
-      </w:r>
-    </w:p>
-    <w:p>
-      <w:r>
-        <w:rPr>
-          <w:b/>
-          <w:bCs/>
-        </w:rPr>
-        <w:t xml:space="preserve">M8 U05 · Tu plan de salida con ingreso variable</w:t>
-      </w:r>
-      <w:r>
-        <w:t xml:space="preserve"> Objetivo: definir un pago base con tu mes bajo, abonar extra en meses buenos y fijar fechas de revisión.</w:t>
-      </w:r>
-    </w:p>
-    <w:p>
-      <w:pPr>
-        <w:pStyle w:val="Heading2"/>
-      </w:pPr>
-      <w:r>
-        <w:t xml:space="preserve">Módulo 9. No caigas: fraudes y robo de identidad</w:t>
-      </w:r>
-    </w:p>
-    <w:p>
-      <w:r>
-        <w:rPr>
-          <w:b/>
-          <w:bCs/>
-        </w:rPr>
-        <w:t xml:space="preserve">M9 U01 · Cómo piensa quien te quiere estafar</w:t>
-      </w:r>
-      <w:r>
-        <w:t xml:space="preserve"> Objetivo: reconocer los cuatro ganchos de casi todo fraude (urgencia, autoridad, premio y miedo) y la regla de oro: cuelga y verifica por tu cuenta. Gancho: a Valeria le llama "el área de seguridad de su banco" y le pide un código "para cancelar un cargo".</w:t>
-      </w:r>
-    </w:p>
-    <w:p>
-      <w:r>
-        <w:rPr>
-          <w:b/>
-          <w:bCs/>
-        </w:rPr>
-        <w:t xml:space="preserve">M9 U02 · Falsos castings, productoras y agencias que cobran</w:t>
-      </w:r>
-      <w:r>
-        <w:t xml:space="preserve"> Objetivo: reconocer convocatorias que cobran por audicionar, por "book" obligatorio o por inscripción, suplantan a productoras reales o piden datos de más. Verificar la empresa, el contacto y el lugar antes de ir o pagar. Gancho: Gael recibe por Instagram un "casting para una serie de plataforma" que pide 3,500 para el material fotográfico.</w:t>
-      </w:r>
-    </w:p>
-    <w:p>
-      <w:r>
-        <w:rPr>
-          <w:b/>
-          <w:bCs/>
-        </w:rPr>
-        <w:t xml:space="preserve">M9 U03 · Llamadas, mensajes y páginas falsas (phishing)</w:t>
-      </w:r>
-      <w:r>
-        <w:t xml:space="preserve"> Objetivo: identificar SMS, WhatsApp, correos y páginas que imitan a tu banco, al SAT, a paqueterías o a plataformas. Nunca compartir NIP, contraseñas, códigos de verificación ni el CVV.</w:t>
-      </w:r>
-    </w:p>
-    <w:p>
-      <w:r>
-        <w:rPr>
-          <w:b/>
-          <w:bCs/>
-        </w:rPr>
-        <w:t xml:space="preserve">M9 U04 · Robo de identidad: cuando usan tu nombre</w:t>
-      </w:r>
-      <w:r>
-        <w:t xml:space="preserve"> Objetivo: reconocer las señales (créditos que no pediste, cobranza de deudas ajenas, consultas desconocidas en tu reporte), cuidar tu INE, CURP, RFC y firma, y saber qué hacer: reclamar a la institución, reclamar ante el Buró o el Círculo de Crédito, acudir a CONDUSEF y presentar denuncia. [POR CONFIRMAR: alertas o bloqueos que ofrecen las sociedades de información crediticia] Gancho: a Toño le llega una cobranza por un préstamo que nunca pidió, abierto con una copia de su INE que dejó en un casting.</w:t>
-      </w:r>
-    </w:p>
-    <w:p>
-      <w:r>
-        <w:rPr>
-          <w:b/>
-          <w:bCs/>
-        </w:rPr>
-        <w:t xml:space="preserve">M9 U05 · Tus redes y tu teléfono: robo de cuentas y cambio de SIM</w:t>
-      </w:r>
-      <w:r>
-        <w:t xml:space="preserve"> Objetivo: proteger tus cuentas de redes (tu vitrina de trabajo) con verificación en dos pasos, correo seguro y códigos de respaldo, y proteger tu línea con un NIP de portabilidad. Qué hacer si te roban la cuenta. Gancho: a Valeria le roban su Instagram con 80,000 seguidores y piden "rescate" a sus contactos.</w:t>
-      </w:r>
-    </w:p>
-    <w:p>
-      <w:r>
-        <w:rPr>
-          <w:b/>
-          <w:bCs/>
-        </w:rPr>
-        <w:t xml:space="preserve">M9 U06 · Apps de préstamo "montadeudas" y préstamos con depósito previo</w:t>
-      </w:r>
-      <w:r>
-        <w:t xml:space="preserve"> Objetivo: reconocer apps no registradas, que piden acceso a tus contactos o fotos, o que cobran antes de prestar. Qué hacer si ya caíste: no pagar extorsiones, guardar evidencia, reportar y denunciar. Gancho: Renata pidió 3,000 en una app y ahora le exigen 7,000 y amenazan a sus contactos.</w:t>
-      </w:r>
-    </w:p>
-    <w:p>
-      <w:r>
-        <w:rPr>
-          <w:b/>
-          <w:bCs/>
-        </w:rPr>
-        <w:t xml:space="preserve">M9 U07 · Inversiones milagro y "yo te manejo tu dinero"</w:t>
-      </w:r>
-      <w:r>
-        <w:t xml:space="preserve"> Objetivo: reconocer pirámides, esquemas de referidos, criptomonedas con rendimiento "garantizado", y a personas cercanas al medio que ofrecen manejar tu dinero sin estar autorizadas. Verificar en la CNBV antes de invertir. Gancho: un productor conocido le ofrece a Gael 10% mensual por "invertir en su siguiente película".</w:t>
-      </w:r>
-    </w:p>
-    <w:p>
-      <w:r>
-        <w:rPr>
-          <w:b/>
-          <w:bCs/>
-        </w:rPr>
-        <w:t xml:space="preserve">M9 U08 · Si ya te pasó: tu plan de respuesta</w:t>
-      </w:r>
-      <w:r>
-        <w:t xml:space="preserve"> Objetivo: seguir los pasos en orden: bloquear tarjetas y accesos, llamar a tu institución por el número oficial, reclamar por escrito, reportar a CONDUSEF, denunciar ante el Ministerio Público o la policía cibernética de tu estado, y avisar a tu comunidad sin exponer tus datos. Guardar evidencia.</w:t>
-      </w:r>
-    </w:p>
-    <w:p>
-      <w:pPr>
-        <w:pStyle w:val="Heading2"/>
-      </w:pPr>
-      <w:r>
-        <w:t xml:space="preserve">Módulo 10. Protección y prevención</w:t>
-      </w:r>
-    </w:p>
-    <w:p>
-      <w:r>
-        <w:rPr>
-          <w:b/>
-          <w:bCs/>
-        </w:rPr>
-        <w:t xml:space="preserve">M10 U01 · Sin seguro de empresa: el Seguro de Gastos Médicos Mayores</w:t>
-      </w:r>
-      <w:r>
-        <w:t xml:space="preserve"> Objetivo: comparar suma asegurada, deducible, coaseguro, tabulador y exclusiones.</w:t>
-      </w:r>
-    </w:p>
-    <w:p>
-      <w:r>
-        <w:rPr>
-          <w:b/>
-          <w:bCs/>
-        </w:rPr>
-        <w:t xml:space="preserve">M10 U02 · IMSS para personas trabajadoras independientes</w:t>
-      </w:r>
-      <w:r>
-        <w:t xml:space="preserve"> Objetivo: conocer la incorporación voluntaria al IMSS para trabajadores independientes (atención médica, incapacidades, AFORE) y cuánto cuesta. Conocer también los servicios de salud de ANDA para sus agremiados. [POR CONFIRMAR: modalidad, cuotas y coberturas vigentes]</w:t>
-      </w:r>
-    </w:p>
-    <w:p>
-      <w:r>
-        <w:rPr>
-          <w:b/>
-          <w:bCs/>
-        </w:rPr>
-        <w:t xml:space="preserve">M10 U03 · Si no puedes trabajar: incapacidad, invalidez y accidentes</w:t>
-      </w:r>
-      <w:r>
-        <w:t xml:space="preserve"> Objetivo: proteger tu ingreso si una lesión o enfermedad te impide grabar, cantar o bailar. Qué cubren los seguros de accidentes e incapacidad y qué preguntar sobre coberturas especiales de voz o cuerpo.</w:t>
-      </w:r>
-    </w:p>
-    <w:p>
-      <w:r>
-        <w:rPr>
-          <w:b/>
-          <w:bCs/>
-        </w:rPr>
-        <w:t xml:space="preserve">M10 U04 · Seguro de vida y beneficiarios</w:t>
-      </w:r>
-      <w:r>
-        <w:t xml:space="preserve"> Objetivo: decidir si lo necesitas, cuánto y a quién nombrar. Actualizar beneficiarios en tu cuenta, tu AFORE y tus seguros.</w:t>
-      </w:r>
-    </w:p>
-    <w:p>
-      <w:r>
-        <w:rPr>
-          <w:b/>
-          <w:bCs/>
-        </w:rPr>
-        <w:t xml:space="preserve">M10 U05 · Protege tu nombre y tu marca</w:t>
-      </w:r>
-      <w:r>
-        <w:t xml:space="preserve"> Objetivo: tramitar la reserva de derechos al uso exclusivo de tu nombre artístico ante INDAUTOR y el registro de marca ante el IMPI (buscador MarcaNET).</w:t>
-      </w:r>
-    </w:p>
-    <w:p>
-      <w:r>
-        <w:rPr>
-          <w:b/>
-          <w:bCs/>
-        </w:rPr>
-        <w:t xml:space="preserve">M10 U06 · Testamento y documentos para tu familia</w:t>
-      </w:r>
-      <w:r>
-        <w:t xml:space="preserve"> Objetivo: hacer tu testamento (en septiembre, el Mes del Testamento suele bajar costos), ordenar tus documentos y dejar instrucciones sobre tus regalías y derechos.</w:t>
-      </w:r>
-    </w:p>
-    <w:p>
-      <w:pPr>
-        <w:pStyle w:val="Heading2"/>
-      </w:pPr>
-      <w:r>
-        <w:t xml:space="preserve">Módulo 11. Tu futuro</w:t>
-      </w:r>
-    </w:p>
-    <w:p>
-      <w:r>
-        <w:rPr>
-          <w:b/>
-          <w:bCs/>
-        </w:rPr>
-        <w:t xml:space="preserve">M11 U01 · Llegó un pago gordo: repártelo antes de gastarlo</w:t>
-      </w:r>
-      <w:r>
-        <w:t xml:space="preserve"> Objetivo: aplicar un reparto inmediato: primero impuestos (según tu régimen), luego deudas caras, fondo de sequía, retiro y una parte para disfrutar. Gancho: Valeria cobra 400,000 por una campaña; hace un año gastó una cantidad parecida en tres meses.</w:t>
-      </w:r>
-    </w:p>
-    <w:p>
-      <w:r>
-        <w:rPr>
-          <w:b/>
-          <w:bCs/>
-        </w:rPr>
-        <w:t xml:space="preserve">M11 U02 · Tu AFORE: encuéntrala y súmale</w:t>
-      </w:r>
-      <w:r>
-        <w:t xml:space="preserve"> Objetivo: localizar tu AFORE con tu CURP (e-SAR o AforeMóvil), actualizar beneficiarios y hacer aportaciones voluntarias.</w:t>
-      </w:r>
-    </w:p>
-    <w:p>
-      <w:r>
-        <w:rPr>
-          <w:b/>
-          <w:bCs/>
-        </w:rPr>
-        <w:t xml:space="preserve">M11 U03 · Plan Personal de Retiro (PPR) y aportaciones deducibles</w:t>
-      </w:r>
-      <w:r>
-        <w:t xml:space="preserve"> Objetivo: conocer el PPR y las aportaciones voluntarias deducibles (artículo 151 de la LISR, con límite). Comparar comisiones y rendimiento, y confirmar con tu contador si puedes deducir según tu régimen. [POR CONFIRMAR: deducción para personas en RESICO]</w:t>
-      </w:r>
-    </w:p>
-    <w:p>
-      <w:r>
-        <w:rPr>
-          <w:b/>
-          <w:bCs/>
-        </w:rPr>
-        <w:t xml:space="preserve">M11 U04 · Invertir a largo plazo sin especular</w:t>
-      </w:r>
-      <w:r>
-        <w:t xml:space="preserve"> Objetivo: entender riesgo, plazo, diversificación y comisiones, y verificar que el intermediario esté autorizado. Qué es un fondo de inversión o un ETF y por qué no se usa para el fondo de sequía.</w:t>
-      </w:r>
-    </w:p>
-    <w:p>
-      <w:r>
-        <w:rPr>
-          <w:b/>
-          <w:bCs/>
-        </w:rPr>
-        <w:t xml:space="preserve">M11 U05 · Vivienda: rentar, comprar o esperar</w:t>
-      </w:r>
-      <w:r>
-        <w:t xml:space="preserve"> Objetivo: comparar el costo total de comprar (enganche, gastos notariales, avalúo, seguros) contra rentar, y conocer las opciones de crédito para personas independientes. [POR CONFIRMAR: opciones de Infonavit para personas no asalariadas]</w:t>
-      </w:r>
-    </w:p>
-    <w:p>
-      <w:r>
-        <w:rPr>
-          <w:b/>
-          <w:bCs/>
-        </w:rPr>
-        <w:t xml:space="preserve">M11 U06 · Ingresos fuera de cámara</w:t>
-      </w:r>
-      <w:r>
-        <w:t xml:space="preserve"> Objetivo: diversificar con clases, talleres, producción, marcas propias o consultoría, y calcular si un negocio paralelo realmente te deja ganancia.</w:t>
-      </w:r>
-    </w:p>
-    <w:p>
-      <w:r>
-        <w:rPr>
-          <w:b/>
-          <w:bCs/>
-        </w:rPr>
-        <w:t xml:space="preserve">M11 U07 · Tu carrera larga</w:t>
-      </w:r>
-      <w:r>
-        <w:t xml:space="preserve"> Objetivo: planear las etapas de tu carrera (formación, crecimiento, madurez y transición) y lo que necesitas en cada una.</w:t>
-      </w:r>
-    </w:p>
-    <w:p>
-      <w:r>
-        <w:rPr>
-          <w:b/>
-          <w:bCs/>
-        </w:rPr>
-        <w:t xml:space="preserve">M11 U08 · Tu plan de una página</w:t>
-      </w:r>
-      <w:r>
-        <w:t xml:space="preserve"> Objetivo: reunir tus números, deudas, reserva, protección, metas y tres acciones con fecha.</w:t>
-      </w:r>
-    </w:p>
-    <w:p>
-      <w:r>
-        <w:br w:type="page"/>
-      </w:r>
-    </w:p>
-    <w:p>
-      <w:pPr>
-        <w:pStyle w:val="Heading1"/>
-      </w:pPr>
-      <w:r>
-        <w:t xml:space="preserve">4. Qué cambió respecto a la versión 1</w:t>
+        <w:t xml:space="preserve">Módulo 3. Contratos, representación y regalías</w:t>
+      </w:r>
+    </w:p>
+    <w:p>
+      <w:r>
+        <w:rPr>
+          <w:b/>
+          <w:bCs/>
+        </w:rPr>
+        <w:t xml:space="preserve">M3 U01 · Lo que revisas antes de firmar un llamado o una exclusividad</w:t>
+      </w:r>
+      <w:r>
+        <w:t xml:space="preserve"> Objetivo: identificar vigencia, territorio, medios, exclusividad, derechos de imagen, penalizaciones y fechas de pago. Gancho: Valeria firmó una campaña "para redes" y su foto apareció en espectaculares durante tres años.</w:t>
+      </w:r>
+    </w:p>
+    <w:p>
+      <w:r>
+        <w:rPr>
+          <w:b/>
+          <w:bCs/>
+        </w:rPr>
+        <w:t xml:space="preserve">M3 U02 · Derechos de imagen y voz: qué cedes y por cuánto tiempo</w:t>
+      </w:r>
+      <w:r>
+        <w:t xml:space="preserve"> Objetivo: distinguir entre ceder, licenciar y autorizar el uso de tu imagen y de tu voz, incluidos usos con inteligencia artificial y doblaje.</w:t>
+      </w:r>
+    </w:p>
+    <w:p>
+      <w:r>
+        <w:rPr>
+          <w:b/>
+          <w:bCs/>
+        </w:rPr>
+        <w:t xml:space="preserve">M3 U03 · Mánagers y agencias: comisiones y cuentas claras</w:t>
+      </w:r>
+      <w:r>
+        <w:t xml:space="preserve"> Objetivo: pactar por escrito la comisión (normalmente entre 10% y 20%), sobre qué monto se cobra, qué gastos se descuentan y cómo te rinden cuentas. Gancho: el mánager de Valeria cobra su comisión sobre el pago con IVA incluido y además descuenta "gastos de representación" sin comprobante.</w:t>
+      </w:r>
+    </w:p>
+    <w:p>
+      <w:r>
+        <w:rPr>
+          <w:b/>
+          <w:bCs/>
+        </w:rPr>
+        <w:t xml:space="preserve">M3 U04 · ANDA, ANDI y las organizaciones del medio en México: ¿quién hace qué?</w:t>
+      </w:r>
+      <w:r>
+        <w:t xml:space="preserve"> Objetivo: saber a qué organización mexicana acudir según lo que necesitas:</w:t>
       </w:r>
     </w:p>
     <w:tbl>
@@ -3269,7 +2590,7 @@
                 <w:sz w:val="18"/>
                 <w:szCs w:val="18"/>
               </w:rPr>
-              <w:t xml:space="preserve">Tema</w:t>
+              <w:t xml:space="preserve">Organización</w:t>
             </w:r>
           </w:p>
         </w:tc>
@@ -3293,7 +2614,7 @@
                 <w:sz w:val="18"/>
                 <w:szCs w:val="18"/>
               </w:rPr>
-              <w:t xml:space="preserve">Versión 1</w:t>
+              <w:t xml:space="preserve">Qué es</w:t>
             </w:r>
           </w:p>
         </w:tc>
@@ -3317,6 +2638,1552 @@
                 <w:sz w:val="18"/>
                 <w:szCs w:val="18"/>
               </w:rPr>
+              <w:t xml:space="preserve">Para qué te sirve</w:t>
+            </w:r>
+          </w:p>
+        </w:tc>
+      </w:tr>
+      <w:tr>
+        <w:trPr>
+          <w:tblHeader w:val="off"/>
+        </w:trPr>
+        <w:tc>
+          <w:tcPr>
+            <w:tcW w:type="dxa" w:w="3213"/>
+            <w:tcMar>
+              <w:top w:type="dxa" w:w="60"/>
+              <w:left w:type="dxa" w:w="90"/>
+              <w:bottom w:type="dxa" w:w="60"/>
+              <w:right w:type="dxa" w:w="90"/>
+            </w:tcMar>
+          </w:tcPr>
+          <w:p>
+            <w:r>
+              <w:rPr>
+                <w:b/>
+                <w:bCs/>
+                <w:sz w:val="18"/>
+                <w:szCs w:val="18"/>
+              </w:rPr>
+              <w:t xml:space="preserve">ANDA</w:t>
+            </w:r>
+            <w:r>
+              <w:rPr>
+                <w:sz w:val="18"/>
+                <w:szCs w:val="18"/>
+              </w:rPr>
+              <w:t xml:space="preserve"> (Asociación Nacional de Actores)</w:t>
+            </w:r>
+          </w:p>
+        </w:tc>
+        <w:tc>
+          <w:tcPr>
+            <w:tcW w:type="dxa" w:w="3213"/>
+            <w:tcMar>
+              <w:top w:type="dxa" w:w="60"/>
+              <w:left w:type="dxa" w:w="90"/>
+              <w:bottom w:type="dxa" w:w="60"/>
+              <w:right w:type="dxa" w:w="90"/>
+            </w:tcMar>
+          </w:tcPr>
+          <w:p>
+            <w:r>
+              <w:rPr>
+                <w:sz w:val="18"/>
+                <w:szCs w:val="18"/>
+              </w:rPr>
+              <w:t xml:space="preserve">Sindicato de actrices y actores de cine, teatro, radio, televisión, doblaje, stunts y centros nocturnos</w:t>
+            </w:r>
+          </w:p>
+        </w:tc>
+        <w:tc>
+          <w:tcPr>
+            <w:tcW w:type="dxa" w:w="3214"/>
+            <w:tcMar>
+              <w:top w:type="dxa" w:w="60"/>
+              <w:left w:type="dxa" w:w="90"/>
+              <w:bottom w:type="dxa" w:w="60"/>
+              <w:right w:type="dxa" w:w="90"/>
+            </w:tcMar>
+          </w:tcPr>
+          <w:p>
+            <w:r>
+              <w:rPr>
+                <w:sz w:val="18"/>
+                <w:szCs w:val="18"/>
+              </w:rPr>
+              <w:t xml:space="preserve">Tu actividad laboral: agremiación, contratos, tabuladores, condiciones de trabajo y servicios para sus agremiados, incluidos servicios de salud [POR CONFIRMAR: servicios vigentes]</w:t>
+            </w:r>
+          </w:p>
+        </w:tc>
+      </w:tr>
+      <w:tr>
+        <w:trPr>
+          <w:tblHeader w:val="off"/>
+        </w:trPr>
+        <w:tc>
+          <w:tcPr>
+            <w:tcW w:type="dxa" w:w="3213"/>
+            <w:tcMar>
+              <w:top w:type="dxa" w:w="60"/>
+              <w:left w:type="dxa" w:w="90"/>
+              <w:bottom w:type="dxa" w:w="60"/>
+              <w:right w:type="dxa" w:w="90"/>
+            </w:tcMar>
+          </w:tcPr>
+          <w:p>
+            <w:r>
+              <w:rPr>
+                <w:b/>
+                <w:bCs/>
+                <w:sz w:val="18"/>
+                <w:szCs w:val="18"/>
+              </w:rPr>
+              <w:t xml:space="preserve">ANDI</w:t>
+            </w:r>
+            <w:r>
+              <w:rPr>
+                <w:sz w:val="18"/>
+                <w:szCs w:val="18"/>
+              </w:rPr>
+              <w:t xml:space="preserve"> (Asociación Nacional de Intérpretes)</w:t>
+            </w:r>
+          </w:p>
+        </w:tc>
+        <w:tc>
+          <w:tcPr>
+            <w:tcW w:type="dxa" w:w="3213"/>
+            <w:tcMar>
+              <w:top w:type="dxa" w:w="60"/>
+              <w:left w:type="dxa" w:w="90"/>
+              <w:bottom w:type="dxa" w:w="60"/>
+              <w:right w:type="dxa" w:w="90"/>
+            </w:tcMar>
+          </w:tcPr>
+          <w:p>
+            <w:r>
+              <w:rPr>
+                <w:sz w:val="18"/>
+                <w:szCs w:val="18"/>
+              </w:rPr>
+              <w:t xml:space="preserve">Sociedad de gestión colectiva autorizada por INDAUTOR</w:t>
+            </w:r>
+          </w:p>
+        </w:tc>
+        <w:tc>
+          <w:tcPr>
+            <w:tcW w:type="dxa" w:w="3214"/>
+            <w:tcMar>
+              <w:top w:type="dxa" w:w="60"/>
+              <w:left w:type="dxa" w:w="90"/>
+              <w:bottom w:type="dxa" w:w="60"/>
+              <w:right w:type="dxa" w:w="90"/>
+            </w:tcMar>
+          </w:tcPr>
+          <w:p>
+            <w:r>
+              <w:rPr>
+                <w:sz w:val="18"/>
+                <w:szCs w:val="18"/>
+              </w:rPr>
+              <w:t xml:space="preserve">Cobra y reparte tus regalías como intérprete por retransmisiones de programas, telenovelas, películas y fonogramas, en México y el extranjero</w:t>
+            </w:r>
+          </w:p>
+        </w:tc>
+      </w:tr>
+      <w:tr>
+        <w:trPr>
+          <w:tblHeader w:val="off"/>
+        </w:trPr>
+        <w:tc>
+          <w:tcPr>
+            <w:tcW w:type="dxa" w:w="3213"/>
+            <w:tcMar>
+              <w:top w:type="dxa" w:w="60"/>
+              <w:left w:type="dxa" w:w="90"/>
+              <w:bottom w:type="dxa" w:w="60"/>
+              <w:right w:type="dxa" w:w="90"/>
+            </w:tcMar>
+          </w:tcPr>
+          <w:p>
+            <w:r>
+              <w:rPr>
+                <w:b/>
+                <w:bCs/>
+                <w:sz w:val="18"/>
+                <w:szCs w:val="18"/>
+              </w:rPr>
+              <w:t xml:space="preserve">SACM</w:t>
+            </w:r>
+            <w:r>
+              <w:rPr>
+                <w:sz w:val="18"/>
+                <w:szCs w:val="18"/>
+              </w:rPr>
+              <w:t xml:space="preserve"> (Sociedad de Autores y Compositores de México)</w:t>
+            </w:r>
+          </w:p>
+        </w:tc>
+        <w:tc>
+          <w:tcPr>
+            <w:tcW w:type="dxa" w:w="3213"/>
+            <w:tcMar>
+              <w:top w:type="dxa" w:w="60"/>
+              <w:left w:type="dxa" w:w="90"/>
+              <w:bottom w:type="dxa" w:w="60"/>
+              <w:right w:type="dxa" w:w="90"/>
+            </w:tcMar>
+          </w:tcPr>
+          <w:p>
+            <w:r>
+              <w:rPr>
+                <w:sz w:val="18"/>
+                <w:szCs w:val="18"/>
+              </w:rPr>
+              <w:t xml:space="preserve">Sociedad de gestión colectiva</w:t>
+            </w:r>
+          </w:p>
+        </w:tc>
+        <w:tc>
+          <w:tcPr>
+            <w:tcW w:type="dxa" w:w="3214"/>
+            <w:tcMar>
+              <w:top w:type="dxa" w:w="60"/>
+              <w:left w:type="dxa" w:w="90"/>
+              <w:bottom w:type="dxa" w:w="60"/>
+              <w:right w:type="dxa" w:w="90"/>
+            </w:tcMar>
+          </w:tcPr>
+          <w:p>
+            <w:r>
+              <w:rPr>
+                <w:sz w:val="18"/>
+                <w:szCs w:val="18"/>
+              </w:rPr>
+              <w:t xml:space="preserve">Regalías de autores y compositores de música</w:t>
+            </w:r>
+          </w:p>
+        </w:tc>
+      </w:tr>
+      <w:tr>
+        <w:trPr>
+          <w:tblHeader w:val="off"/>
+        </w:trPr>
+        <w:tc>
+          <w:tcPr>
+            <w:tcW w:type="dxa" w:w="3213"/>
+            <w:tcMar>
+              <w:top w:type="dxa" w:w="60"/>
+              <w:left w:type="dxa" w:w="90"/>
+              <w:bottom w:type="dxa" w:w="60"/>
+              <w:right w:type="dxa" w:w="90"/>
+            </w:tcMar>
+          </w:tcPr>
+          <w:p>
+            <w:r>
+              <w:rPr>
+                <w:b/>
+                <w:bCs/>
+                <w:sz w:val="18"/>
+                <w:szCs w:val="18"/>
+              </w:rPr>
+              <w:t xml:space="preserve">EJE</w:t>
+            </w:r>
+            <w:r>
+              <w:rPr>
+                <w:sz w:val="18"/>
+                <w:szCs w:val="18"/>
+              </w:rPr>
+              <w:t xml:space="preserve"> (Ejecutantes)</w:t>
+            </w:r>
+          </w:p>
+        </w:tc>
+        <w:tc>
+          <w:tcPr>
+            <w:tcW w:type="dxa" w:w="3213"/>
+            <w:tcMar>
+              <w:top w:type="dxa" w:w="60"/>
+              <w:left w:type="dxa" w:w="90"/>
+              <w:bottom w:type="dxa" w:w="60"/>
+              <w:right w:type="dxa" w:w="90"/>
+            </w:tcMar>
+          </w:tcPr>
+          <w:p>
+            <w:r>
+              <w:rPr>
+                <w:sz w:val="18"/>
+                <w:szCs w:val="18"/>
+              </w:rPr>
+              <w:t xml:space="preserve">Sociedad de gestión colectiva</w:t>
+            </w:r>
+          </w:p>
+        </w:tc>
+        <w:tc>
+          <w:tcPr>
+            <w:tcW w:type="dxa" w:w="3214"/>
+            <w:tcMar>
+              <w:top w:type="dxa" w:w="60"/>
+              <w:left w:type="dxa" w:w="90"/>
+              <w:bottom w:type="dxa" w:w="60"/>
+              <w:right w:type="dxa" w:w="90"/>
+            </w:tcMar>
+          </w:tcPr>
+          <w:p>
+            <w:r>
+              <w:rPr>
+                <w:sz w:val="18"/>
+                <w:szCs w:val="18"/>
+              </w:rPr>
+              <w:t xml:space="preserve">Regalías de músicos ejecutantes y cantantes de agrupaciones</w:t>
+            </w:r>
+          </w:p>
+        </w:tc>
+      </w:tr>
+      <w:tr>
+        <w:trPr>
+          <w:tblHeader w:val="off"/>
+        </w:trPr>
+        <w:tc>
+          <w:tcPr>
+            <w:tcW w:type="dxa" w:w="3213"/>
+            <w:tcMar>
+              <w:top w:type="dxa" w:w="60"/>
+              <w:left w:type="dxa" w:w="90"/>
+              <w:bottom w:type="dxa" w:w="60"/>
+              <w:right w:type="dxa" w:w="90"/>
+            </w:tcMar>
+          </w:tcPr>
+          <w:p>
+            <w:r>
+              <w:rPr>
+                <w:b/>
+                <w:bCs/>
+                <w:sz w:val="18"/>
+                <w:szCs w:val="18"/>
+              </w:rPr>
+              <w:t xml:space="preserve">SOMEXFON</w:t>
+            </w:r>
+          </w:p>
+        </w:tc>
+        <w:tc>
+          <w:tcPr>
+            <w:tcW w:type="dxa" w:w="3213"/>
+            <w:tcMar>
+              <w:top w:type="dxa" w:w="60"/>
+              <w:left w:type="dxa" w:w="90"/>
+              <w:bottom w:type="dxa" w:w="60"/>
+              <w:right w:type="dxa" w:w="90"/>
+            </w:tcMar>
+          </w:tcPr>
+          <w:p>
+            <w:r>
+              <w:rPr>
+                <w:sz w:val="18"/>
+                <w:szCs w:val="18"/>
+              </w:rPr>
+              <w:t xml:space="preserve">Sociedad de gestión colectiva</w:t>
+            </w:r>
+          </w:p>
+        </w:tc>
+        <w:tc>
+          <w:tcPr>
+            <w:tcW w:type="dxa" w:w="3214"/>
+            <w:tcMar>
+              <w:top w:type="dxa" w:w="60"/>
+              <w:left w:type="dxa" w:w="90"/>
+              <w:bottom w:type="dxa" w:w="60"/>
+              <w:right w:type="dxa" w:w="90"/>
+            </w:tcMar>
+          </w:tcPr>
+          <w:p>
+            <w:r>
+              <w:rPr>
+                <w:sz w:val="18"/>
+                <w:szCs w:val="18"/>
+              </w:rPr>
+              <w:t xml:space="preserve">Derechos de los productores de fonogramas (disqueras y quienes producen sus propias grabaciones)</w:t>
+            </w:r>
+          </w:p>
+        </w:tc>
+      </w:tr>
+    </w:tbl>
+    <w:p/>
+    <w:p>
+      <w:r>
+        <w:t xml:space="preserve">Idea clave: muchas personas creen que la ANDA cobra las regalías; la ANDA regula la actividad laboral y la ANDI administra las regalías. Puedes pertenecer a las dos. Gancho: Gael es miembro de la ANDA y cree que ahí le llegan sus regalías de una telenovela que se retransmite en Sudamérica.</w:t>
+      </w:r>
+    </w:p>
+    <w:p>
+      <w:r>
+        <w:rPr>
+          <w:b/>
+          <w:bCs/>
+        </w:rPr>
+        <w:t xml:space="preserve">M3 U05 · Cómo cobro mis regalías y reviso mis pagos</w:t>
+      </w:r>
+      <w:r>
+        <w:t xml:space="preserve"> Objetivo: afiliarte a la sociedad que te corresponde (ANDI, SACM, EJE o SOMEXFON), registrar tus obras o interpretaciones, revisar tus liquidaciones, desconfiar de gestores que cobran por "recuperar regalías" y saber que esos ingresos se declaran. [POR CONFIRMAR con contador: tratamiento de ISR e IVA de regalías por derechos de autor]</w:t>
+      </w:r>
+    </w:p>
+    <w:p>
+      <w:r>
+        <w:rPr>
+          <w:b/>
+          <w:bCs/>
+        </w:rPr>
+        <w:t xml:space="preserve">M3 U06 · Cuando la productora no paga</w:t>
+      </w:r>
+      <w:r>
+        <w:t xml:space="preserve"> Objetivo: documentar, reclamar por escrito, conocer penalizaciones pactadas y cuándo acudir a un abogado o a PROFEDET (si hay relación laboral).</w:t>
+      </w:r>
+    </w:p>
+    <w:p>
+      <w:pPr>
+        <w:pStyle w:val="Heading2"/>
+      </w:pPr>
+      <w:r>
+        <w:t xml:space="preserve">Módulo 4. Conoce el sistema financiero mexicano</w:t>
+      </w:r>
+    </w:p>
+    <w:p>
+      <w:r>
+        <w:rPr>
+          <w:b/>
+          <w:bCs/>
+        </w:rPr>
+        <w:t xml:space="preserve">M4 U01 · ¿Quién es quién en el sistema financiero?</w:t>
+      </w:r>
+      <w:r>
+        <w:t xml:space="preserve"> Objetivo: distinguir a las autoridades (Banxico, SHCP, CNBV, CONDUSEF, IPAB, CNSF) de las instituciones que te ofrecen productos.</w:t>
+      </w:r>
+    </w:p>
+    <w:p>
+      <w:r>
+        <w:rPr>
+          <w:b/>
+          <w:bCs/>
+        </w:rPr>
+        <w:t xml:space="preserve">M4 U02 · Bancos, bancos digitales y otras entidades: ¿cuál es cuál?</w:t>
+      </w:r>
+      <w:r>
+        <w:t xml:space="preserve"> Objetivo: diferenciar un banco (con protección del IPAB) de otras entidades que también prestan o captan dinero: SOFOM, SOFIPO, SOCAP, instituciones de tecnología financiera, tiendas departamentales y casas de empeño. Se explican para que sepas qué contratas, sin recomendarlas. Gancho: Renata tiene cinco "tarjetas de banco"; al revisar, solo dos son de bancos.</w:t>
+      </w:r>
+    </w:p>
+    <w:p>
+      <w:r>
+        <w:rPr>
+          <w:b/>
+          <w:bCs/>
+        </w:rPr>
+        <w:t xml:space="preserve">M4 U03 · ¿Cómo verifico una institución antes de contratar?</w:t>
+      </w:r>
+      <w:r>
+        <w:t xml:space="preserve"> Objetivo: usar el SIPRES (registro de prestadores de servicios financieros), el Buró de Entidades Financieras de CONDUSEF y el padrón de entidades supervisadas de la CNBV.</w:t>
+      </w:r>
+    </w:p>
+    <w:p>
+      <w:r>
+        <w:rPr>
+          <w:b/>
+          <w:bCs/>
+        </w:rPr>
+        <w:t xml:space="preserve">M4 U04 · Tus derechos como usuario</w:t>
+      </w:r>
+      <w:r>
+        <w:t xml:space="preserve"> Objetivo: conocer tus derechos (información clara, contrato registrado, cancelación, reclamación) y cómo reclamar: primero a la Unidad Especializada (UNE) de la institución, luego a CONDUSEF.</w:t>
+      </w:r>
+    </w:p>
+    <w:p>
+      <w:pPr>
+        <w:pStyle w:val="Heading2"/>
+      </w:pPr>
+      <w:r>
+        <w:t xml:space="preserve">Módulo 5. Compara y elige: instituciones y productos</w:t>
+      </w:r>
+    </w:p>
+    <w:p>
+      <w:r>
+        <w:rPr>
+          <w:b/>
+          <w:bCs/>
+        </w:rPr>
+        <w:t xml:space="preserve">M5 U01 · Primero elige la institución</w:t>
+      </w:r>
+      <w:r>
+        <w:t xml:space="preserve"> Objetivo: comparar instituciones por supervisión, protección, calificación en el Buró de Entidades Financieras, reclamaciones, atención y canales.</w:t>
+      </w:r>
+    </w:p>
+    <w:p>
+      <w:r>
+        <w:rPr>
+          <w:b/>
+          <w:bCs/>
+        </w:rPr>
+        <w:t xml:space="preserve">M5 U02 · Elige tu cuenta</w:t>
+      </w:r>
+      <w:r>
+        <w:t xml:space="preserve"> Objetivo: comparar cuentas por comisiones, saldo mínimo, retiros, transferencias y cobros en efectivo. Portabilidad de nómina si cobras por Asimilados.</w:t>
+      </w:r>
+    </w:p>
+    <w:p>
+      <w:r>
+        <w:rPr>
+          <w:b/>
+          <w:bCs/>
+        </w:rPr>
+        <w:t xml:space="preserve">M5 U03 · Elige dónde ahorrar e invertir</w:t>
+      </w:r>
+      <w:r>
+        <w:t xml:space="preserve"> Objetivo: leer la GAT nominal y la GAT real, el plazo, la liquidez y la protección. Cetes, pagarés y cuentas a la vista de bancos.</w:t>
+      </w:r>
+    </w:p>
+    <w:p>
+      <w:r>
+        <w:rPr>
+          <w:b/>
+          <w:bCs/>
+        </w:rPr>
+        <w:t xml:space="preserve">M5 U04 · Elige un seguro</w:t>
+      </w:r>
+      <w:r>
+        <w:t xml:space="preserve"> Objetivo: comparar suma asegurada, deducible, coaseguro, exclusiones y prima con los simuladores de CONDUSEF.</w:t>
+      </w:r>
+    </w:p>
+    <w:p>
+      <w:r>
+        <w:rPr>
+          <w:b/>
+          <w:bCs/>
+        </w:rPr>
+        <w:t xml:space="preserve">M5 U05 · Elige un crédito: los números</w:t>
+      </w:r>
+      <w:r>
+        <w:t xml:space="preserve"> Objetivo: comparar por CAT, tasa, comisiones, pago total y plazo. Distinguir crédito revolvente (tarjeta) de crédito simple (pagos fijos). Gancho: a Toño le ofrecen dos créditos para su estudio con el mismo pago mensual: uno cuesta 18,000 más que el otro.</w:t>
+      </w:r>
+    </w:p>
+    <w:p>
+      <w:r>
+        <w:rPr>
+          <w:b/>
+          <w:bCs/>
+        </w:rPr>
+        <w:t xml:space="preserve">M5 U06 · Elige un crédito: el tipo correcto para cada uso</w:t>
+      </w:r>
+      <w:r>
+        <w:t xml:space="preserve"> Objetivo: relacionar el uso con el producto: equipo de trabajo, emergencia, auto, vivienda. Cuándo no conviene pedir crédito.</w:t>
+      </w:r>
+    </w:p>
+    <w:p>
+      <w:r>
+        <w:rPr>
+          <w:b/>
+          <w:bCs/>
+        </w:rPr>
+        <w:t xml:space="preserve">M5 U07 · Lee el contrato antes de firmar</w:t>
+      </w:r>
+      <w:r>
+        <w:t xml:space="preserve"> Objetivo: revisar la carátula, el CAT, las comisiones, los seguros incluidos y el registro del contrato en el RECA de CONDUSEF.</w:t>
+      </w:r>
+    </w:p>
+    <w:p>
+      <w:pPr>
+        <w:pStyle w:val="Heading2"/>
+      </w:pPr>
+      <w:r>
+        <w:t xml:space="preserve">Módulo 6. El crédito es deuda</w:t>
+      </w:r>
+    </w:p>
+    <w:p>
+      <w:r>
+        <w:rPr>
+          <w:b/>
+          <w:bCs/>
+        </w:rPr>
+        <w:t xml:space="preserve">M6 U01 · Tu línea de crédito no es tu ingreso</w:t>
+      </w:r>
+      <w:r>
+        <w:t xml:space="preserve"> Objetivo: entender que la línea es dinero prestado que se paga con tus ingresos futuros, y que un aumento de línea no es un aumento de sueldo. Gancho: Renata dice "tengo 180,000 disponibles" al sumar las líneas de sus seis tarjetas.</w:t>
+      </w:r>
+    </w:p>
+    <w:p>
+      <w:r>
+        <w:rPr>
+          <w:b/>
+          <w:bCs/>
+        </w:rPr>
+        <w:t xml:space="preserve">M6 U02 · Pago mínimo, pago para no generar intereses y fechas clave</w:t>
+      </w:r>
+      <w:r>
+        <w:t xml:space="preserve"> Objetivo: leer tu estado de cuenta: fecha de corte, fecha límite, pago mínimo y pago para no generar intereses. Cuánto tardas y cuánto pagas si solo cubres el mínimo.</w:t>
+      </w:r>
+    </w:p>
+    <w:p>
+      <w:r>
+        <w:rPr>
+          <w:b/>
+          <w:bCs/>
+        </w:rPr>
+        <w:t xml:space="preserve">M6 U03 · Meses sin intereses: cuándo ayudan y cuándo te atrapan</w:t>
+      </w:r>
+      <w:r>
+        <w:t xml:space="preserve"> Objetivo: usar MSI solo en compras que planeabas (equipo de trabajo, por ejemplo) y sumar todas tus mensualidades antes de agregar otra.</w:t>
+      </w:r>
+    </w:p>
+    <w:p>
+      <w:r>
+        <w:rPr>
+          <w:b/>
+          <w:bCs/>
+        </w:rPr>
+        <w:t xml:space="preserve">M6 U04 · Tu inventario de deudas</w:t>
+      </w:r>
+      <w:r>
+        <w:t xml:space="preserve"> Objetivo: listar cada deuda con institución, tipo, saldo, tasa o CAT, pago mínimo, fecha y si hay atraso.</w:t>
+      </w:r>
+    </w:p>
+    <w:p>
+      <w:r>
+        <w:rPr>
+          <w:b/>
+          <w:bCs/>
+        </w:rPr>
+        <w:t xml:space="preserve">M6 U05 · ¿Cuánta deuda aguanta un ingreso variable?</w:t>
+      </w:r>
+      <w:r>
+        <w:t xml:space="preserve"> Objetivo: medir tus pagos de deuda contra tu mes bajo, no contra tu mejor mes, y fijar tu límite personal.</w:t>
+      </w:r>
+    </w:p>
+    <w:p>
+      <w:r>
+        <w:rPr>
+          <w:b/>
+          <w:bCs/>
+        </w:rPr>
+        <w:t xml:space="preserve">M6 U06 · No uses la tarjeta para vivir la sequía</w:t>
+      </w:r>
+      <w:r>
+        <w:t xml:space="preserve"> Objetivo: diferenciar una emergencia de un faltante recurrente y usar primero el fondo de sequía. Gancho: Gael pagó la renta de cuatro meses sin llamados con la tarjeta y ahora debe 60,000.</w:t>
+      </w:r>
+    </w:p>
+    <w:p>
+      <w:pPr>
+        <w:pStyle w:val="Heading2"/>
+      </w:pPr>
+      <w:r>
+        <w:t xml:space="preserve">Módulo 7. Buró y Círculo de Crédito</w:t>
+      </w:r>
+    </w:p>
+    <w:p>
+      <w:r>
+        <w:t xml:space="preserve">Marco: Ley para Regular las Sociedades de Información Crediticia (LRSIC) y reglas del Banco de México para esas sociedades (Circular 27/2008 y sus modificaciones). Orientación de CONDUSEF.</w:t>
+      </w:r>
+    </w:p>
+    <w:p>
+      <w:r>
+        <w:rPr>
+          <w:b/>
+          <w:bCs/>
+        </w:rPr>
+        <w:t xml:space="preserve">M7 U01 · ¿Qué son el Buró y el Círculo de Crédito?</w:t>
+      </w:r>
+      <w:r>
+        <w:t xml:space="preserve"> Objetivo: entender que son sociedades de información crediticia: guardan tu historial y lo entregan a quien tú autorizas. No son una "lista negra", no prestan dinero y no deciden si te aprueban: decide la institución.</w:t>
+      </w:r>
+    </w:p>
+    <w:p>
+      <w:r>
+        <w:rPr>
+          <w:b/>
+          <w:bCs/>
+        </w:rPr>
+        <w:t xml:space="preserve">M7 U02 · Buró y Círculo: ¿en qué se parecen y en qué no?</w:t>
+      </w:r>
+      <w:r>
+        <w:t xml:space="preserve"> Objetivo: saber que hay dos sociedades con la misma función, que cada institución reporta a una, a la otra o a ambas, y que por eso tu información puede ser distinta en cada una. Revisa las dos. Gancho: Toño revisó su Buró y todo estaba bien, pero le negaron un crédito por un atraso que solo aparece en Círculo.</w:t>
+      </w:r>
+    </w:p>
+    <w:p>
+      <w:r>
+        <w:rPr>
+          <w:b/>
+          <w:bCs/>
+        </w:rPr>
+        <w:t xml:space="preserve">M7 U03 · Pide tus reportes gratis: dos al año</w:t>
+      </w:r>
+      <w:r>
+        <w:t xml:space="preserve"> Objetivo: obtener tu Reporte de Crédito Especial gratis la primera vez y después una vez cada 12 meses en </w:t>
+      </w:r>
+      <w:r>
+        <w:rPr>
+          <w:b/>
+          <w:bCs/>
+        </w:rPr>
+        <w:t xml:space="preserve">cada</w:t>
+      </w:r>
+      <w:r>
+        <w:t xml:space="preserve"> sociedad: uno en Buró y otro en Círculo. Se pide en sus sitios oficiales con tus datos y preguntas de seguridad; los reportes extra tienen costo (en Buró, unos 47 pesos por internet [POR CONFIRMAR]). Regla: pídelo solo en los sitios oficiales. Nadie más "te consulta el Buró gratis" a cambio de tus datos.</w:t>
+      </w:r>
+    </w:p>
+    <w:p>
+      <w:r>
+        <w:rPr>
+          <w:b/>
+          <w:bCs/>
+        </w:rPr>
+        <w:t xml:space="preserve">M7 U04 · Lee tu reporte</w:t>
+      </w:r>
+      <w:r>
+        <w:t xml:space="preserve"> Objetivo: identificar cuentas, otorgante, saldo, límite, forma de pago y atrasos, claves de observación (por ejemplo, cuenta liquidada con quita) y la lista de quién consultó tu historial en los últimos 24 meses.</w:t>
+      </w:r>
+    </w:p>
+    <w:p>
+      <w:r>
+        <w:rPr>
+          <w:b/>
+          <w:bCs/>
+        </w:rPr>
+        <w:t xml:space="preserve">M7 U05 · Tu score: qué lo sube y qué lo baja</w:t>
+      </w:r>
+      <w:r>
+        <w:t xml:space="preserve"> Objetivo: saber que el score (como Mi Score de Buró) es un producto aparte y con costo, distinto del reporte gratuito, y conocer lo que lo mueve: pagos a tiempo, uso de tu línea, antigüedad, consultas y tipos de crédito.</w:t>
+      </w:r>
+    </w:p>
+    <w:p>
+      <w:r>
+        <w:rPr>
+          <w:b/>
+          <w:bCs/>
+        </w:rPr>
+        <w:t xml:space="preserve">M7 U06 · ¿Cuánto tiempo se queda un atraso?</w:t>
+      </w:r>
+      <w:r>
+        <w:t xml:space="preserve"> Objetivo: conocer los plazos para que se elimine una deuda del historial, según su monto en UDIS:</w:t>
+      </w:r>
+    </w:p>
+    <w:tbl>
+      <w:tblPr>
+        <w:tblW w:type="dxa" w:w="9640"/>
+        <w:tblBorders>
+          <w:top w:val="single" w:color="B7C9C0" w:sz="4"/>
+          <w:left w:val="single" w:color="B7C9C0" w:sz="4"/>
+          <w:bottom w:val="single" w:color="B7C9C0" w:sz="4"/>
+          <w:right w:val="single" w:color="B7C9C0" w:sz="4"/>
+          <w:insideH w:val="single" w:color="B7C9C0" w:sz="4"/>
+          <w:insideV w:val="single" w:color="B7C9C0" w:sz="4"/>
+        </w:tblBorders>
+      </w:tblPr>
+      <w:tblGrid>
+        <w:gridCol w:w="4820"/>
+        <w:gridCol w:w="4820"/>
+      </w:tblGrid>
+      <w:tr>
+        <w:trPr>
+          <w:tblHeader/>
+        </w:trPr>
+        <w:tc>
+          <w:tcPr>
+            <w:tcW w:type="dxa" w:w="4820"/>
+            <w:shd w:fill="1F5C4A" w:color="auto" w:val="clear"/>
+            <w:tcMar>
+              <w:top w:type="dxa" w:w="60"/>
+              <w:left w:type="dxa" w:w="90"/>
+              <w:bottom w:type="dxa" w:w="60"/>
+              <w:right w:type="dxa" w:w="90"/>
+            </w:tcMar>
+          </w:tcPr>
+          <w:p>
+            <w:r>
+              <w:rPr>
+                <w:b/>
+                <w:bCs/>
+                <w:color w:val="FFFFFF"/>
+                <w:sz w:val="18"/>
+                <w:szCs w:val="18"/>
+              </w:rPr>
+              <w:t xml:space="preserve">Monto de la deuda</w:t>
+            </w:r>
+          </w:p>
+        </w:tc>
+        <w:tc>
+          <w:tcPr>
+            <w:tcW w:type="dxa" w:w="4820"/>
+            <w:shd w:fill="1F5C4A" w:color="auto" w:val="clear"/>
+            <w:tcMar>
+              <w:top w:type="dxa" w:w="60"/>
+              <w:left w:type="dxa" w:w="90"/>
+              <w:bottom w:type="dxa" w:w="60"/>
+              <w:right w:type="dxa" w:w="90"/>
+            </w:tcMar>
+          </w:tcPr>
+          <w:p>
+            <w:r>
+              <w:rPr>
+                <w:b/>
+                <w:bCs/>
+                <w:color w:val="FFFFFF"/>
+                <w:sz w:val="18"/>
+                <w:szCs w:val="18"/>
+              </w:rPr>
+              <w:t xml:space="preserve">Se elimina después de</w:t>
+            </w:r>
+          </w:p>
+        </w:tc>
+      </w:tr>
+      <w:tr>
+        <w:trPr>
+          <w:tblHeader w:val="off"/>
+        </w:trPr>
+        <w:tc>
+          <w:tcPr>
+            <w:tcW w:type="dxa" w:w="4820"/>
+            <w:tcMar>
+              <w:top w:type="dxa" w:w="60"/>
+              <w:left w:type="dxa" w:w="90"/>
+              <w:bottom w:type="dxa" w:w="60"/>
+              <w:right w:type="dxa" w:w="90"/>
+            </w:tcMar>
+          </w:tcPr>
+          <w:p>
+            <w:r>
+              <w:rPr>
+                <w:sz w:val="18"/>
+                <w:szCs w:val="18"/>
+              </w:rPr>
+              <w:t xml:space="preserve">Hasta 25 UDIS</w:t>
+            </w:r>
+          </w:p>
+        </w:tc>
+        <w:tc>
+          <w:tcPr>
+            <w:tcW w:type="dxa" w:w="4820"/>
+            <w:tcMar>
+              <w:top w:type="dxa" w:w="60"/>
+              <w:left w:type="dxa" w:w="90"/>
+              <w:bottom w:type="dxa" w:w="60"/>
+              <w:right w:type="dxa" w:w="90"/>
+            </w:tcMar>
+          </w:tcPr>
+          <w:p>
+            <w:r>
+              <w:rPr>
+                <w:sz w:val="18"/>
+                <w:szCs w:val="18"/>
+              </w:rPr>
+              <w:t xml:space="preserve">1 año</w:t>
+            </w:r>
+          </w:p>
+        </w:tc>
+      </w:tr>
+      <w:tr>
+        <w:trPr>
+          <w:tblHeader w:val="off"/>
+        </w:trPr>
+        <w:tc>
+          <w:tcPr>
+            <w:tcW w:type="dxa" w:w="4820"/>
+            <w:tcMar>
+              <w:top w:type="dxa" w:w="60"/>
+              <w:left w:type="dxa" w:w="90"/>
+              <w:bottom w:type="dxa" w:w="60"/>
+              <w:right w:type="dxa" w:w="90"/>
+            </w:tcMar>
+          </w:tcPr>
+          <w:p>
+            <w:r>
+              <w:rPr>
+                <w:sz w:val="18"/>
+                <w:szCs w:val="18"/>
+              </w:rPr>
+              <w:t xml:space="preserve">Más de 25 y hasta 500 UDIS</w:t>
+            </w:r>
+          </w:p>
+        </w:tc>
+        <w:tc>
+          <w:tcPr>
+            <w:tcW w:type="dxa" w:w="4820"/>
+            <w:tcMar>
+              <w:top w:type="dxa" w:w="60"/>
+              <w:left w:type="dxa" w:w="90"/>
+              <w:bottom w:type="dxa" w:w="60"/>
+              <w:right w:type="dxa" w:w="90"/>
+            </w:tcMar>
+          </w:tcPr>
+          <w:p>
+            <w:r>
+              <w:rPr>
+                <w:sz w:val="18"/>
+                <w:szCs w:val="18"/>
+              </w:rPr>
+              <w:t xml:space="preserve">2 años</w:t>
+            </w:r>
+          </w:p>
+        </w:tc>
+      </w:tr>
+      <w:tr>
+        <w:trPr>
+          <w:tblHeader w:val="off"/>
+        </w:trPr>
+        <w:tc>
+          <w:tcPr>
+            <w:tcW w:type="dxa" w:w="4820"/>
+            <w:tcMar>
+              <w:top w:type="dxa" w:w="60"/>
+              <w:left w:type="dxa" w:w="90"/>
+              <w:bottom w:type="dxa" w:w="60"/>
+              <w:right w:type="dxa" w:w="90"/>
+            </w:tcMar>
+          </w:tcPr>
+          <w:p>
+            <w:r>
+              <w:rPr>
+                <w:sz w:val="18"/>
+                <w:szCs w:val="18"/>
+              </w:rPr>
+              <w:t xml:space="preserve">Más de 500 y hasta 1,000 UDIS</w:t>
+            </w:r>
+          </w:p>
+        </w:tc>
+        <w:tc>
+          <w:tcPr>
+            <w:tcW w:type="dxa" w:w="4820"/>
+            <w:tcMar>
+              <w:top w:type="dxa" w:w="60"/>
+              <w:left w:type="dxa" w:w="90"/>
+              <w:bottom w:type="dxa" w:w="60"/>
+              <w:right w:type="dxa" w:w="90"/>
+            </w:tcMar>
+          </w:tcPr>
+          <w:p>
+            <w:r>
+              <w:rPr>
+                <w:sz w:val="18"/>
+                <w:szCs w:val="18"/>
+              </w:rPr>
+              <w:t xml:space="preserve">4 años</w:t>
+            </w:r>
+          </w:p>
+        </w:tc>
+      </w:tr>
+      <w:tr>
+        <w:trPr>
+          <w:tblHeader w:val="off"/>
+        </w:trPr>
+        <w:tc>
+          <w:tcPr>
+            <w:tcW w:type="dxa" w:w="4820"/>
+            <w:tcMar>
+              <w:top w:type="dxa" w:w="60"/>
+              <w:left w:type="dxa" w:w="90"/>
+              <w:bottom w:type="dxa" w:w="60"/>
+              <w:right w:type="dxa" w:w="90"/>
+            </w:tcMar>
+          </w:tcPr>
+          <w:p>
+            <w:r>
+              <w:rPr>
+                <w:sz w:val="18"/>
+                <w:szCs w:val="18"/>
+              </w:rPr>
+              <w:t xml:space="preserve">Más de 1,000 UDIS</w:t>
+            </w:r>
+          </w:p>
+        </w:tc>
+        <w:tc>
+          <w:tcPr>
+            <w:tcW w:type="dxa" w:w="4820"/>
+            <w:tcMar>
+              <w:top w:type="dxa" w:w="60"/>
+              <w:left w:type="dxa" w:w="90"/>
+              <w:bottom w:type="dxa" w:w="60"/>
+              <w:right w:type="dxa" w:w="90"/>
+            </w:tcMar>
+          </w:tcPr>
+          <w:p>
+            <w:r>
+              <w:rPr>
+                <w:sz w:val="18"/>
+                <w:szCs w:val="18"/>
+              </w:rPr>
+              <w:t xml:space="preserve">6 años</w:t>
+            </w:r>
+          </w:p>
+        </w:tc>
+      </w:tr>
+    </w:tbl>
+    <w:p/>
+    <w:p>
+      <w:r>
+        <w:t xml:space="preserve">No se eliminan por plazo las deudas mayores a 400,000 UDIS, las que están en juicio y las relacionadas con un fraude. Eliminar el registro no borra la deuda: el acreedor puede seguir cobrando. [POR CONFIRMAR con LRSIC y Circular 27/2008: desde qué fecha se cuenta el plazo] Gancho: Toño cree que su atraso de hace siete años "lo tiene marcado de por vida".</w:t>
+      </w:r>
+    </w:p>
+    <w:p>
+      <w:r>
+        <w:rPr>
+          <w:b/>
+          <w:bCs/>
+        </w:rPr>
+        <w:t xml:space="preserve">M7 U07 · Si hay un error: reclama paso a paso</w:t>
+      </w:r>
+      <w:r>
+        <w:t xml:space="preserve"> Objetivo: presentar una reclamación ante la unidad especializada del Buró o del Círculo, por escrito o en línea, con copia de tu reporte, los registros que impugnas y tus pruebas (por ejemplo, la carta de liquidación). La sociedad pide la información a la institución; si esta no la sustenta, el registro se corrige o se elimina. Hay reclamaciones gratuitas al año (en Círculo, dos gratis y las siguientes con costo) [POR CONFIRMAR: número de reclamaciones gratuitas y plazo de respuesta en LRSIC arts. 42 a 45]. Si no se resuelve, acude a CONDUSEF.</w:t>
+      </w:r>
+    </w:p>
+    <w:p>
+      <w:r>
+        <w:rPr>
+          <w:b/>
+          <w:bCs/>
+        </w:rPr>
+        <w:t xml:space="preserve">M7 U08 · Protege tu historial: bloqueo y alertas</w:t>
+      </w:r>
+      <w:r>
+        <w:t xml:space="preserve"> Objetivo: conocer los servicios de protección:</w:t>
+      </w:r>
+    </w:p>
+    <w:p>
+      <w:pPr>
+        <w:pStyle w:val="ListParagraph"/>
+        <w:numPr>
+          <w:ilvl w:val="0"/>
+          <w:numId w:val="2"/>
+        </w:numPr>
+      </w:pPr>
+      <w:r>
+        <w:rPr>
+          <w:b/>
+          <w:bCs/>
+        </w:rPr>
+        <w:t xml:space="preserve">Bloqueo de Buró:</w:t>
+      </w:r>
+      <w:r>
+        <w:t xml:space="preserve"> mientras está activo, nadie puede consultar tu historial, así que nadie puede abrir un crédito a tu nombre. Lo desbloqueas cuando tú vas a pedir un crédito. [POR CONFIRMAR: condiciones y costo vigentes]</w:t>
+      </w:r>
+    </w:p>
+    <w:p>
+      <w:pPr>
+        <w:pStyle w:val="ListParagraph"/>
+        <w:numPr>
+          <w:ilvl w:val="0"/>
+          <w:numId w:val="2"/>
+        </w:numPr>
+      </w:pPr>
+      <w:r>
+        <w:rPr>
+          <w:b/>
+          <w:bCs/>
+        </w:rPr>
+        <w:t xml:space="preserve">Alertas Buró:</w:t>
+      </w:r>
+      <w:r>
+        <w:t xml:space="preserve"> te avisa cada vez que alguien consulta tu historial o se abre un crédito a tu nombre (con costo anual, unos 232 pesos [POR CONFIRMAR]).</w:t>
+      </w:r>
+    </w:p>
+    <w:p>
+      <w:pPr>
+        <w:pStyle w:val="ListParagraph"/>
+        <w:numPr>
+          <w:ilvl w:val="0"/>
+          <w:numId w:val="2"/>
+        </w:numPr>
+      </w:pPr>
+      <w:r>
+        <w:t xml:space="preserve">Servicios equivalentes de Círculo de Crédito. [POR CONFIRMAR]</w:t>
+      </w:r>
+    </w:p>
+    <w:p>
+      <w:r>
+        <w:rPr>
+          <w:b/>
+          <w:bCs/>
+        </w:rPr>
+        <w:t xml:space="preserve">M7 U09 · Despachos que "limpian tu Buró": fraude</w:t>
+      </w:r>
+      <w:r>
+        <w:t xml:space="preserve"> Objetivo: reconocer que nadie puede borrar información correcta, que las reclamaciones las haces tú y son gratuitas, y que esos cobros son fraude.</w:t>
+      </w:r>
+    </w:p>
+    <w:p>
+      <w:r>
+        <w:rPr>
+          <w:b/>
+          <w:bCs/>
+        </w:rPr>
+        <w:t xml:space="preserve">M7 U10 · Cómo mejorar tu historial paso a paso</w:t>
+      </w:r>
+      <w:r>
+        <w:t xml:space="preserve"> Objetivo: seguir un plan de 6 a 12 meses: pagar a tiempo, bajar el uso de tus tarjetas, no pedir créditos seguidos, regularizar los atrasos y revisar tus dos reportes cada año.</w:t>
+      </w:r>
+    </w:p>
+    <w:p>
+      <w:pPr>
+        <w:pStyle w:val="Heading2"/>
+      </w:pPr>
+      <w:r>
+        <w:t xml:space="preserve">Módulo 8. Sal de deudas</w:t>
+      </w:r>
+    </w:p>
+    <w:p>
+      <w:r>
+        <w:rPr>
+          <w:b/>
+          <w:bCs/>
+        </w:rPr>
+        <w:t xml:space="preserve">M8 U01 · Elige tu método: avalancha o bola de nieve</w:t>
+      </w:r>
+      <w:r>
+        <w:t xml:space="preserve"> Objetivo: ordenar tus deudas por costo (avalancha) o por saldo (bola de nieve) y sostener el plan con tu mes bajo.</w:t>
+      </w:r>
+    </w:p>
+    <w:p>
+      <w:r>
+        <w:rPr>
+          <w:b/>
+          <w:bCs/>
+        </w:rPr>
+        <w:t xml:space="preserve">M8 U02 · Negociar con el banco: reestructura, convenio o quita</w:t>
+      </w:r>
+      <w:r>
+        <w:t xml:space="preserve"> Objetivo: entender cada opción, qué pedir por escrito y cómo aparece en tu historial (una quita puede dejar una clave de observación). Gancho: a Toño le ofrecen pagar 40% de su deuda "para liquidar"; no sabe qué pasará con su Buró.</w:t>
+      </w:r>
+    </w:p>
+    <w:p>
+      <w:r>
+        <w:rPr>
+          <w:b/>
+          <w:bCs/>
+        </w:rPr>
+        <w:t xml:space="preserve">M8 U03 · ¿Consolidar deudas me conviene?</w:t>
+      </w:r>
+      <w:r>
+        <w:t xml:space="preserve"> Objetivo: comparar el costo total de consolidar contra seguir pagando, y evitar volver a usar las tarjetas liberadas.</w:t>
+      </w:r>
+    </w:p>
+    <w:p>
+      <w:r>
+        <w:rPr>
+          <w:b/>
+          <w:bCs/>
+        </w:rPr>
+        <w:t xml:space="preserve">M8 U04 · Cobranza: tus derechos</w:t>
+      </w:r>
+      <w:r>
+        <w:t xml:space="preserve"> Objetivo: conocer lo que un despacho puede y no puede hacer, verificarlo en el REDECO de CONDUSEF y presentar una queja si hay abuso.</w:t>
+      </w:r>
+    </w:p>
+    <w:p>
+      <w:r>
+        <w:rPr>
+          <w:b/>
+          <w:bCs/>
+        </w:rPr>
+        <w:t xml:space="preserve">M8 U05 · Tu plan de salida con ingreso variable</w:t>
+      </w:r>
+      <w:r>
+        <w:t xml:space="preserve"> Objetivo: definir un pago base con tu mes bajo, abonar extra en meses buenos y fijar fechas de revisión.</w:t>
+      </w:r>
+    </w:p>
+    <w:p>
+      <w:pPr>
+        <w:pStyle w:val="Heading2"/>
+      </w:pPr>
+      <w:r>
+        <w:t xml:space="preserve">Módulo 9. No caigas: fraudes y robo de identidad</w:t>
+      </w:r>
+    </w:p>
+    <w:p>
+      <w:r>
+        <w:rPr>
+          <w:b/>
+          <w:bCs/>
+        </w:rPr>
+        <w:t xml:space="preserve">M9 U01 · Cómo piensa quien te quiere estafar</w:t>
+      </w:r>
+      <w:r>
+        <w:t xml:space="preserve"> Objetivo: reconocer los cuatro ganchos de casi todo fraude (urgencia, autoridad, premio y miedo) y la regla de oro: cuelga y verifica por tu cuenta. Gancho: a Valeria le llama "el área de seguridad de su banco" y le pide un código "para cancelar un cargo".</w:t>
+      </w:r>
+    </w:p>
+    <w:p>
+      <w:r>
+        <w:rPr>
+          <w:b/>
+          <w:bCs/>
+        </w:rPr>
+        <w:t xml:space="preserve">M9 U02 · Falsos castings, productoras y agencias que cobran</w:t>
+      </w:r>
+      <w:r>
+        <w:t xml:space="preserve"> Objetivo: reconocer convocatorias que cobran por audicionar, por "book" obligatorio o por inscripción, suplantan a productoras reales o piden datos de más. Verificar la empresa, el contacto y el lugar antes de ir o pagar. Gancho: Gael recibe por Instagram un "casting para una serie de plataforma" que pide 3,500 para el material fotográfico.</w:t>
+      </w:r>
+    </w:p>
+    <w:p>
+      <w:r>
+        <w:rPr>
+          <w:b/>
+          <w:bCs/>
+        </w:rPr>
+        <w:t xml:space="preserve">M9 U03 · Llamadas, mensajes y páginas falsas (phishing)</w:t>
+      </w:r>
+      <w:r>
+        <w:t xml:space="preserve"> Objetivo: identificar SMS, WhatsApp, correos y páginas que imitan a tu banco, al SAT, a paqueterías o a plataformas. Nunca compartir NIP, contraseñas, códigos de verificación ni el CVV.</w:t>
+      </w:r>
+    </w:p>
+    <w:p>
+      <w:r>
+        <w:rPr>
+          <w:b/>
+          <w:bCs/>
+        </w:rPr>
+        <w:t xml:space="preserve">M9 U04 · Robo de identidad: cuando usan tu nombre</w:t>
+      </w:r>
+      <w:r>
+        <w:t xml:space="preserve"> Objetivo: reconocer las señales (créditos que no pediste, cobranza de deudas ajenas, consultas desconocidas en tu reporte), cuidar tu INE, CURP, RFC y firma, y saber qué hacer: activar el bloqueo de Buró y las alertas (M7 U08), reclamar a la institución y ante el Buró o el Círculo, acudir a CONDUSEF y presentar denuncia. Gancho: a Toño le llega una cobranza por un préstamo que nunca pidió, abierto con una copia de su INE que dejó en un casting.</w:t>
+      </w:r>
+    </w:p>
+    <w:p>
+      <w:r>
+        <w:rPr>
+          <w:b/>
+          <w:bCs/>
+        </w:rPr>
+        <w:t xml:space="preserve">M9 U05 · Tus redes y tu teléfono: robo de cuentas y cambio de SIM</w:t>
+      </w:r>
+      <w:r>
+        <w:t xml:space="preserve"> Objetivo: proteger tus cuentas de redes (tu vitrina de trabajo) con verificación en dos pasos, correo seguro y códigos de respaldo, y proteger tu línea con un NIP de portabilidad. Qué hacer si te roban la cuenta. Gancho: a Valeria le roban su Instagram con 80,000 seguidores y piden "rescate" a sus contactos.</w:t>
+      </w:r>
+    </w:p>
+    <w:p>
+      <w:r>
+        <w:rPr>
+          <w:b/>
+          <w:bCs/>
+        </w:rPr>
+        <w:t xml:space="preserve">M9 U06 · Apps de préstamo "montadeudas" y préstamos con depósito previo</w:t>
+      </w:r>
+      <w:r>
+        <w:t xml:space="preserve"> Objetivo: reconocer apps no registradas, que piden acceso a tus contactos o fotos, o que cobran antes de prestar. Qué hacer si ya caíste: no pagar extorsiones, guardar evidencia, reportar y denunciar. Gancho: Renata pidió 3,000 en una app y ahora le exigen 7,000 y amenazan a sus contactos.</w:t>
+      </w:r>
+    </w:p>
+    <w:p>
+      <w:r>
+        <w:rPr>
+          <w:b/>
+          <w:bCs/>
+        </w:rPr>
+        <w:t xml:space="preserve">M9 U07 · Inversiones milagro y "yo te manejo tu dinero"</w:t>
+      </w:r>
+      <w:r>
+        <w:t xml:space="preserve"> Objetivo: reconocer pirámides, esquemas de referidos, criptomonedas con rendimiento "garantizado", y a personas cercanas al medio que ofrecen manejar tu dinero sin estar autorizadas. Verificar en la CNBV antes de invertir. Gancho: un productor conocido le ofrece a Gael 10% mensual por "invertir en su siguiente película".</w:t>
+      </w:r>
+    </w:p>
+    <w:p>
+      <w:r>
+        <w:rPr>
+          <w:b/>
+          <w:bCs/>
+        </w:rPr>
+        <w:t xml:space="preserve">M9 U08 · Si ya te pasó: tu plan de respuesta</w:t>
+      </w:r>
+      <w:r>
+        <w:t xml:space="preserve"> Objetivo: seguir los pasos en orden: bloquear tarjetas y accesos, llamar a tu institución por el número oficial, reclamar por escrito, reportar a CONDUSEF, denunciar ante el Ministerio Público o la policía cibernética de tu estado, y avisar a tu comunidad sin exponer tus datos. Guardar evidencia.</w:t>
+      </w:r>
+    </w:p>
+    <w:p>
+      <w:pPr>
+        <w:pStyle w:val="Heading2"/>
+      </w:pPr>
+      <w:r>
+        <w:t xml:space="preserve">Módulo 10. Protección y prevención</w:t>
+      </w:r>
+    </w:p>
+    <w:p>
+      <w:r>
+        <w:rPr>
+          <w:b/>
+          <w:bCs/>
+        </w:rPr>
+        <w:t xml:space="preserve">M10 U01 · Sin seguro de empresa: el Seguro de Gastos Médicos Mayores</w:t>
+      </w:r>
+      <w:r>
+        <w:t xml:space="preserve"> Objetivo: comparar suma asegurada, deducible, coaseguro, tabulador y exclusiones.</w:t>
+      </w:r>
+    </w:p>
+    <w:p>
+      <w:r>
+        <w:rPr>
+          <w:b/>
+          <w:bCs/>
+        </w:rPr>
+        <w:t xml:space="preserve">M10 U02 · IMSS Modalidad 10: seguridad social para independientes</w:t>
+      </w:r>
+      <w:r>
+        <w:t xml:space="preserve"> Objetivo: conocer la Modalidad 10 (incorporación voluntaria al régimen obligatorio para personas trabajadoras independientes), que desde la reforma de diciembre de 2023 es un derecho permanente: atención médica, incapacidades, invalidez y vida, retiro en tu AFORE y aportaciones a Infonavit. La cuota depende del ingreso que registres; se calcula con la calculadora del IMSS. Conocer también los servicios de salud de ANDA para sus agremiados. [POR CONFIRMAR: cuotas 2026 y servicios de ANDA] Gancho: Gael lleva seis años sin IMSS desde su último contrato de nómina.</w:t>
+      </w:r>
+    </w:p>
+    <w:p>
+      <w:r>
+        <w:rPr>
+          <w:b/>
+          <w:bCs/>
+        </w:rPr>
+        <w:t xml:space="preserve">M10 U03 · Si no puedes trabajar: incapacidad, invalidez y accidentes</w:t>
+      </w:r>
+      <w:r>
+        <w:t xml:space="preserve"> Objetivo: proteger tu ingreso si una lesión o enfermedad te impide grabar, cantar o bailar. Qué cubren los seguros de accidentes e incapacidad y qué preguntar sobre coberturas especiales de voz o cuerpo.</w:t>
+      </w:r>
+    </w:p>
+    <w:p>
+      <w:r>
+        <w:rPr>
+          <w:b/>
+          <w:bCs/>
+        </w:rPr>
+        <w:t xml:space="preserve">M10 U04 · Seguro de vida y beneficiarios</w:t>
+      </w:r>
+      <w:r>
+        <w:t xml:space="preserve"> Objetivo: decidir si lo necesitas, cuánto y a quién nombrar. Actualizar beneficiarios en tu cuenta, tu AFORE y tus seguros.</w:t>
+      </w:r>
+    </w:p>
+    <w:p>
+      <w:r>
+        <w:rPr>
+          <w:b/>
+          <w:bCs/>
+        </w:rPr>
+        <w:t xml:space="preserve">M10 U05 · Protege tu nombre y tu marca</w:t>
+      </w:r>
+      <w:r>
+        <w:t xml:space="preserve"> Objetivo: tramitar la reserva de derechos al uso exclusivo de tu nombre artístico ante INDAUTOR y el registro de marca ante el IMPI (buscador MarcaNET).</w:t>
+      </w:r>
+    </w:p>
+    <w:p>
+      <w:r>
+        <w:rPr>
+          <w:b/>
+          <w:bCs/>
+        </w:rPr>
+        <w:t xml:space="preserve">M10 U06 · Testamento y documentos para tu familia</w:t>
+      </w:r>
+      <w:r>
+        <w:t xml:space="preserve"> Objetivo: hacer tu testamento (en septiembre, el Mes del Testamento suele bajar costos), ordenar tus documentos y dejar instrucciones sobre tus regalías y derechos.</w:t>
+      </w:r>
+    </w:p>
+    <w:p>
+      <w:pPr>
+        <w:pStyle w:val="Heading2"/>
+      </w:pPr>
+      <w:r>
+        <w:t xml:space="preserve">Módulo 11. Tu futuro</w:t>
+      </w:r>
+    </w:p>
+    <w:p>
+      <w:r>
+        <w:rPr>
+          <w:b/>
+          <w:bCs/>
+        </w:rPr>
+        <w:t xml:space="preserve">M11 U01 · Llegó un pago gordo: repártelo antes de gastarlo</w:t>
+      </w:r>
+      <w:r>
+        <w:t xml:space="preserve"> Objetivo: aplicar un reparto inmediato: primero impuestos (según tu régimen), luego deudas caras, fondo de sequía, retiro y una parte para disfrutar. Gancho: Valeria cobra 400,000 por una campaña; hace un año gastó una cantidad parecida en tres meses.</w:t>
+      </w:r>
+    </w:p>
+    <w:p>
+      <w:r>
+        <w:rPr>
+          <w:b/>
+          <w:bCs/>
+        </w:rPr>
+        <w:t xml:space="preserve">M11 U02 · Tu AFORE: encuéntrala y súmale</w:t>
+      </w:r>
+      <w:r>
+        <w:t xml:space="preserve"> Objetivo: localizar tu AFORE con tu CURP (e-SAR o AforeMóvil), actualizar beneficiarios y hacer aportaciones voluntarias.</w:t>
+      </w:r>
+    </w:p>
+    <w:p>
+      <w:r>
+        <w:rPr>
+          <w:b/>
+          <w:bCs/>
+        </w:rPr>
+        <w:t xml:space="preserve">M11 U03 · Modalidad 40: si cotizaste antes de julio de 1997</w:t>
+      </w:r>
+      <w:r>
+        <w:t xml:space="preserve"> Objetivo: conocer la continuación voluntaria del IMSS (Modalidad 40) para personas de la Ley 73, que permite seguir sumando semanas y mejorar el salario con que se calcula la pensión. Requisitos: haber cotizado al menos 52 semanas en los últimos cinco años antes de la baja, pedirla dentro de los cinco años siguientes a la baja y no estar dado de alta como trabajador en ese momento. Costo 2026: 14.438% del salario que elijas, con tope de 25 UMA diarias. El IMSS endureció los controles en 2026. [POR CONFIRMAR: porcentaje y reglas vigentes] Diferencia con la Modalidad 10: la 10 es para quien trabaja por su cuenta hoy y te da servicio médico; la 40 es para quien ya no cotiza y quiere mejorar su pensión, y no incluye servicio médico. Gancho: Toño trabajó con nómina en una disquera de 1994 a 2021 y no sabe si le conviene la Modalidad 40 o la 10.</w:t>
+      </w:r>
+    </w:p>
+    <w:p>
+      <w:r>
+        <w:rPr>
+          <w:b/>
+          <w:bCs/>
+        </w:rPr>
+        <w:t xml:space="preserve">M11 U04 · Plan Personal de Retiro (PPR) y aportaciones deducibles</w:t>
+      </w:r>
+      <w:r>
+        <w:t xml:space="preserve"> Objetivo: conocer el PPR y las aportaciones voluntarias deducibles (artículo 151 de la LISR, con límite). Saber que la deducción aplica a quien presenta declaración anual por sueldos, asimilados o actividad empresarial, no a los ingresos de RESICO. Comparar comisiones y rendimiento.</w:t>
+      </w:r>
+    </w:p>
+    <w:p>
+      <w:r>
+        <w:rPr>
+          <w:b/>
+          <w:bCs/>
+        </w:rPr>
+        <w:t xml:space="preserve">M11 U05 · Invertir a largo plazo sin especular</w:t>
+      </w:r>
+      <w:r>
+        <w:t xml:space="preserve"> Objetivo: entender riesgo, plazo, diversificación y comisiones, y verificar que el intermediario esté autorizado. Qué es un fondo de inversión o un ETF y por qué no se usa para el fondo de sequía.</w:t>
+      </w:r>
+    </w:p>
+    <w:p>
+      <w:r>
+        <w:rPr>
+          <w:b/>
+          <w:bCs/>
+        </w:rPr>
+        <w:t xml:space="preserve">M11 U06 · Vivienda: rentar, comprar o esperar</w:t>
+      </w:r>
+      <w:r>
+        <w:t xml:space="preserve"> Objetivo: comparar el costo total de comprar (enganche, gastos notariales, avalúo, seguros) contra rentar, y conocer las opciones de crédito para personas independientes. [POR CONFIRMAR: opciones de Infonavit para personas no asalariadas]</w:t>
+      </w:r>
+    </w:p>
+    <w:p>
+      <w:r>
+        <w:rPr>
+          <w:b/>
+          <w:bCs/>
+        </w:rPr>
+        <w:t xml:space="preserve">M11 U07 · Ingresos fuera de cámara</w:t>
+      </w:r>
+      <w:r>
+        <w:t xml:space="preserve"> Objetivo: diversificar con clases, talleres, producción, marcas propias o consultoría, y calcular si un negocio paralelo realmente te deja ganancia.</w:t>
+      </w:r>
+    </w:p>
+    <w:p>
+      <w:r>
+        <w:rPr>
+          <w:b/>
+          <w:bCs/>
+        </w:rPr>
+        <w:t xml:space="preserve">M11 U08 · Tu carrera larga</w:t>
+      </w:r>
+      <w:r>
+        <w:t xml:space="preserve"> Objetivo: planear las etapas de tu carrera (formación, crecimiento, madurez y transición) y lo que necesitas en cada una.</w:t>
+      </w:r>
+    </w:p>
+    <w:p>
+      <w:r>
+        <w:rPr>
+          <w:b/>
+          <w:bCs/>
+        </w:rPr>
+        <w:t xml:space="preserve">M11 U09 · Tu plan de una página</w:t>
+      </w:r>
+      <w:r>
+        <w:t xml:space="preserve"> Objetivo: reunir tus números, deudas, reserva, protección, metas y tres acciones con fecha.</w:t>
+      </w:r>
+    </w:p>
+    <w:p>
+      <w:r>
+        <w:br w:type="page"/>
+      </w:r>
+    </w:p>
+    <w:p>
+      <w:pPr>
+        <w:pStyle w:val="Heading1"/>
+      </w:pPr>
+      <w:r>
+        <w:t xml:space="preserve">4. Qué cambió respecto a la versión 1</w:t>
+      </w:r>
+    </w:p>
+    <w:tbl>
+      <w:tblPr>
+        <w:tblW w:type="dxa" w:w="9640"/>
+        <w:tblBorders>
+          <w:top w:val="single" w:color="B7C9C0" w:sz="4"/>
+          <w:left w:val="single" w:color="B7C9C0" w:sz="4"/>
+          <w:bottom w:val="single" w:color="B7C9C0" w:sz="4"/>
+          <w:right w:val="single" w:color="B7C9C0" w:sz="4"/>
+          <w:insideH w:val="single" w:color="B7C9C0" w:sz="4"/>
+          <w:insideV w:val="single" w:color="B7C9C0" w:sz="4"/>
+        </w:tblBorders>
+      </w:tblPr>
+      <w:tblGrid>
+        <w:gridCol w:w="3213"/>
+        <w:gridCol w:w="3213"/>
+        <w:gridCol w:w="3214"/>
+      </w:tblGrid>
+      <w:tr>
+        <w:trPr>
+          <w:tblHeader/>
+        </w:trPr>
+        <w:tc>
+          <w:tcPr>
+            <w:tcW w:type="dxa" w:w="3213"/>
+            <w:shd w:fill="1F5C4A" w:color="auto" w:val="clear"/>
+            <w:tcMar>
+              <w:top w:type="dxa" w:w="60"/>
+              <w:left w:type="dxa" w:w="90"/>
+              <w:bottom w:type="dxa" w:w="60"/>
+              <w:right w:type="dxa" w:w="90"/>
+            </w:tcMar>
+          </w:tcPr>
+          <w:p>
+            <w:r>
+              <w:rPr>
+                <w:b/>
+                <w:bCs/>
+                <w:color w:val="FFFFFF"/>
+                <w:sz w:val="18"/>
+                <w:szCs w:val="18"/>
+              </w:rPr>
+              <w:t xml:space="preserve">Tema</w:t>
+            </w:r>
+          </w:p>
+        </w:tc>
+        <w:tc>
+          <w:tcPr>
+            <w:tcW w:type="dxa" w:w="3213"/>
+            <w:shd w:fill="1F5C4A" w:color="auto" w:val="clear"/>
+            <w:tcMar>
+              <w:top w:type="dxa" w:w="60"/>
+              <w:left w:type="dxa" w:w="90"/>
+              <w:bottom w:type="dxa" w:w="60"/>
+              <w:right w:type="dxa" w:w="90"/>
+            </w:tcMar>
+          </w:tcPr>
+          <w:p>
+            <w:r>
+              <w:rPr>
+                <w:b/>
+                <w:bCs/>
+                <w:color w:val="FFFFFF"/>
+                <w:sz w:val="18"/>
+                <w:szCs w:val="18"/>
+              </w:rPr>
+              <w:t xml:space="preserve">Versión 1</w:t>
+            </w:r>
+          </w:p>
+        </w:tc>
+        <w:tc>
+          <w:tcPr>
+            <w:tcW w:type="dxa" w:w="3214"/>
+            <w:shd w:fill="1F5C4A" w:color="auto" w:val="clear"/>
+            <w:tcMar>
+              <w:top w:type="dxa" w:w="60"/>
+              <w:left w:type="dxa" w:w="90"/>
+              <w:bottom w:type="dxa" w:w="60"/>
+              <w:right w:type="dxa" w:w="90"/>
+            </w:tcMar>
+          </w:tcPr>
+          <w:p>
+            <w:r>
+              <w:rPr>
+                <w:b/>
+                <w:bCs/>
+                <w:color w:val="FFFFFF"/>
+                <w:sz w:val="18"/>
+                <w:szCs w:val="18"/>
+              </w:rPr>
               <w:t xml:space="preserve">Versión 2</w:t>
             </w:r>
           </w:p>
@@ -3622,7 +4489,7 @@
                 <w:sz w:val="18"/>
                 <w:szCs w:val="18"/>
               </w:rPr>
-              <w:t xml:space="preserve">"Modalidad 10"</w:t>
+              <w:t xml:space="preserve">Modalidad 10 sin detalle</w:t>
             </w:r>
           </w:p>
         </w:tc>
@@ -3642,7 +4509,7 @@
                 <w:sz w:val="18"/>
                 <w:szCs w:val="18"/>
               </w:rPr>
-              <w:t xml:space="preserve">Incorporación voluntaria de trabajadores independientes [POR CONFIRMAR la modalidad]</w:t>
+              <w:t xml:space="preserve">Modalidad 10 en protección (M10 U02) y Modalidad 40 en futuro (M11 U03)</w:t>
             </w:r>
           </w:p>
         </w:tc>
@@ -3707,7 +4574,137 @@
                 <w:sz w:val="18"/>
                 <w:szCs w:val="18"/>
               </w:rPr>
-              <w:t xml:space="preserve">ANDI, SACM, EJE y SOMEXFON; ANDA es sindicato</w:t>
+              <w:t xml:space="preserve">Organizaciones mexicanas: ANDA (sindicato), ANDI, SACM, EJE y SOMEXFON</w:t>
+            </w:r>
+          </w:p>
+        </w:tc>
+      </w:tr>
+      <w:tr>
+        <w:trPr>
+          <w:tblHeader w:val="off"/>
+        </w:trPr>
+        <w:tc>
+          <w:tcPr>
+            <w:tcW w:type="dxa" w:w="3213"/>
+            <w:tcMar>
+              <w:top w:type="dxa" w:w="60"/>
+              <w:left w:type="dxa" w:w="90"/>
+              <w:bottom w:type="dxa" w:w="60"/>
+              <w:right w:type="dxa" w:w="90"/>
+            </w:tcMar>
+          </w:tcPr>
+          <w:p>
+            <w:r>
+              <w:rPr>
+                <w:sz w:val="18"/>
+                <w:szCs w:val="18"/>
+              </w:rPr>
+              <w:t xml:space="preserve">Buró</w:t>
+            </w:r>
+          </w:p>
+        </w:tc>
+        <w:tc>
+          <w:tcPr>
+            <w:tcW w:type="dxa" w:w="3213"/>
+            <w:tcMar>
+              <w:top w:type="dxa" w:w="60"/>
+              <w:left w:type="dxa" w:w="90"/>
+              <w:bottom w:type="dxa" w:w="60"/>
+              <w:right w:type="dxa" w:w="90"/>
+            </w:tcMar>
+          </w:tcPr>
+          <w:p>
+            <w:r>
+              <w:rPr>
+                <w:sz w:val="18"/>
+                <w:szCs w:val="18"/>
+              </w:rPr>
+              <w:t xml:space="preserve">Una lección</w:t>
+            </w:r>
+          </w:p>
+        </w:tc>
+        <w:tc>
+          <w:tcPr>
+            <w:tcW w:type="dxa" w:w="3214"/>
+            <w:tcMar>
+              <w:top w:type="dxa" w:w="60"/>
+              <w:left w:type="dxa" w:w="90"/>
+              <w:bottom w:type="dxa" w:w="60"/>
+              <w:right w:type="dxa" w:w="90"/>
+            </w:tcMar>
+          </w:tcPr>
+          <w:p>
+            <w:r>
+              <w:rPr>
+                <w:sz w:val="18"/>
+                <w:szCs w:val="18"/>
+              </w:rPr>
+              <w:t xml:space="preserve">Módulo de 10 lecciones: Buró vs. Círculo, reportes gratis, plazos, reclamaciones, bloqueo y alertas</w:t>
+            </w:r>
+          </w:p>
+        </w:tc>
+      </w:tr>
+      <w:tr>
+        <w:trPr>
+          <w:tblHeader w:val="off"/>
+        </w:trPr>
+        <w:tc>
+          <w:tcPr>
+            <w:tcW w:type="dxa" w:w="3213"/>
+            <w:tcMar>
+              <w:top w:type="dxa" w:w="60"/>
+              <w:left w:type="dxa" w:w="90"/>
+              <w:bottom w:type="dxa" w:w="60"/>
+              <w:right w:type="dxa" w:w="90"/>
+            </w:tcMar>
+          </w:tcPr>
+          <w:p>
+            <w:r>
+              <w:rPr>
+                <w:sz w:val="18"/>
+                <w:szCs w:val="18"/>
+              </w:rPr>
+              <w:t xml:space="preserve">RESICO</w:t>
+            </w:r>
+          </w:p>
+        </w:tc>
+        <w:tc>
+          <w:tcPr>
+            <w:tcW w:type="dxa" w:w="3213"/>
+            <w:tcMar>
+              <w:top w:type="dxa" w:w="60"/>
+              <w:left w:type="dxa" w:w="90"/>
+              <w:bottom w:type="dxa" w:w="60"/>
+              <w:right w:type="dxa" w:w="90"/>
+            </w:tcMar>
+          </w:tcPr>
+          <w:p>
+            <w:r>
+              <w:rPr>
+                <w:sz w:val="18"/>
+                <w:szCs w:val="18"/>
+              </w:rPr>
+              <w:t xml:space="preserve">Sin exclusiones</w:t>
+            </w:r>
+          </w:p>
+        </w:tc>
+        <w:tc>
+          <w:tcPr>
+            <w:tcW w:type="dxa" w:w="3214"/>
+            <w:tcMar>
+              <w:top w:type="dxa" w:w="60"/>
+              <w:left w:type="dxa" w:w="90"/>
+              <w:bottom w:type="dxa" w:w="60"/>
+              <w:right w:type="dxa" w:w="90"/>
+            </w:tcMar>
+          </w:tcPr>
+          <w:p>
+            <w:r>
+              <w:rPr>
+                <w:sz w:val="18"/>
+                <w:szCs w:val="18"/>
+              </w:rPr>
+              <w:t xml:space="preserve">Exclusión por asimilados, sin deducciones personales, declaración anual según RMF</w:t>
             </w:r>
           </w:p>
         </w:tc>
@@ -5428,6 +6425,136 @@
                 <w:sz w:val="18"/>
                 <w:szCs w:val="18"/>
               </w:rPr>
+              <w:t xml:space="preserve">Reporte de Crédito Especial, reclamaciones, Bloqueo y Alertas Buró</w:t>
+            </w:r>
+          </w:p>
+        </w:tc>
+      </w:tr>
+      <w:tr>
+        <w:trPr>
+          <w:tblHeader w:val="off"/>
+        </w:trPr>
+        <w:tc>
+          <w:tcPr>
+            <w:tcW w:type="dxa" w:w="3213"/>
+            <w:tcMar>
+              <w:top w:type="dxa" w:w="60"/>
+              <w:left w:type="dxa" w:w="90"/>
+              <w:bottom w:type="dxa" w:w="60"/>
+              <w:right w:type="dxa" w:w="90"/>
+            </w:tcMar>
+          </w:tcPr>
+          <w:p>
+            <w:r>
+              <w:rPr>
+                <w:sz w:val="18"/>
+                <w:szCs w:val="18"/>
+              </w:rPr>
+              <w:t xml:space="preserve">Policía cibernética</w:t>
+            </w:r>
+          </w:p>
+        </w:tc>
+        <w:tc>
+          <w:tcPr>
+            <w:tcW w:type="dxa" w:w="3213"/>
+            <w:tcMar>
+              <w:top w:type="dxa" w:w="60"/>
+              <w:left w:type="dxa" w:w="90"/>
+              <w:bottom w:type="dxa" w:w="60"/>
+              <w:right w:type="dxa" w:w="90"/>
+            </w:tcMar>
+          </w:tcPr>
+          <w:p>
+            <w:r>
+              <w:rPr>
+                <w:sz w:val="18"/>
+                <w:szCs w:val="18"/>
+              </w:rPr>
+              <w:t xml:space="preserve">[POR CONFIRMAR: contacto de la policía cibernética de cada estado]</w:t>
+            </w:r>
+          </w:p>
+        </w:tc>
+        <w:tc>
+          <w:tcPr>
+            <w:tcW w:type="dxa" w:w="3214"/>
+            <w:tcMar>
+              <w:top w:type="dxa" w:w="60"/>
+              <w:left w:type="dxa" w:w="90"/>
+              <w:bottom w:type="dxa" w:w="60"/>
+              <w:right w:type="dxa" w:w="90"/>
+            </w:tcMar>
+          </w:tcPr>
+          <w:p>
+            <w:r>
+              <w:rPr>
+                <w:sz w:val="18"/>
+                <w:szCs w:val="18"/>
+              </w:rPr>
+              <w:t xml:space="preserve">Reportar fraudes en línea y robo de cuentas</w:t>
+            </w:r>
+          </w:p>
+        </w:tc>
+      </w:tr>
+      <w:tr>
+        <w:trPr>
+          <w:tblHeader w:val="off"/>
+        </w:trPr>
+        <w:tc>
+          <w:tcPr>
+            <w:tcW w:type="dxa" w:w="3213"/>
+            <w:tcMar>
+              <w:top w:type="dxa" w:w="60"/>
+              <w:left w:type="dxa" w:w="90"/>
+              <w:bottom w:type="dxa" w:w="60"/>
+              <w:right w:type="dxa" w:w="90"/>
+            </w:tcMar>
+          </w:tcPr>
+          <w:p>
+            <w:r>
+              <w:rPr>
+                <w:sz w:val="18"/>
+                <w:szCs w:val="18"/>
+              </w:rPr>
+              <w:t xml:space="preserve">Círculo de Crédito</w:t>
+            </w:r>
+          </w:p>
+        </w:tc>
+        <w:tc>
+          <w:tcPr>
+            <w:tcW w:type="dxa" w:w="3213"/>
+            <w:tcMar>
+              <w:top w:type="dxa" w:w="60"/>
+              <w:left w:type="dxa" w:w="90"/>
+              <w:bottom w:type="dxa" w:w="60"/>
+              <w:right w:type="dxa" w:w="90"/>
+            </w:tcMar>
+          </w:tcPr>
+          <w:p>
+            <w:r>
+              <w:rPr>
+                <w:sz w:val="18"/>
+                <w:szCs w:val="18"/>
+              </w:rPr>
+              <w:t xml:space="preserve">https://www.circulodecredito.com.mx</w:t>
+            </w:r>
+          </w:p>
+        </w:tc>
+        <w:tc>
+          <w:tcPr>
+            <w:tcW w:type="dxa" w:w="3214"/>
+            <w:tcMar>
+              <w:top w:type="dxa" w:w="60"/>
+              <w:left w:type="dxa" w:w="90"/>
+              <w:bottom w:type="dxa" w:w="60"/>
+              <w:right w:type="dxa" w:w="90"/>
+            </w:tcMar>
+          </w:tcPr>
+          <w:p>
+            <w:r>
+              <w:rPr>
+                <w:sz w:val="18"/>
+                <w:szCs w:val="18"/>
+              </w:rPr>
               <w:t xml:space="preserve">Reporte de crédito especial y reclamaciones</w:t>
             </w:r>
           </w:p>
@@ -5453,27 +6580,27 @@
                 <w:sz w:val="18"/>
                 <w:szCs w:val="18"/>
               </w:rPr>
-              <w:t xml:space="preserve">Policía cibernética</w:t>
-            </w:r>
-          </w:p>
-        </w:tc>
-        <w:tc>
-          <w:tcPr>
-            <w:tcW w:type="dxa" w:w="3213"/>
-            <w:tcMar>
-              <w:top w:type="dxa" w:w="60"/>
-              <w:left w:type="dxa" w:w="90"/>
-              <w:bottom w:type="dxa" w:w="60"/>
-              <w:right w:type="dxa" w:w="90"/>
-            </w:tcMar>
-          </w:tcPr>
-          <w:p>
-            <w:r>
-              <w:rPr>
-                <w:sz w:val="18"/>
-                <w:szCs w:val="18"/>
-              </w:rPr>
-              <w:t xml:space="preserve">[POR CONFIRMAR: contacto de la policía cibernética de cada estado]</w:t>
+              <w:t xml:space="preserve">Cetesdirecto</w:t>
+            </w:r>
+          </w:p>
+        </w:tc>
+        <w:tc>
+          <w:tcPr>
+            <w:tcW w:type="dxa" w:w="3213"/>
+            <w:tcMar>
+              <w:top w:type="dxa" w:w="60"/>
+              <w:left w:type="dxa" w:w="90"/>
+              <w:bottom w:type="dxa" w:w="60"/>
+              <w:right w:type="dxa" w:w="90"/>
+            </w:tcMar>
+          </w:tcPr>
+          <w:p>
+            <w:r>
+              <w:rPr>
+                <w:sz w:val="18"/>
+                <w:szCs w:val="18"/>
+              </w:rPr>
+              <w:t xml:space="preserve">https://www.cetesdirecto.com</w:t>
             </w:r>
           </w:p>
         </w:tc>
@@ -5493,7 +6620,7 @@
                 <w:sz w:val="18"/>
                 <w:szCs w:val="18"/>
               </w:rPr>
-              <w:t xml:space="preserve">Reportar fraudes en línea y robo de cuentas</w:t>
+              <w:t xml:space="preserve">Cuenta sin comisiones, BONDDIA y Cetes</w:t>
             </w:r>
           </w:p>
         </w:tc>
@@ -5518,27 +6645,27 @@
                 <w:sz w:val="18"/>
                 <w:szCs w:val="18"/>
               </w:rPr>
-              <w:t xml:space="preserve">Círculo de Crédito</w:t>
-            </w:r>
-          </w:p>
-        </w:tc>
-        <w:tc>
-          <w:tcPr>
-            <w:tcW w:type="dxa" w:w="3213"/>
-            <w:tcMar>
-              <w:top w:type="dxa" w:w="60"/>
-              <w:left w:type="dxa" w:w="90"/>
-              <w:bottom w:type="dxa" w:w="60"/>
-              <w:right w:type="dxa" w:w="90"/>
-            </w:tcMar>
-          </w:tcPr>
-          <w:p>
-            <w:r>
-              <w:rPr>
-                <w:sz w:val="18"/>
-                <w:szCs w:val="18"/>
-              </w:rPr>
-              <w:t xml:space="preserve">https://www.circulodecredito.com.mx</w:t>
+              <w:t xml:space="preserve">CONSAR y e-SAR</w:t>
+            </w:r>
+          </w:p>
+        </w:tc>
+        <w:tc>
+          <w:tcPr>
+            <w:tcW w:type="dxa" w:w="3213"/>
+            <w:tcMar>
+              <w:top w:type="dxa" w:w="60"/>
+              <w:left w:type="dxa" w:w="90"/>
+              <w:bottom w:type="dxa" w:w="60"/>
+              <w:right w:type="dxa" w:w="90"/>
+            </w:tcMar>
+          </w:tcPr>
+          <w:p>
+            <w:r>
+              <w:rPr>
+                <w:sz w:val="18"/>
+                <w:szCs w:val="18"/>
+              </w:rPr>
+              <w:t xml:space="preserve">https://www.e-sar.com.mx</w:t>
             </w:r>
           </w:p>
         </w:tc>
@@ -5558,7 +6685,7 @@
                 <w:sz w:val="18"/>
                 <w:szCs w:val="18"/>
               </w:rPr>
-              <w:t xml:space="preserve">Reporte de crédito especial y reclamaciones</w:t>
+              <w:t xml:space="preserve">Localiza tu AFORE con tu CURP</w:t>
             </w:r>
           </w:p>
         </w:tc>
@@ -5583,27 +6710,27 @@
                 <w:sz w:val="18"/>
                 <w:szCs w:val="18"/>
               </w:rPr>
-              <w:t xml:space="preserve">Cetesdirecto</w:t>
-            </w:r>
-          </w:p>
-        </w:tc>
-        <w:tc>
-          <w:tcPr>
-            <w:tcW w:type="dxa" w:w="3213"/>
-            <w:tcMar>
-              <w:top w:type="dxa" w:w="60"/>
-              <w:left w:type="dxa" w:w="90"/>
-              <w:bottom w:type="dxa" w:w="60"/>
-              <w:right w:type="dxa" w:w="90"/>
-            </w:tcMar>
-          </w:tcPr>
-          <w:p>
-            <w:r>
-              <w:rPr>
-                <w:sz w:val="18"/>
-                <w:szCs w:val="18"/>
-              </w:rPr>
-              <w:t xml:space="preserve">https://www.cetesdirecto.com</w:t>
+              <w:t xml:space="preserve">IMSS</w:t>
+            </w:r>
+          </w:p>
+        </w:tc>
+        <w:tc>
+          <w:tcPr>
+            <w:tcW w:type="dxa" w:w="3213"/>
+            <w:tcMar>
+              <w:top w:type="dxa" w:w="60"/>
+              <w:left w:type="dxa" w:w="90"/>
+              <w:bottom w:type="dxa" w:w="60"/>
+              <w:right w:type="dxa" w:w="90"/>
+            </w:tcMar>
+          </w:tcPr>
+          <w:p>
+            <w:r>
+              <w:rPr>
+                <w:sz w:val="18"/>
+                <w:szCs w:val="18"/>
+              </w:rPr>
+              <w:t xml:space="preserve">https://www.imss.gob.mx/personas-trabajadoras-independientes</w:t>
             </w:r>
           </w:p>
         </w:tc>
@@ -5623,7 +6750,7 @@
                 <w:sz w:val="18"/>
                 <w:szCs w:val="18"/>
               </w:rPr>
-              <w:t xml:space="preserve">Cuenta sin comisiones, BONDDIA y Cetes</w:t>
+              <w:t xml:space="preserve">Modalidad 10 y su calculadora; trámite de Modalidad 40 (IMSS-02-007)</w:t>
             </w:r>
           </w:p>
         </w:tc>
@@ -5648,27 +6775,27 @@
                 <w:sz w:val="18"/>
                 <w:szCs w:val="18"/>
               </w:rPr>
-              <w:t xml:space="preserve">CONSAR y e-SAR</w:t>
-            </w:r>
-          </w:p>
-        </w:tc>
-        <w:tc>
-          <w:tcPr>
-            <w:tcW w:type="dxa" w:w="3213"/>
-            <w:tcMar>
-              <w:top w:type="dxa" w:w="60"/>
-              <w:left w:type="dxa" w:w="90"/>
-              <w:bottom w:type="dxa" w:w="60"/>
-              <w:right w:type="dxa" w:w="90"/>
-            </w:tcMar>
-          </w:tcPr>
-          <w:p>
-            <w:r>
-              <w:rPr>
-                <w:sz w:val="18"/>
-                <w:szCs w:val="18"/>
-              </w:rPr>
-              <w:t xml:space="preserve">https://www.e-sar.com.mx</w:t>
+              <w:t xml:space="preserve">INDAUTOR</w:t>
+            </w:r>
+          </w:p>
+        </w:tc>
+        <w:tc>
+          <w:tcPr>
+            <w:tcW w:type="dxa" w:w="3213"/>
+            <w:tcMar>
+              <w:top w:type="dxa" w:w="60"/>
+              <w:left w:type="dxa" w:w="90"/>
+              <w:bottom w:type="dxa" w:w="60"/>
+              <w:right w:type="dxa" w:w="90"/>
+            </w:tcMar>
+          </w:tcPr>
+          <w:p>
+            <w:r>
+              <w:rPr>
+                <w:sz w:val="18"/>
+                <w:szCs w:val="18"/>
+              </w:rPr>
+              <w:t xml:space="preserve">https://www.indautor.gob.mx</w:t>
             </w:r>
           </w:p>
         </w:tc>
@@ -5688,7 +6815,7 @@
                 <w:sz w:val="18"/>
                 <w:szCs w:val="18"/>
               </w:rPr>
-              <w:t xml:space="preserve">Localiza tu AFORE con tu CURP</w:t>
+              <w:t xml:space="preserve">Reserva de derechos para nombre artístico</w:t>
             </w:r>
           </w:p>
         </w:tc>
@@ -5713,27 +6840,27 @@
                 <w:sz w:val="18"/>
                 <w:szCs w:val="18"/>
               </w:rPr>
-              <w:t xml:space="preserve">IMSS</w:t>
-            </w:r>
-          </w:p>
-        </w:tc>
-        <w:tc>
-          <w:tcPr>
-            <w:tcW w:type="dxa" w:w="3213"/>
-            <w:tcMar>
-              <w:top w:type="dxa" w:w="60"/>
-              <w:left w:type="dxa" w:w="90"/>
-              <w:bottom w:type="dxa" w:w="60"/>
-              <w:right w:type="dxa" w:w="90"/>
-            </w:tcMar>
-          </w:tcPr>
-          <w:p>
-            <w:r>
-              <w:rPr>
-                <w:sz w:val="18"/>
-                <w:szCs w:val="18"/>
-              </w:rPr>
-              <w:t xml:space="preserve">https://www.imss.gob.mx</w:t>
+              <w:t xml:space="preserve">IMPI</w:t>
+            </w:r>
+          </w:p>
+        </w:tc>
+        <w:tc>
+          <w:tcPr>
+            <w:tcW w:type="dxa" w:w="3213"/>
+            <w:tcMar>
+              <w:top w:type="dxa" w:w="60"/>
+              <w:left w:type="dxa" w:w="90"/>
+              <w:bottom w:type="dxa" w:w="60"/>
+              <w:right w:type="dxa" w:w="90"/>
+            </w:tcMar>
+          </w:tcPr>
+          <w:p>
+            <w:r>
+              <w:rPr>
+                <w:sz w:val="18"/>
+                <w:szCs w:val="18"/>
+              </w:rPr>
+              <w:t xml:space="preserve">https://www.gob.mx/impi</w:t>
             </w:r>
           </w:p>
         </w:tc>
@@ -5753,7 +6880,7 @@
                 <w:sz w:val="18"/>
                 <w:szCs w:val="18"/>
               </w:rPr>
-              <w:t xml:space="preserve">Personas trabajadoras independientes</w:t>
+              <w:t xml:space="preserve">MarcaNET y registro de marca</w:t>
             </w:r>
           </w:p>
         </w:tc>
@@ -5778,27 +6905,27 @@
                 <w:sz w:val="18"/>
                 <w:szCs w:val="18"/>
               </w:rPr>
-              <w:t xml:space="preserve">INDAUTOR</w:t>
-            </w:r>
-          </w:p>
-        </w:tc>
-        <w:tc>
-          <w:tcPr>
-            <w:tcW w:type="dxa" w:w="3213"/>
-            <w:tcMar>
-              <w:top w:type="dxa" w:w="60"/>
-              <w:left w:type="dxa" w:w="90"/>
-              <w:bottom w:type="dxa" w:w="60"/>
-              <w:right w:type="dxa" w:w="90"/>
-            </w:tcMar>
-          </w:tcPr>
-          <w:p>
-            <w:r>
-              <w:rPr>
-                <w:sz w:val="18"/>
-                <w:szCs w:val="18"/>
-              </w:rPr>
-              <w:t xml:space="preserve">https://www.indautor.gob.mx</w:t>
+              <w:t xml:space="preserve">ANDI</w:t>
+            </w:r>
+          </w:p>
+        </w:tc>
+        <w:tc>
+          <w:tcPr>
+            <w:tcW w:type="dxa" w:w="3213"/>
+            <w:tcMar>
+              <w:top w:type="dxa" w:w="60"/>
+              <w:left w:type="dxa" w:w="90"/>
+              <w:bottom w:type="dxa" w:w="60"/>
+              <w:right w:type="dxa" w:w="90"/>
+            </w:tcMar>
+          </w:tcPr>
+          <w:p>
+            <w:r>
+              <w:rPr>
+                <w:sz w:val="18"/>
+                <w:szCs w:val="18"/>
+              </w:rPr>
+              <w:t xml:space="preserve">https://www.andi.org.mx</w:t>
             </w:r>
           </w:p>
         </w:tc>
@@ -5818,7 +6945,7 @@
                 <w:sz w:val="18"/>
                 <w:szCs w:val="18"/>
               </w:rPr>
-              <w:t xml:space="preserve">Reserva de derechos para nombre artístico</w:t>
+              <w:t xml:space="preserve">Afiliación y regalías de intérpretes</w:t>
             </w:r>
           </w:p>
         </w:tc>
@@ -5843,27 +6970,27 @@
                 <w:sz w:val="18"/>
                 <w:szCs w:val="18"/>
               </w:rPr>
-              <w:t xml:space="preserve">IMPI</w:t>
-            </w:r>
-          </w:p>
-        </w:tc>
-        <w:tc>
-          <w:tcPr>
-            <w:tcW w:type="dxa" w:w="3213"/>
-            <w:tcMar>
-              <w:top w:type="dxa" w:w="60"/>
-              <w:left w:type="dxa" w:w="90"/>
-              <w:bottom w:type="dxa" w:w="60"/>
-              <w:right w:type="dxa" w:w="90"/>
-            </w:tcMar>
-          </w:tcPr>
-          <w:p>
-            <w:r>
-              <w:rPr>
-                <w:sz w:val="18"/>
-                <w:szCs w:val="18"/>
-              </w:rPr>
-              <w:t xml:space="preserve">https://www.gob.mx/impi</w:t>
+              <w:t xml:space="preserve">SACM</w:t>
+            </w:r>
+          </w:p>
+        </w:tc>
+        <w:tc>
+          <w:tcPr>
+            <w:tcW w:type="dxa" w:w="3213"/>
+            <w:tcMar>
+              <w:top w:type="dxa" w:w="60"/>
+              <w:left w:type="dxa" w:w="90"/>
+              <w:bottom w:type="dxa" w:w="60"/>
+              <w:right w:type="dxa" w:w="90"/>
+            </w:tcMar>
+          </w:tcPr>
+          <w:p>
+            <w:r>
+              <w:rPr>
+                <w:sz w:val="18"/>
+                <w:szCs w:val="18"/>
+              </w:rPr>
+              <w:t xml:space="preserve">https://www.sacm.org.mx</w:t>
             </w:r>
           </w:p>
         </w:tc>
@@ -5883,7 +7010,7 @@
                 <w:sz w:val="18"/>
                 <w:szCs w:val="18"/>
               </w:rPr>
-              <w:t xml:space="preserve">MarcaNET y registro de marca</w:t>
+              <w:t xml:space="preserve">Registro de obras musicales</w:t>
             </w:r>
           </w:p>
         </w:tc>
@@ -5908,27 +7035,27 @@
                 <w:sz w:val="18"/>
                 <w:szCs w:val="18"/>
               </w:rPr>
-              <w:t xml:space="preserve">ANDI</w:t>
-            </w:r>
-          </w:p>
-        </w:tc>
-        <w:tc>
-          <w:tcPr>
-            <w:tcW w:type="dxa" w:w="3213"/>
-            <w:tcMar>
-              <w:top w:type="dxa" w:w="60"/>
-              <w:left w:type="dxa" w:w="90"/>
-              <w:bottom w:type="dxa" w:w="60"/>
-              <w:right w:type="dxa" w:w="90"/>
-            </w:tcMar>
-          </w:tcPr>
-          <w:p>
-            <w:r>
-              <w:rPr>
-                <w:sz w:val="18"/>
-                <w:szCs w:val="18"/>
-              </w:rPr>
-              <w:t xml:space="preserve">https://www.andi.org.mx</w:t>
+              <w:t xml:space="preserve">EJE</w:t>
+            </w:r>
+          </w:p>
+        </w:tc>
+        <w:tc>
+          <w:tcPr>
+            <w:tcW w:type="dxa" w:w="3213"/>
+            <w:tcMar>
+              <w:top w:type="dxa" w:w="60"/>
+              <w:left w:type="dxa" w:w="90"/>
+              <w:bottom w:type="dxa" w:w="60"/>
+              <w:right w:type="dxa" w:w="90"/>
+            </w:tcMar>
+          </w:tcPr>
+          <w:p>
+            <w:r>
+              <w:rPr>
+                <w:sz w:val="18"/>
+                <w:szCs w:val="18"/>
+              </w:rPr>
+              <w:t xml:space="preserve">https://www.ejecutantes.com</w:t>
             </w:r>
           </w:p>
         </w:tc>
@@ -5948,7 +7075,7 @@
                 <w:sz w:val="18"/>
                 <w:szCs w:val="18"/>
               </w:rPr>
-              <w:t xml:space="preserve">Afiliación y regalías de intérpretes</w:t>
+              <w:t xml:space="preserve">Regalías de músicos ejecutantes</w:t>
             </w:r>
           </w:p>
         </w:tc>
@@ -5973,27 +7100,27 @@
                 <w:sz w:val="18"/>
                 <w:szCs w:val="18"/>
               </w:rPr>
-              <w:t xml:space="preserve">SACM</w:t>
-            </w:r>
-          </w:p>
-        </w:tc>
-        <w:tc>
-          <w:tcPr>
-            <w:tcW w:type="dxa" w:w="3213"/>
-            <w:tcMar>
-              <w:top w:type="dxa" w:w="60"/>
-              <w:left w:type="dxa" w:w="90"/>
-              <w:bottom w:type="dxa" w:w="60"/>
-              <w:right w:type="dxa" w:w="90"/>
-            </w:tcMar>
-          </w:tcPr>
-          <w:p>
-            <w:r>
-              <w:rPr>
-                <w:sz w:val="18"/>
-                <w:szCs w:val="18"/>
-              </w:rPr>
-              <w:t xml:space="preserve">https://www.sacm.org.mx</w:t>
+              <w:t xml:space="preserve">SOMEXFON</w:t>
+            </w:r>
+          </w:p>
+        </w:tc>
+        <w:tc>
+          <w:tcPr>
+            <w:tcW w:type="dxa" w:w="3213"/>
+            <w:tcMar>
+              <w:top w:type="dxa" w:w="60"/>
+              <w:left w:type="dxa" w:w="90"/>
+              <w:bottom w:type="dxa" w:w="60"/>
+              <w:right w:type="dxa" w:w="90"/>
+            </w:tcMar>
+          </w:tcPr>
+          <w:p>
+            <w:r>
+              <w:rPr>
+                <w:sz w:val="18"/>
+                <w:szCs w:val="18"/>
+              </w:rPr>
+              <w:t xml:space="preserve">https://www.somexfon.com</w:t>
             </w:r>
           </w:p>
         </w:tc>
@@ -6013,7 +7140,7 @@
                 <w:sz w:val="18"/>
                 <w:szCs w:val="18"/>
               </w:rPr>
-              <w:t xml:space="preserve">Registro de obras musicales</w:t>
+              <w:t xml:space="preserve">Derechos de productores de fonogramas</w:t>
             </w:r>
           </w:p>
         </w:tc>
@@ -6038,27 +7165,27 @@
                 <w:sz w:val="18"/>
                 <w:szCs w:val="18"/>
               </w:rPr>
-              <w:t xml:space="preserve">EJE</w:t>
-            </w:r>
-          </w:p>
-        </w:tc>
-        <w:tc>
-          <w:tcPr>
-            <w:tcW w:type="dxa" w:w="3213"/>
-            <w:tcMar>
-              <w:top w:type="dxa" w:w="60"/>
-              <w:left w:type="dxa" w:w="90"/>
-              <w:bottom w:type="dxa" w:w="60"/>
-              <w:right w:type="dxa" w:w="90"/>
-            </w:tcMar>
-          </w:tcPr>
-          <w:p>
-            <w:r>
-              <w:rPr>
-                <w:sz w:val="18"/>
-                <w:szCs w:val="18"/>
-              </w:rPr>
-              <w:t xml:space="preserve">[POR CONFIRMAR: sitio oficial]</w:t>
+              <w:t xml:space="preserve">ANDA</w:t>
+            </w:r>
+          </w:p>
+        </w:tc>
+        <w:tc>
+          <w:tcPr>
+            <w:tcW w:type="dxa" w:w="3213"/>
+            <w:tcMar>
+              <w:top w:type="dxa" w:w="60"/>
+              <w:left w:type="dxa" w:w="90"/>
+              <w:bottom w:type="dxa" w:w="60"/>
+              <w:right w:type="dxa" w:w="90"/>
+            </w:tcMar>
+          </w:tcPr>
+          <w:p>
+            <w:r>
+              <w:rPr>
+                <w:sz w:val="18"/>
+                <w:szCs w:val="18"/>
+              </w:rPr>
+              <w:t xml:space="preserve">https://laanda.org.mx</w:t>
             </w:r>
           </w:p>
         </w:tc>
@@ -6078,7 +7205,7 @@
                 <w:sz w:val="18"/>
                 <w:szCs w:val="18"/>
               </w:rPr>
-              <w:t xml:space="preserve">Regalías de músicos ejecutantes</w:t>
+              <w:t xml:space="preserve">Agremiación y servicios para actrices y actores</w:t>
             </w:r>
           </w:p>
         </w:tc>
@@ -6103,27 +7230,27 @@
                 <w:sz w:val="18"/>
                 <w:szCs w:val="18"/>
               </w:rPr>
-              <w:t xml:space="preserve">SOMEXFON</w:t>
-            </w:r>
-          </w:p>
-        </w:tc>
-        <w:tc>
-          <w:tcPr>
-            <w:tcW w:type="dxa" w:w="3213"/>
-            <w:tcMar>
-              <w:top w:type="dxa" w:w="60"/>
-              <w:left w:type="dxa" w:w="90"/>
-              <w:bottom w:type="dxa" w:w="60"/>
-              <w:right w:type="dxa" w:w="90"/>
-            </w:tcMar>
-          </w:tcPr>
-          <w:p>
-            <w:r>
-              <w:rPr>
-                <w:sz w:val="18"/>
-                <w:szCs w:val="18"/>
-              </w:rPr>
-              <w:t xml:space="preserve">[POR CONFIRMAR: sitio oficial]</w:t>
+              <w:t xml:space="preserve">INDAUTOR, sociedades de gestión colectiva</w:t>
+            </w:r>
+          </w:p>
+        </w:tc>
+        <w:tc>
+          <w:tcPr>
+            <w:tcW w:type="dxa" w:w="3213"/>
+            <w:tcMar>
+              <w:top w:type="dxa" w:w="60"/>
+              <w:left w:type="dxa" w:w="90"/>
+              <w:bottom w:type="dxa" w:w="60"/>
+              <w:right w:type="dxa" w:w="90"/>
+            </w:tcMar>
+          </w:tcPr>
+          <w:p>
+            <w:r>
+              <w:rPr>
+                <w:sz w:val="18"/>
+                <w:szCs w:val="18"/>
+              </w:rPr>
+              <w:t xml:space="preserve">https://www.indautor.gob.mx/sociedades-de-gestion-colectiva.php</w:t>
             </w:r>
           </w:p>
         </w:tc>
@@ -6143,7 +7270,7 @@
                 <w:sz w:val="18"/>
                 <w:szCs w:val="18"/>
               </w:rPr>
-              <w:t xml:space="preserve">Derechos de productores de fonogramas</w:t>
+              <w:t xml:space="preserve">Lista de sociedades autorizadas</w:t>
             </w:r>
           </w:p>
         </w:tc>
@@ -6191,7 +7318,31 @@
         </w:numPr>
       </w:pPr>
       <w:r>
-        <w:t xml:space="preserve">Ley para Regular las Sociedades de Información Crediticia.</w:t>
+        <w:t xml:space="preserve">Ley para Regular las Sociedades de Información Crediticia (artículos 23, 40 y 42 a 45).</w:t>
+      </w:r>
+    </w:p>
+    <w:p>
+      <w:pPr>
+        <w:pStyle w:val="ListParagraph"/>
+        <w:numPr>
+          <w:ilvl w:val="0"/>
+          <w:numId w:val="2"/>
+        </w:numPr>
+      </w:pPr>
+      <w:r>
+        <w:t xml:space="preserve">Banco de México, Circular 27/2008: reglas generales de las sociedades de información crediticia.</w:t>
+      </w:r>
+    </w:p>
+    <w:p>
+      <w:pPr>
+        <w:pStyle w:val="ListParagraph"/>
+        <w:numPr>
+          <w:ilvl w:val="0"/>
+          <w:numId w:val="2"/>
+        </w:numPr>
+      </w:pPr>
+      <w:r>
+        <w:t xml:space="preserve">Ley del Seguro Social: artículo 218 (continuación voluntaria, Modalidad 40) y reforma de diciembre de 2023 (personas trabajadoras independientes).</w:t>
       </w:r>
     </w:p>
     <w:p>
@@ -6340,7 +7491,7 @@
                 <w:sz w:val="18"/>
                 <w:szCs w:val="18"/>
               </w:rPr>
-              <w:t xml:space="preserve">Tabla de tasas y retención de RESICO vigente</w:t>
+              <w:t xml:space="preserve">Declaración anual de RESICO: si la RMF del año libera de presentarla</w:t>
             </w:r>
           </w:p>
         </w:tc>
@@ -6385,7 +7536,7 @@
                 <w:sz w:val="18"/>
                 <w:szCs w:val="18"/>
               </w:rPr>
-              <w:t xml:space="preserve">Si las deducciones personales y el PPR aplican a personas en RESICO</w:t>
+              <w:t xml:space="preserve">Cuotas 2026 de la Modalidad 10 y reglas vigentes de la Modalidad 40</w:t>
             </w:r>
           </w:p>
         </w:tc>
@@ -6430,7 +7581,7 @@
                 <w:sz w:val="18"/>
                 <w:szCs w:val="18"/>
               </w:rPr>
-              <w:t xml:space="preserve">Modalidad, cuotas y coberturas del IMSS para trabajadores independientes</w:t>
+              <w:t xml:space="preserve">Que los productos de ahorro de Nu ya estén en el banco (padrón de la CNBV) y la fecha de lanzamiento amplio de Revolut</w:t>
             </w:r>
           </w:p>
         </w:tc>
@@ -6475,7 +7626,7 @@
                 <w:sz w:val="18"/>
                 <w:szCs w:val="18"/>
               </w:rPr>
-              <w:t xml:space="preserve">Estatus bancario y protección del IPAB de Nu, Revolut y otros bancos digitales</w:t>
+              <w:t xml:space="preserve">Desde qué fecha se cuenta el plazo de eliminación en Buró y Círculo</w:t>
             </w:r>
           </w:p>
         </w:tc>
@@ -6520,7 +7671,7 @@
                 <w:sz w:val="18"/>
                 <w:szCs w:val="18"/>
               </w:rPr>
-              <w:t xml:space="preserve">Plazos de permanencia en Buró (UDIS y años)</w:t>
+              <w:t xml:space="preserve">Reclamaciones gratuitas al año y plazos de respuesta (LRSIC y Circular 27/2008)</w:t>
             </w:r>
           </w:p>
         </w:tc>
@@ -6565,7 +7716,7 @@
                 <w:sz w:val="18"/>
                 <w:szCs w:val="18"/>
               </w:rPr>
-              <w:t xml:space="preserve">Sitios oficiales de EJE y SOMEXFON, y tratamiento fiscal de regalías</w:t>
+              <w:t xml:space="preserve">Costo y condiciones de Bloqueo, Alertas Buró, reportes extra y servicios equivalentes de Círculo</w:t>
             </w:r>
           </w:p>
         </w:tc>
@@ -6655,7 +7806,7 @@
                 <w:sz w:val="18"/>
                 <w:szCs w:val="18"/>
               </w:rPr>
-              <w:t xml:space="preserve">Opciones de crédito de vivienda para independientes</w:t>
+              <w:t xml:space="preserve">Tratamiento de ISR e IVA de las regalías por derechos de autor</w:t>
             </w:r>
           </w:p>
         </w:tc>
@@ -6700,7 +7851,7 @@
                 <w:sz w:val="18"/>
                 <w:szCs w:val="18"/>
               </w:rPr>
-              <w:t xml:space="preserve">Alertas o bloqueos por robo de identidad en Buró y Círculo de Crédito, y contactos de policía cibernética</w:t>
+              <w:t xml:space="preserve">Opciones de crédito de vivienda para independientes y contactos de policía cibernética</w:t>
             </w:r>
           </w:p>
         </w:tc>

</xml_diff>

<commit_message>
Tu Talento 1.1: 19 datos verificados (RMF 2026, UMA, LRSIC, Banxico, CONDUSEF, IMSS, INDAUTOR, IMPI, Buró, Círculo)
Co-Authored-By: Claude Opus 5.5 <noreply@anthropic.com>
Claude-Session: https://claude.ai/code/session_01P5F6YBSbmgYFHyY7RUeBgK
</commit_message>
<xml_diff>
--- a/proyecto-entretenimiento/manual/TTMF_manual_v2.docx
+++ b/proyecto-entretenimiento/manual/TTMF_manual_v2.docx
@@ -32,7 +32,7 @@
           <w:sz w:val="28"/>
           <w:szCs w:val="28"/>
         </w:rPr>
-        <w:t xml:space="preserve">Manual del programa · Versión 2.1 · Septiembre de 2026</w:t>
+        <w:t xml:space="preserve">Manual del programa · Versión 2.2 · Septiembre de 2026</w:t>
       </w:r>
     </w:p>
     <w:p>
@@ -541,7 +541,7 @@
         </w:numPr>
       </w:pPr>
       <w:r>
-        <w:t xml:space="preserve">Las cifras que cambian (tasas, UMA, UDIS, límites) llevan fecha y se marcan [POR CONFIRMAR] hasta verificarlas con la fuente oficial.</w:t>
+        <w:t xml:space="preserve">Las cifras que cambian (tasas, UMA, UDIS, límites) llevan fecha y indican la fecha y la fuente de consulta; al estudiante se le pide confirmarlas en CONDUSEF, la CNBV o el sitio oficial de la institución.</w:t>
       </w:r>
     </w:p>
     <w:p>
@@ -1910,7 +1910,7 @@
         <w:t xml:space="preserve">Nu México</w:t>
       </w:r>
       <w:r>
-        <w:t xml:space="preserve"> era SOFIPO; recibió en abril de 2025 la autorización para constituirse como banco, y en julio de 2026 la CNBV le autorizó iniciar operaciones como banco. [POR CONFIRMAR en el padrón de la CNBV antes de publicar: que todos los productos de ahorro ya estén en el banco y no en la SOFIPO]</w:t>
+        <w:t xml:space="preserve"> era SOFIPO; recibió en abril de 2025 la autorización para constituirse como banco, y en julio de 2026 la CNBV le autorizó iniciar operaciones como banco. La lección pide al estudiante confirmarlo en el padrón de la CNBV y revisar que su contrato diga "Institución de Banca Múltiple".</w:t>
       </w:r>
     </w:p>
     <w:p>
@@ -2437,7 +2437,7 @@
         <w:t xml:space="preserve">Declaración anual.</w:t>
       </w:r>
       <w:r>
-        <w:t xml:space="preserve"> La ley (artículo 113-G) la pide, pero la Resolución Miscelánea Fiscal ha liberado de presentarla en ciertos casos a partir del ejercicio 2024. [POR CONFIRMAR cada año con la RMF vigente]</w:t>
+        <w:t xml:space="preserve"> La ley (artículo 113-G) la pide, pero la Resolución Miscelánea Fiscal (regla 3.13.7 de la RMF 2026) libera de presentarla a quien estuvo en RESICO todo el año, presentó todos sus pagos mensuales, no rebasó 3.5 millones y no tuvo otros ingresos.</w:t>
       </w:r>
     </w:p>
     <w:p>
@@ -2712,7 +2712,7 @@
                 <w:sz w:val="18"/>
                 <w:szCs w:val="18"/>
               </w:rPr>
-              <w:t xml:space="preserve">Tu actividad laboral: agremiación, contratos, tabuladores, condiciones de trabajo y servicios para sus agremiados, incluidos servicios de salud [POR CONFIRMAR: servicios vigentes]</w:t>
+              <w:t xml:space="preserve">Tu actividad laboral: agremiación, contratos, tabuladores, condiciones de trabajo y servicios para sus agremiados, incluidos servicios de salud; clínicas con consulta para agremiados y, desde el 20 de septiembre de 2026, convenio con el IMSS para la incorporación voluntaria de artistas independientes</w:t>
             </w:r>
           </w:p>
         </w:tc>
@@ -3022,7 +3022,7 @@
         <w:t xml:space="preserve">M3 U05 · Cómo cobro mis regalías y reviso mis pagos</w:t>
       </w:r>
       <w:r>
-        <w:t xml:space="preserve"> Objetivo: afiliarte a la sociedad que te corresponde (ANDI, SACM, EJE o SOMEXFON), registrar tus obras o interpretaciones, revisar tus liquidaciones, desconfiar de gestores que cobran por "recuperar regalías" y saber que esos ingresos se declaran. [POR CONFIRMAR con contador: tratamiento de ISR e IVA de regalías por derechos de autor]</w:t>
+        <w:t xml:space="preserve"> Objetivo: afiliarte a la sociedad que te corresponde (ANDI, SACM, EJE o SOMEXFON), registrar tus obras o interpretaciones, revisar tus liquidaciones, desconfiar de gestores que cobran por "recuperar regalías" y saber que esos ingresos se declaran. Incluye las exenciones para autores (ISR hasta 20 UMA, artículo 93-XXIX LISR; IVA, artículo 15-XVI LIVA) y pide al intérprete revisar su caso con su contador.</w:t>
       </w:r>
     </w:p>
     <w:p>
@@ -3321,7 +3321,7 @@
         <w:t xml:space="preserve">cada</w:t>
       </w:r>
       <w:r>
-        <w:t xml:space="preserve"> sociedad: uno en Buró y otro en Círculo. Se pide en sus sitios oficiales con tus datos y preguntas de seguridad; los reportes extra tienen costo (en Buró, unos 47 pesos por internet [POR CONFIRMAR]). Regla: pídelo solo en los sitios oficiales. Nadie más "te consulta el Buró gratis" a cambio de tus datos.</w:t>
+        <w:t xml:space="preserve"> sociedad: uno en Buró y otro en Círculo. Se pide en sus sitios oficiales con tus datos y preguntas de seguridad; los reportes extra tienen costo (47 pesos en Buró y desde 34.50 pesos en Círculo, por internet). Regla: pídelo solo en los sitios oficiales. Nadie más "te consulta el Buró gratis" a cambio de tus datos.</w:t>
       </w:r>
     </w:p>
     <w:p>
@@ -3613,7 +3613,7 @@
     <w:p/>
     <w:p>
       <w:r>
-        <w:t xml:space="preserve">No se eliminan por plazo las deudas mayores a 400,000 UDIS, las que están en juicio y las relacionadas con un fraude. Eliminar el registro no borra la deuda: el acreedor puede seguir cobrando. [POR CONFIRMAR con LRSIC y Circular 27/2008: desde qué fecha se cuenta el plazo] Gancho: Toño cree que su atraso de hace siete años "lo tiene marcado de por vida".</w:t>
+        <w:t xml:space="preserve">No se eliminan por plazo las deudas mayores a 400,000 UDIS, las que están en juicio y las relacionadas con un fraude. Eliminar el registro no borra la deuda: el acreedor puede seguir cobrando. El plazo se cuenta desde que el incumplimiento se incorporó por primera vez al historial (artículo 23 LRSIC). Gancho: Toño cree que su atraso de hace siete años "lo tiene marcado de por vida".</w:t>
       </w:r>
     </w:p>
     <w:p>
@@ -3625,7 +3625,7 @@
         <w:t xml:space="preserve">M7 U07 · Si hay un error: reclama paso a paso</w:t>
       </w:r>
       <w:r>
-        <w:t xml:space="preserve"> Objetivo: presentar una reclamación ante la unidad especializada del Buró o del Círculo, por escrito o en línea, con copia de tu reporte, los registros que impugnas y tus pruebas (por ejemplo, la carta de liquidación). La sociedad pide la información a la institución; si esta no la sustenta, el registro se corrige o se elimina. Hay reclamaciones gratuitas al año (en Círculo, dos gratis y las siguientes con costo) [POR CONFIRMAR: número de reclamaciones gratuitas y plazo de respuesta en LRSIC arts. 42 a 45]. Si no se resuelve, acude a CONDUSEF.</w:t>
+        <w:t xml:space="preserve"> Objetivo: presentar una reclamación ante la unidad especializada del Buró o del Círculo, por escrito o en línea, con copia de tu reporte, los registros que impugnas y tus pruebas (por ejemplo, la carta de liquidación). La sociedad pide la información a la institución; si esta no la sustenta, el registro se corrige o se elimina. Hay reclamaciones gratuitas al año (en Círculo, dos gratis y las siguientes a 80 pesos). La sociedad la envía a la institución en 5 días hábiles; la institución tiene 30 días naturales para responder o el registro se modifica o elimina como pidió la persona (artículos 42 a 44 LRSIC). Si no se resuelve, acude a CONDUSEF.</w:t>
       </w:r>
     </w:p>
     <w:p>
@@ -3656,7 +3656,7 @@
         <w:t xml:space="preserve">Bloqueo de Buró:</w:t>
       </w:r>
       <w:r>
-        <w:t xml:space="preserve"> mientras está activo, nadie puede consultar tu historial, así que nadie puede abrir un crédito a tu nombre. Lo desbloqueas cuando tú vas a pedir un crédito. [POR CONFIRMAR: condiciones y costo vigentes]</w:t>
+        <w:t xml:space="preserve"> mientras está activo, nadie puede consultar tu historial, así que nadie puede abrir un crédito a tu nombre. Cuesta 58 pesos por tres meses, con bloqueos y desbloqueos ilimitados en ese periodo; no se renueva solo.</w:t>
       </w:r>
     </w:p>
     <w:p>
@@ -3675,7 +3675,7 @@
         <w:t xml:space="preserve">Alertas Buró:</w:t>
       </w:r>
       <w:r>
-        <w:t xml:space="preserve"> te avisa cada vez que alguien consulta tu historial o se abre un crédito a tu nombre (con costo anual, unos 232 pesos [POR CONFIRMAR]).</w:t>
+        <w:t xml:space="preserve"> te avisa cada vez que alguien consulta tu historial o se abre un crédito a tu nombre (232 pesos al año, incluye 4 Mi Score).</w:t>
       </w:r>
     </w:p>
     <w:p>
@@ -3687,7 +3687,7 @@
         </w:numPr>
       </w:pPr>
       <w:r>
-        <w:t xml:space="preserve">Servicios equivalentes de Círculo de Crédito. [POR CONFIRMAR]</w:t>
+        <w:t xml:space="preserve">Círculo de Crédito: bloqueo temporal por tres meses y alertas "Avísame" (gratis) o "Avísame Mucho Más" (250 pesos al año).</w:t>
       </w:r>
     </w:p>
     <w:p>
@@ -3915,7 +3915,7 @@
         <w:t xml:space="preserve">M10 U02 · IMSS Modalidad 10: seguridad social para independientes</w:t>
       </w:r>
       <w:r>
-        <w:t xml:space="preserve"> Objetivo: conocer la Modalidad 10 (incorporación voluntaria al régimen obligatorio para personas trabajadoras independientes), que desde la reforma de diciembre de 2023 es un derecho permanente: atención médica, incapacidades, invalidez y vida, retiro en tu AFORE y aportaciones a Infonavit. La cuota depende del ingreso que registres; se calcula con la calculadora del IMSS. Conocer también los servicios de salud de ANDA para sus agremiados. [POR CONFIRMAR: cuotas 2026 y servicios de ANDA] Gancho: Gael lleva seis años sin IMSS desde su último contrato de nómina.</w:t>
+        <w:t xml:space="preserve"> Objetivo: conocer la Modalidad 10 (incorporación voluntaria al régimen obligatorio para personas trabajadoras independientes), que desde la reforma de diciembre de 2023 es un derecho permanente: atención médica, incapacidades, invalidez y vida, retiro en tu AFORE y aportaciones a Infonavit. La cuota depende del ingreso que registres; se calcula con la calculadora del IMSS. Conocer también los servicios de salud de ANDA para sus agremiados. En 2026 se cotiza entre un salario mínimo (9,582.47 pesos al mes; cuota cercana a 2,500) y 25 UMA; aportar a Infonavit (5%) es opcional. Incluye el convenio IMSS-ANDA de septiembre de 2026. Gancho: Gael lleva seis años sin IMSS desde su último contrato de nómina.</w:t>
       </w:r>
     </w:p>
     <w:p>
@@ -4007,7 +4007,7 @@
         <w:t xml:space="preserve">M11 U03 · Modalidad 40: si cotizaste antes de julio de 1997</w:t>
       </w:r>
       <w:r>
-        <w:t xml:space="preserve"> Objetivo: conocer la continuación voluntaria del IMSS (Modalidad 40) para personas de la Ley 73, que permite seguir sumando semanas y mejorar el salario con que se calcula la pensión. Requisitos: haber cotizado al menos 52 semanas en los últimos cinco años antes de la baja, pedirla dentro de los cinco años siguientes a la baja y no estar dado de alta como trabajador en ese momento. Costo 2026: 14.438% del salario que elijas, con tope de 25 UMA diarias. El IMSS endureció los controles en 2026. [POR CONFIRMAR: porcentaje y reglas vigentes] Diferencia con la Modalidad 10: la 10 es para quien trabaja por su cuenta hoy y te da servicio médico; la 40 es para quien ya no cotiza y quiere mejorar su pensión, y no incluye servicio médico. Gancho: Toño trabajó con nómina en una disquera de 1994 a 2021 y no sabe si le conviene la Modalidad 40 o la 10.</w:t>
+        <w:t xml:space="preserve"> Objetivo: conocer la continuación voluntaria del IMSS (Modalidad 40) para personas de la Ley 73, que permite seguir sumando semanas y mejorar el salario con que se calcula la pensión. Requisitos: haber cotizado al menos 52 semanas en los últimos cinco años antes de la baja, pedirla dentro de los cinco años siguientes a la baja y no estar dado de alta como trabajador en ese momento. Costo 2026: 14.438% del salario que elijas, con tope de 25 UMA diarias. El IMSS endureció los controles en 2026. El porcentaje sube cada año hasta 18.8% en 2030. Diferencia con la Modalidad 10: la 10 es para quien trabaja por su cuenta hoy y te da servicio médico; la 40 es para quien ya no cotiza y quiere mejorar su pensión, y no incluye servicio médico. Gancho: Toño trabajó con nómina en una disquera de 1994 a 2021 y no sabe si le conviene la Modalidad 40 o la 10.</w:t>
       </w:r>
     </w:p>
     <w:p>
@@ -4043,7 +4043,7 @@
         <w:t xml:space="preserve">M11 U06 · Vivienda: rentar, comprar o esperar</w:t>
       </w:r>
       <w:r>
-        <w:t xml:space="preserve"> Objetivo: comparar el costo total de comprar (enganche, gastos notariales, avalúo, seguros) contra rentar, y conocer las opciones de crédito para personas independientes. [POR CONFIRMAR: opciones de Infonavit para personas no asalariadas]</w:t>
+        <w:t xml:space="preserve"> Objetivo: comparar el costo total de comprar (enganche, gastos notariales, avalúo, seguros) contra rentar, y conocer las opciones de crédito para personas independientes. En Modalidad 10 se puede aportar 5% a Infonavit y solicitar crédito; gastos de escrituración de 4% a 7% del valor, según el estado.</w:t>
       </w:r>
     </w:p>
     <w:p>
@@ -6450,27 +6450,27 @@
                 <w:sz w:val="18"/>
                 <w:szCs w:val="18"/>
               </w:rPr>
-              <w:t xml:space="preserve">Policía cibernética</w:t>
-            </w:r>
-          </w:p>
-        </w:tc>
-        <w:tc>
-          <w:tcPr>
-            <w:tcW w:type="dxa" w:w="3213"/>
-            <w:tcMar>
-              <w:top w:type="dxa" w:w="60"/>
-              <w:left w:type="dxa" w:w="90"/>
-              <w:bottom w:type="dxa" w:w="60"/>
-              <w:right w:type="dxa" w:w="90"/>
-            </w:tcMar>
-          </w:tcPr>
-          <w:p>
-            <w:r>
-              <w:rPr>
-                <w:sz w:val="18"/>
-                <w:szCs w:val="18"/>
-              </w:rPr>
-              <w:t xml:space="preserve">[POR CONFIRMAR: contacto de la policía cibernética de cada estado]</w:t>
+              <w:t xml:space="preserve">Guardia Nacional, CERT-MX</w:t>
+            </w:r>
+          </w:p>
+        </w:tc>
+        <w:tc>
+          <w:tcPr>
+            <w:tcW w:type="dxa" w:w="3213"/>
+            <w:tcMar>
+              <w:top w:type="dxa" w:w="60"/>
+              <w:left w:type="dxa" w:w="90"/>
+              <w:bottom w:type="dxa" w:w="60"/>
+              <w:right w:type="dxa" w:w="90"/>
+            </w:tcMar>
+          </w:tcPr>
+          <w:p>
+            <w:r>
+              <w:rPr>
+                <w:sz w:val="18"/>
+                <w:szCs w:val="18"/>
+              </w:rPr>
+              <w:t xml:space="preserve">088 · https://www.gob.mx/gncertmx</w:t>
             </w:r>
           </w:p>
         </w:tc>
@@ -6490,7 +6490,7 @@
                 <w:sz w:val="18"/>
                 <w:szCs w:val="18"/>
               </w:rPr>
-              <w:t xml:space="preserve">Reportar fraudes en línea y robo de cuentas</w:t>
+              <w:t xml:space="preserve">Reportar fraudes y delitos en línea</w:t>
             </w:r>
           </w:p>
         </w:tc>
@@ -7379,7 +7379,7 @@
         <w:pStyle w:val="Heading1"/>
       </w:pPr>
       <w:r>
-        <w:t xml:space="preserve">7. Pendientes antes de escribir las lecciones</w:t>
+        <w:t xml:space="preserve">7. Datos verificados (29 de septiembre de 2026)</w:t>
       </w:r>
     </w:p>
     <w:tbl>
@@ -7395,8 +7395,10 @@
         </w:tblBorders>
       </w:tblPr>
       <w:tblGrid>
-        <w:gridCol w:w="4820"/>
-        <w:gridCol w:w="4820"/>
+        <w:gridCol w:w="2410"/>
+        <w:gridCol w:w="2410"/>
+        <w:gridCol w:w="2410"/>
+        <w:gridCol w:w="2410"/>
       </w:tblGrid>
       <w:tr>
         <w:trPr>
@@ -7404,7 +7406,7 @@
         </w:trPr>
         <w:tc>
           <w:tcPr>
-            <w:tcW w:type="dxa" w:w="4820"/>
+            <w:tcW w:type="dxa" w:w="2410"/>
             <w:shd w:fill="1F5C4A" w:color="auto" w:val="clear"/>
             <w:tcMar>
               <w:top w:type="dxa" w:w="60"/>
@@ -7428,7 +7430,7 @@
         </w:tc>
         <w:tc>
           <w:tcPr>
-            <w:tcW w:type="dxa" w:w="4820"/>
+            <w:tcW w:type="dxa" w:w="2410"/>
             <w:shd w:fill="1F5C4A" w:color="auto" w:val="clear"/>
             <w:tcMar>
               <w:top w:type="dxa" w:w="60"/>
@@ -7446,7 +7448,55 @@
                 <w:sz w:val="18"/>
                 <w:szCs w:val="18"/>
               </w:rPr>
-              <w:t xml:space="preserve">Dato por confirmar</w:t>
+              <w:t xml:space="preserve">Dato</w:t>
+            </w:r>
+          </w:p>
+        </w:tc>
+        <w:tc>
+          <w:tcPr>
+            <w:tcW w:type="dxa" w:w="2410"/>
+            <w:shd w:fill="1F5C4A" w:color="auto" w:val="clear"/>
+            <w:tcMar>
+              <w:top w:type="dxa" w:w="60"/>
+              <w:left w:type="dxa" w:w="90"/>
+              <w:bottom w:type="dxa" w:w="60"/>
+              <w:right w:type="dxa" w:w="90"/>
+            </w:tcMar>
+          </w:tcPr>
+          <w:p>
+            <w:r>
+              <w:rPr>
+                <w:b/>
+                <w:bCs/>
+                <w:color w:val="FFFFFF"/>
+                <w:sz w:val="18"/>
+                <w:szCs w:val="18"/>
+              </w:rPr>
+              <w:t xml:space="preserve">Resultado</w:t>
+            </w:r>
+          </w:p>
+        </w:tc>
+        <w:tc>
+          <w:tcPr>
+            <w:tcW w:type="dxa" w:w="2410"/>
+            <w:shd w:fill="1F5C4A" w:color="auto" w:val="clear"/>
+            <w:tcMar>
+              <w:top w:type="dxa" w:w="60"/>
+              <w:left w:type="dxa" w:w="90"/>
+              <w:bottom w:type="dxa" w:w="60"/>
+              <w:right w:type="dxa" w:w="90"/>
+            </w:tcMar>
+          </w:tcPr>
+          <w:p>
+            <w:r>
+              <w:rPr>
+                <w:b/>
+                <w:bCs/>
+                <w:color w:val="FFFFFF"/>
+                <w:sz w:val="18"/>
+                <w:szCs w:val="18"/>
+              </w:rPr>
+              <w:t xml:space="preserve">Fuente</w:t>
             </w:r>
           </w:p>
         </w:tc>
@@ -7457,7 +7507,7 @@
         </w:trPr>
         <w:tc>
           <w:tcPr>
-            <w:tcW w:type="dxa" w:w="4820"/>
+            <w:tcW w:type="dxa" w:w="2410"/>
             <w:tcMar>
               <w:top w:type="dxa" w:w="60"/>
               <w:left w:type="dxa" w:w="90"/>
@@ -7477,21 +7527,61 @@
         </w:tc>
         <w:tc>
           <w:tcPr>
-            <w:tcW w:type="dxa" w:w="4820"/>
-            <w:tcMar>
-              <w:top w:type="dxa" w:w="60"/>
-              <w:left w:type="dxa" w:w="90"/>
-              <w:bottom w:type="dxa" w:w="60"/>
-              <w:right w:type="dxa" w:w="90"/>
-            </w:tcMar>
-          </w:tcPr>
-          <w:p>
-            <w:r>
-              <w:rPr>
-                <w:sz w:val="18"/>
-                <w:szCs w:val="18"/>
-              </w:rPr>
-              <w:t xml:space="preserve">Declaración anual de RESICO: si la RMF del año libera de presentarla</w:t>
+            <w:tcW w:type="dxa" w:w="2410"/>
+            <w:tcMar>
+              <w:top w:type="dxa" w:w="60"/>
+              <w:left w:type="dxa" w:w="90"/>
+              <w:bottom w:type="dxa" w:w="60"/>
+              <w:right w:type="dxa" w:w="90"/>
+            </w:tcMar>
+          </w:tcPr>
+          <w:p>
+            <w:r>
+              <w:rPr>
+                <w:sz w:val="18"/>
+                <w:szCs w:val="18"/>
+              </w:rPr>
+              <w:t xml:space="preserve">Declaración anual de RESICO</w:t>
+            </w:r>
+          </w:p>
+        </w:tc>
+        <w:tc>
+          <w:tcPr>
+            <w:tcW w:type="dxa" w:w="2410"/>
+            <w:tcMar>
+              <w:top w:type="dxa" w:w="60"/>
+              <w:left w:type="dxa" w:w="90"/>
+              <w:bottom w:type="dxa" w:w="60"/>
+              <w:right w:type="dxa" w:w="90"/>
+            </w:tcMar>
+          </w:tcPr>
+          <w:p>
+            <w:r>
+              <w:rPr>
+                <w:sz w:val="18"/>
+                <w:szCs w:val="18"/>
+              </w:rPr>
+              <w:t xml:space="preserve">No obligatoria si estuvo todo el año en RESICO, presentó todos los pagos mensuales y no tuvo otros ingresos</w:t>
+            </w:r>
+          </w:p>
+        </w:tc>
+        <w:tc>
+          <w:tcPr>
+            <w:tcW w:type="dxa" w:w="2410"/>
+            <w:tcMar>
+              <w:top w:type="dxa" w:w="60"/>
+              <w:left w:type="dxa" w:w="90"/>
+              <w:bottom w:type="dxa" w:w="60"/>
+              <w:right w:type="dxa" w:w="90"/>
+            </w:tcMar>
+          </w:tcPr>
+          <w:p>
+            <w:r>
+              <w:rPr>
+                <w:sz w:val="18"/>
+                <w:szCs w:val="18"/>
+              </w:rPr>
+              <w:t xml:space="preserve">RMF 2026, regla 3.13.7; LISR 113-G</w:t>
             </w:r>
           </w:p>
         </w:tc>
@@ -7502,7 +7592,7 @@
         </w:trPr>
         <w:tc>
           <w:tcPr>
-            <w:tcW w:type="dxa" w:w="4820"/>
+            <w:tcW w:type="dxa" w:w="2410"/>
             <w:tcMar>
               <w:top w:type="dxa" w:w="60"/>
               <w:left w:type="dxa" w:w="90"/>
@@ -7522,21 +7612,61 @@
         </w:tc>
         <w:tc>
           <w:tcPr>
-            <w:tcW w:type="dxa" w:w="4820"/>
-            <w:tcMar>
-              <w:top w:type="dxa" w:w="60"/>
-              <w:left w:type="dxa" w:w="90"/>
-              <w:bottom w:type="dxa" w:w="60"/>
-              <w:right w:type="dxa" w:w="90"/>
-            </w:tcMar>
-          </w:tcPr>
-          <w:p>
-            <w:r>
-              <w:rPr>
-                <w:sz w:val="18"/>
-                <w:szCs w:val="18"/>
-              </w:rPr>
-              <w:t xml:space="preserve">Cuotas 2026 de la Modalidad 10 y reglas vigentes de la Modalidad 40</w:t>
+            <w:tcW w:type="dxa" w:w="2410"/>
+            <w:tcMar>
+              <w:top w:type="dxa" w:w="60"/>
+              <w:left w:type="dxa" w:w="90"/>
+              <w:bottom w:type="dxa" w:w="60"/>
+              <w:right w:type="dxa" w:w="90"/>
+            </w:tcMar>
+          </w:tcPr>
+          <w:p>
+            <w:r>
+              <w:rPr>
+                <w:sz w:val="18"/>
+                <w:szCs w:val="18"/>
+              </w:rPr>
+              <w:t xml:space="preserve">Tope de deducciones personales</w:t>
+            </w:r>
+          </w:p>
+        </w:tc>
+        <w:tc>
+          <w:tcPr>
+            <w:tcW w:type="dxa" w:w="2410"/>
+            <w:tcMar>
+              <w:top w:type="dxa" w:w="60"/>
+              <w:left w:type="dxa" w:w="90"/>
+              <w:bottom w:type="dxa" w:w="60"/>
+              <w:right w:type="dxa" w:w="90"/>
+            </w:tcMar>
+          </w:tcPr>
+          <w:p>
+            <w:r>
+              <w:rPr>
+                <w:sz w:val="18"/>
+                <w:szCs w:val="18"/>
+              </w:rPr>
+              <w:t xml:space="preserve">Menor entre 5 UMA anuales (213,973.20 pesos en 2026) y 15% de ingresos</w:t>
+            </w:r>
+          </w:p>
+        </w:tc>
+        <w:tc>
+          <w:tcPr>
+            <w:tcW w:type="dxa" w:w="2410"/>
+            <w:tcMar>
+              <w:top w:type="dxa" w:w="60"/>
+              <w:left w:type="dxa" w:w="90"/>
+              <w:bottom w:type="dxa" w:w="60"/>
+              <w:right w:type="dxa" w:w="90"/>
+            </w:tcMar>
+          </w:tcPr>
+          <w:p>
+            <w:r>
+              <w:rPr>
+                <w:sz w:val="18"/>
+                <w:szCs w:val="18"/>
+              </w:rPr>
+              <w:t xml:space="preserve">LISR 151; UMA 2026 (DOF 9-ene-2026)</w:t>
             </w:r>
           </w:p>
         </w:tc>
@@ -7547,7 +7677,7 @@
         </w:trPr>
         <w:tc>
           <w:tcPr>
-            <w:tcW w:type="dxa" w:w="4820"/>
+            <w:tcW w:type="dxa" w:w="2410"/>
             <w:tcMar>
               <w:top w:type="dxa" w:w="60"/>
               <w:left w:type="dxa" w:w="90"/>
@@ -7567,21 +7697,61 @@
         </w:tc>
         <w:tc>
           <w:tcPr>
-            <w:tcW w:type="dxa" w:w="4820"/>
-            <w:tcMar>
-              <w:top w:type="dxa" w:w="60"/>
-              <w:left w:type="dxa" w:w="90"/>
-              <w:bottom w:type="dxa" w:w="60"/>
-              <w:right w:type="dxa" w:w="90"/>
-            </w:tcMar>
-          </w:tcPr>
-          <w:p>
-            <w:r>
-              <w:rPr>
-                <w:sz w:val="18"/>
-                <w:szCs w:val="18"/>
-              </w:rPr>
-              <w:t xml:space="preserve">Que los productos de ahorro de Nu ya estén en el banco (padrón de la CNBV) y la fecha de lanzamiento amplio de Revolut</w:t>
+            <w:tcW w:type="dxa" w:w="2410"/>
+            <w:tcMar>
+              <w:top w:type="dxa" w:w="60"/>
+              <w:left w:type="dxa" w:w="90"/>
+              <w:bottom w:type="dxa" w:w="60"/>
+              <w:right w:type="dxa" w:w="90"/>
+            </w:tcMar>
+          </w:tcPr>
+          <w:p>
+            <w:r>
+              <w:rPr>
+                <w:sz w:val="18"/>
+                <w:szCs w:val="18"/>
+              </w:rPr>
+              <w:t xml:space="preserve">PPR y aportaciones complementarias</w:t>
+            </w:r>
+          </w:p>
+        </w:tc>
+        <w:tc>
+          <w:tcPr>
+            <w:tcW w:type="dxa" w:w="2410"/>
+            <w:tcMar>
+              <w:top w:type="dxa" w:w="60"/>
+              <w:left w:type="dxa" w:w="90"/>
+              <w:bottom w:type="dxa" w:w="60"/>
+              <w:right w:type="dxa" w:w="90"/>
+            </w:tcMar>
+          </w:tcPr>
+          <w:p>
+            <w:r>
+              <w:rPr>
+                <w:sz w:val="18"/>
+                <w:szCs w:val="18"/>
+              </w:rPr>
+              <w:t xml:space="preserve">10% de ingresos, máximo 5 UMA anuales, fuera del tope global; retiro antes de 65 con retención de 20%</w:t>
+            </w:r>
+          </w:p>
+        </w:tc>
+        <w:tc>
+          <w:tcPr>
+            <w:tcW w:type="dxa" w:w="2410"/>
+            <w:tcMar>
+              <w:top w:type="dxa" w:w="60"/>
+              <w:left w:type="dxa" w:w="90"/>
+              <w:bottom w:type="dxa" w:w="60"/>
+              <w:right w:type="dxa" w:w="90"/>
+            </w:tcMar>
+          </w:tcPr>
+          <w:p>
+            <w:r>
+              <w:rPr>
+                <w:sz w:val="18"/>
+                <w:szCs w:val="18"/>
+              </w:rPr>
+              <w:t xml:space="preserve">LISR 142-XVIII y 151-V</w:t>
             </w:r>
           </w:p>
         </w:tc>
@@ -7592,7 +7762,7 @@
         </w:trPr>
         <w:tc>
           <w:tcPr>
-            <w:tcW w:type="dxa" w:w="4820"/>
+            <w:tcW w:type="dxa" w:w="2410"/>
             <w:tcMar>
               <w:top w:type="dxa" w:w="60"/>
               <w:left w:type="dxa" w:w="90"/>
@@ -7612,21 +7782,61 @@
         </w:tc>
         <w:tc>
           <w:tcPr>
-            <w:tcW w:type="dxa" w:w="4820"/>
-            <w:tcMar>
-              <w:top w:type="dxa" w:w="60"/>
-              <w:left w:type="dxa" w:w="90"/>
-              <w:bottom w:type="dxa" w:w="60"/>
-              <w:right w:type="dxa" w:w="90"/>
-            </w:tcMar>
-          </w:tcPr>
-          <w:p>
-            <w:r>
-              <w:rPr>
-                <w:sz w:val="18"/>
-                <w:szCs w:val="18"/>
-              </w:rPr>
-              <w:t xml:space="preserve">Desde qué fecha se cuenta el plazo de eliminación en Buró y Círculo</w:t>
+            <w:tcW w:type="dxa" w:w="2410"/>
+            <w:tcMar>
+              <w:top w:type="dxa" w:w="60"/>
+              <w:left w:type="dxa" w:w="90"/>
+              <w:bottom w:type="dxa" w:w="60"/>
+              <w:right w:type="dxa" w:w="90"/>
+            </w:tcMar>
+          </w:tcPr>
+          <w:p>
+            <w:r>
+              <w:rPr>
+                <w:sz w:val="18"/>
+                <w:szCs w:val="18"/>
+              </w:rPr>
+              <w:t xml:space="preserve">Modalidad 10</w:t>
+            </w:r>
+          </w:p>
+        </w:tc>
+        <w:tc>
+          <w:tcPr>
+            <w:tcW w:type="dxa" w:w="2410"/>
+            <w:tcMar>
+              <w:top w:type="dxa" w:w="60"/>
+              <w:left w:type="dxa" w:w="90"/>
+              <w:bottom w:type="dxa" w:w="60"/>
+              <w:right w:type="dxa" w:w="90"/>
+            </w:tcMar>
+          </w:tcPr>
+          <w:p>
+            <w:r>
+              <w:rPr>
+                <w:sz w:val="18"/>
+                <w:szCs w:val="18"/>
+              </w:rPr>
+              <w:t xml:space="preserve">De un salario mínimo (9,582.47 al mes) a 25 UMA; cuota mínima cercana a 2,500 al mes; Infonavit opcional (5%)</w:t>
+            </w:r>
+          </w:p>
+        </w:tc>
+        <w:tc>
+          <w:tcPr>
+            <w:tcW w:type="dxa" w:w="2410"/>
+            <w:tcMar>
+              <w:top w:type="dxa" w:w="60"/>
+              <w:left w:type="dxa" w:w="90"/>
+              <w:bottom w:type="dxa" w:w="60"/>
+              <w:right w:type="dxa" w:w="90"/>
+            </w:tcMar>
+          </w:tcPr>
+          <w:p>
+            <w:r>
+              <w:rPr>
+                <w:sz w:val="18"/>
+                <w:szCs w:val="18"/>
+              </w:rPr>
+              <w:t xml:space="preserve">IMSS; medios</w:t>
             </w:r>
           </w:p>
         </w:tc>
@@ -7637,7 +7847,7 @@
         </w:trPr>
         <w:tc>
           <w:tcPr>
-            <w:tcW w:type="dxa" w:w="4820"/>
+            <w:tcW w:type="dxa" w:w="2410"/>
             <w:tcMar>
               <w:top w:type="dxa" w:w="60"/>
               <w:left w:type="dxa" w:w="90"/>
@@ -7657,21 +7867,61 @@
         </w:tc>
         <w:tc>
           <w:tcPr>
-            <w:tcW w:type="dxa" w:w="4820"/>
-            <w:tcMar>
-              <w:top w:type="dxa" w:w="60"/>
-              <w:left w:type="dxa" w:w="90"/>
-              <w:bottom w:type="dxa" w:w="60"/>
-              <w:right w:type="dxa" w:w="90"/>
-            </w:tcMar>
-          </w:tcPr>
-          <w:p>
-            <w:r>
-              <w:rPr>
-                <w:sz w:val="18"/>
-                <w:szCs w:val="18"/>
-              </w:rPr>
-              <w:t xml:space="preserve">Reclamaciones gratuitas al año y plazos de respuesta (LRSIC y Circular 27/2008)</w:t>
+            <w:tcW w:type="dxa" w:w="2410"/>
+            <w:tcMar>
+              <w:top w:type="dxa" w:w="60"/>
+              <w:left w:type="dxa" w:w="90"/>
+              <w:bottom w:type="dxa" w:w="60"/>
+              <w:right w:type="dxa" w:w="90"/>
+            </w:tcMar>
+          </w:tcPr>
+          <w:p>
+            <w:r>
+              <w:rPr>
+                <w:sz w:val="18"/>
+                <w:szCs w:val="18"/>
+              </w:rPr>
+              <w:t xml:space="preserve">Convenio IMSS-ANDA</w:t>
+            </w:r>
+          </w:p>
+        </w:tc>
+        <w:tc>
+          <w:tcPr>
+            <w:tcW w:type="dxa" w:w="2410"/>
+            <w:tcMar>
+              <w:top w:type="dxa" w:w="60"/>
+              <w:left w:type="dxa" w:w="90"/>
+              <w:bottom w:type="dxa" w:w="60"/>
+              <w:right w:type="dxa" w:w="90"/>
+            </w:tcMar>
+          </w:tcPr>
+          <w:p>
+            <w:r>
+              <w:rPr>
+                <w:sz w:val="18"/>
+                <w:szCs w:val="18"/>
+              </w:rPr>
+              <w:t xml:space="preserve">Incorporación voluntaria de artistas independientes con beneficiarios, publicado el 20-sep-2026</w:t>
+            </w:r>
+          </w:p>
+        </w:tc>
+        <w:tc>
+          <w:tcPr>
+            <w:tcW w:type="dxa" w:w="2410"/>
+            <w:tcMar>
+              <w:top w:type="dxa" w:w="60"/>
+              <w:left w:type="dxa" w:w="90"/>
+              <w:bottom w:type="dxa" w:w="60"/>
+              <w:right w:type="dxa" w:w="90"/>
+            </w:tcMar>
+          </w:tcPr>
+          <w:p>
+            <w:r>
+              <w:rPr>
+                <w:sz w:val="18"/>
+                <w:szCs w:val="18"/>
+              </w:rPr>
+              <w:t xml:space="preserve">IMSS; medios</w:t>
             </w:r>
           </w:p>
         </w:tc>
@@ -7682,7 +7932,7 @@
         </w:trPr>
         <w:tc>
           <w:tcPr>
-            <w:tcW w:type="dxa" w:w="4820"/>
+            <w:tcW w:type="dxa" w:w="2410"/>
             <w:tcMar>
               <w:top w:type="dxa" w:w="60"/>
               <w:left w:type="dxa" w:w="90"/>
@@ -7702,21 +7952,61 @@
         </w:tc>
         <w:tc>
           <w:tcPr>
-            <w:tcW w:type="dxa" w:w="4820"/>
-            <w:tcMar>
-              <w:top w:type="dxa" w:w="60"/>
-              <w:left w:type="dxa" w:w="90"/>
-              <w:bottom w:type="dxa" w:w="60"/>
-              <w:right w:type="dxa" w:w="90"/>
-            </w:tcMar>
-          </w:tcPr>
-          <w:p>
-            <w:r>
-              <w:rPr>
-                <w:sz w:val="18"/>
-                <w:szCs w:val="18"/>
-              </w:rPr>
-              <w:t xml:space="preserve">Costo y condiciones de Bloqueo, Alertas Buró, reportes extra y servicios equivalentes de Círculo</w:t>
+            <w:tcW w:type="dxa" w:w="2410"/>
+            <w:tcMar>
+              <w:top w:type="dxa" w:w="60"/>
+              <w:left w:type="dxa" w:w="90"/>
+              <w:bottom w:type="dxa" w:w="60"/>
+              <w:right w:type="dxa" w:w="90"/>
+            </w:tcMar>
+          </w:tcPr>
+          <w:p>
+            <w:r>
+              <w:rPr>
+                <w:sz w:val="18"/>
+                <w:szCs w:val="18"/>
+              </w:rPr>
+              <w:t xml:space="preserve">Modalidad 40</w:t>
+            </w:r>
+          </w:p>
+        </w:tc>
+        <w:tc>
+          <w:tcPr>
+            <w:tcW w:type="dxa" w:w="2410"/>
+            <w:tcMar>
+              <w:top w:type="dxa" w:w="60"/>
+              <w:left w:type="dxa" w:w="90"/>
+              <w:bottom w:type="dxa" w:w="60"/>
+              <w:right w:type="dxa" w:w="90"/>
+            </w:tcMar>
+          </w:tcPr>
+          <w:p>
+            <w:r>
+              <w:rPr>
+                <w:sz w:val="18"/>
+                <w:szCs w:val="18"/>
+              </w:rPr>
+              <w:t xml:space="preserve">14.438% en 2026, de 3 a 25 UMA; sube hasta 18.8% en 2030</w:t>
+            </w:r>
+          </w:p>
+        </w:tc>
+        <w:tc>
+          <w:tcPr>
+            <w:tcW w:type="dxa" w:w="2410"/>
+            <w:tcMar>
+              <w:top w:type="dxa" w:w="60"/>
+              <w:left w:type="dxa" w:w="90"/>
+              <w:bottom w:type="dxa" w:w="60"/>
+              <w:right w:type="dxa" w:w="90"/>
+            </w:tcMar>
+          </w:tcPr>
+          <w:p>
+            <w:r>
+              <w:rPr>
+                <w:sz w:val="18"/>
+                <w:szCs w:val="18"/>
+              </w:rPr>
+              <w:t xml:space="preserve">LSS 218; reforma 2020</w:t>
             </w:r>
           </w:p>
         </w:tc>
@@ -7727,7 +8017,7 @@
         </w:trPr>
         <w:tc>
           <w:tcPr>
-            <w:tcW w:type="dxa" w:w="4820"/>
+            <w:tcW w:type="dxa" w:w="2410"/>
             <w:tcMar>
               <w:top w:type="dxa" w:w="60"/>
               <w:left w:type="dxa" w:w="90"/>
@@ -7747,21 +8037,61 @@
         </w:tc>
         <w:tc>
           <w:tcPr>
-            <w:tcW w:type="dxa" w:w="4820"/>
-            <w:tcMar>
-              <w:top w:type="dxa" w:w="60"/>
-              <w:left w:type="dxa" w:w="90"/>
-              <w:bottom w:type="dxa" w:w="60"/>
-              <w:right w:type="dxa" w:w="90"/>
-            </w:tcMar>
-          </w:tcPr>
-          <w:p>
-            <w:r>
-              <w:rPr>
-                <w:sz w:val="18"/>
-                <w:szCs w:val="18"/>
-              </w:rPr>
-              <w:t xml:space="preserve">Servicios de salud de ANDA para agremiados</w:t>
+            <w:tcW w:type="dxa" w:w="2410"/>
+            <w:tcMar>
+              <w:top w:type="dxa" w:w="60"/>
+              <w:left w:type="dxa" w:w="90"/>
+              <w:bottom w:type="dxa" w:w="60"/>
+              <w:right w:type="dxa" w:w="90"/>
+            </w:tcMar>
+          </w:tcPr>
+          <w:p>
+            <w:r>
+              <w:rPr>
+                <w:sz w:val="18"/>
+                <w:szCs w:val="18"/>
+              </w:rPr>
+              <w:t xml:space="preserve">Plazo de eliminación en historial</w:t>
+            </w:r>
+          </w:p>
+        </w:tc>
+        <w:tc>
+          <w:tcPr>
+            <w:tcW w:type="dxa" w:w="2410"/>
+            <w:tcMar>
+              <w:top w:type="dxa" w:w="60"/>
+              <w:left w:type="dxa" w:w="90"/>
+              <w:bottom w:type="dxa" w:w="60"/>
+              <w:right w:type="dxa" w:w="90"/>
+            </w:tcMar>
+          </w:tcPr>
+          <w:p>
+            <w:r>
+              <w:rPr>
+                <w:sz w:val="18"/>
+                <w:szCs w:val="18"/>
+              </w:rPr>
+              <w:t xml:space="preserve">1, 2, 4 o 6 años según UDIS; se cuenta desde que se incorporó el primer incumplimiento</w:t>
+            </w:r>
+          </w:p>
+        </w:tc>
+        <w:tc>
+          <w:tcPr>
+            <w:tcW w:type="dxa" w:w="2410"/>
+            <w:tcMar>
+              <w:top w:type="dxa" w:w="60"/>
+              <w:left w:type="dxa" w:w="90"/>
+              <w:bottom w:type="dxa" w:w="60"/>
+              <w:right w:type="dxa" w:w="90"/>
+            </w:tcMar>
+          </w:tcPr>
+          <w:p>
+            <w:r>
+              <w:rPr>
+                <w:sz w:val="18"/>
+                <w:szCs w:val="18"/>
+              </w:rPr>
+              <w:t xml:space="preserve">LRSIC 23; CONDUSEF</w:t>
             </w:r>
           </w:p>
         </w:tc>
@@ -7772,7 +8102,7 @@
         </w:trPr>
         <w:tc>
           <w:tcPr>
-            <w:tcW w:type="dxa" w:w="4820"/>
+            <w:tcW w:type="dxa" w:w="2410"/>
             <w:tcMar>
               <w:top w:type="dxa" w:w="60"/>
               <w:left w:type="dxa" w:w="90"/>
@@ -7792,21 +8122,61 @@
         </w:tc>
         <w:tc>
           <w:tcPr>
-            <w:tcW w:type="dxa" w:w="4820"/>
-            <w:tcMar>
-              <w:top w:type="dxa" w:w="60"/>
-              <w:left w:type="dxa" w:w="90"/>
-              <w:bottom w:type="dxa" w:w="60"/>
-              <w:right w:type="dxa" w:w="90"/>
-            </w:tcMar>
-          </w:tcPr>
-          <w:p>
-            <w:r>
-              <w:rPr>
-                <w:sz w:val="18"/>
-                <w:szCs w:val="18"/>
-              </w:rPr>
-              <w:t xml:space="preserve">Tratamiento de ISR e IVA de las regalías por derechos de autor</w:t>
+            <w:tcW w:type="dxa" w:w="2410"/>
+            <w:tcMar>
+              <w:top w:type="dxa" w:w="60"/>
+              <w:left w:type="dxa" w:w="90"/>
+              <w:bottom w:type="dxa" w:w="60"/>
+              <w:right w:type="dxa" w:w="90"/>
+            </w:tcMar>
+          </w:tcPr>
+          <w:p>
+            <w:r>
+              <w:rPr>
+                <w:sz w:val="18"/>
+                <w:szCs w:val="18"/>
+              </w:rPr>
+              <w:t xml:space="preserve">Reclamaciones</w:t>
+            </w:r>
+          </w:p>
+        </w:tc>
+        <w:tc>
+          <w:tcPr>
+            <w:tcW w:type="dxa" w:w="2410"/>
+            <w:tcMar>
+              <w:top w:type="dxa" w:w="60"/>
+              <w:left w:type="dxa" w:w="90"/>
+              <w:bottom w:type="dxa" w:w="60"/>
+              <w:right w:type="dxa" w:w="90"/>
+            </w:tcMar>
+          </w:tcPr>
+          <w:p>
+            <w:r>
+              <w:rPr>
+                <w:sz w:val="18"/>
+                <w:szCs w:val="18"/>
+              </w:rPr>
+              <w:t xml:space="preserve">5 días hábiles para enviar; 30 días naturales para responder; Círculo: 2 gratis al año, luego 80 pesos</w:t>
+            </w:r>
+          </w:p>
+        </w:tc>
+        <w:tc>
+          <w:tcPr>
+            <w:tcW w:type="dxa" w:w="2410"/>
+            <w:tcMar>
+              <w:top w:type="dxa" w:w="60"/>
+              <w:left w:type="dxa" w:w="90"/>
+              <w:bottom w:type="dxa" w:w="60"/>
+              <w:right w:type="dxa" w:w="90"/>
+            </w:tcMar>
+          </w:tcPr>
+          <w:p>
+            <w:r>
+              <w:rPr>
+                <w:sz w:val="18"/>
+                <w:szCs w:val="18"/>
+              </w:rPr>
+              <w:t xml:space="preserve">LRSIC 42-44; Círculo de Crédito</w:t>
             </w:r>
           </w:p>
         </w:tc>
@@ -7817,7 +8187,7 @@
         </w:trPr>
         <w:tc>
           <w:tcPr>
-            <w:tcW w:type="dxa" w:w="4820"/>
+            <w:tcW w:type="dxa" w:w="2410"/>
             <w:tcMar>
               <w:top w:type="dxa" w:w="60"/>
               <w:left w:type="dxa" w:w="90"/>
@@ -7837,27 +8207,929 @@
         </w:tc>
         <w:tc>
           <w:tcPr>
-            <w:tcW w:type="dxa" w:w="4820"/>
-            <w:tcMar>
-              <w:top w:type="dxa" w:w="60"/>
-              <w:left w:type="dxa" w:w="90"/>
-              <w:bottom w:type="dxa" w:w="60"/>
-              <w:right w:type="dxa" w:w="90"/>
-            </w:tcMar>
-          </w:tcPr>
-          <w:p>
-            <w:r>
-              <w:rPr>
-                <w:sz w:val="18"/>
-                <w:szCs w:val="18"/>
-              </w:rPr>
-              <w:t xml:space="preserve">Opciones de crédito de vivienda para independientes y contactos de policía cibernética</w:t>
+            <w:tcW w:type="dxa" w:w="2410"/>
+            <w:tcMar>
+              <w:top w:type="dxa" w:w="60"/>
+              <w:left w:type="dxa" w:w="90"/>
+              <w:bottom w:type="dxa" w:w="60"/>
+              <w:right w:type="dxa" w:w="90"/>
+            </w:tcMar>
+          </w:tcPr>
+          <w:p>
+            <w:r>
+              <w:rPr>
+                <w:sz w:val="18"/>
+                <w:szCs w:val="18"/>
+              </w:rPr>
+              <w:t xml:space="preserve">Reportes adicionales y score</w:t>
+            </w:r>
+          </w:p>
+        </w:tc>
+        <w:tc>
+          <w:tcPr>
+            <w:tcW w:type="dxa" w:w="2410"/>
+            <w:tcMar>
+              <w:top w:type="dxa" w:w="60"/>
+              <w:left w:type="dxa" w:w="90"/>
+              <w:bottom w:type="dxa" w:w="60"/>
+              <w:right w:type="dxa" w:w="90"/>
+            </w:tcMar>
+          </w:tcPr>
+          <w:p>
+            <w:r>
+              <w:rPr>
+                <w:sz w:val="18"/>
+                <w:szCs w:val="18"/>
+              </w:rPr>
+              <w:t xml:space="preserve">Buró: reporte 47, Mi Score 58; Círculo: reporte desde 34.50, score 50 y 97</w:t>
+            </w:r>
+          </w:p>
+        </w:tc>
+        <w:tc>
+          <w:tcPr>
+            <w:tcW w:type="dxa" w:w="2410"/>
+            <w:tcMar>
+              <w:top w:type="dxa" w:w="60"/>
+              <w:left w:type="dxa" w:w="90"/>
+              <w:bottom w:type="dxa" w:w="60"/>
+              <w:right w:type="dxa" w:w="90"/>
+            </w:tcMar>
+          </w:tcPr>
+          <w:p>
+            <w:r>
+              <w:rPr>
+                <w:sz w:val="18"/>
+                <w:szCs w:val="18"/>
+              </w:rPr>
+              <w:t xml:space="preserve">Sitios oficiales; medios</w:t>
+            </w:r>
+          </w:p>
+        </w:tc>
+      </w:tr>
+      <w:tr>
+        <w:trPr>
+          <w:tblHeader w:val="off"/>
+        </w:trPr>
+        <w:tc>
+          <w:tcPr>
+            <w:tcW w:type="dxa" w:w="2410"/>
+            <w:tcMar>
+              <w:top w:type="dxa" w:w="60"/>
+              <w:left w:type="dxa" w:w="90"/>
+              <w:bottom w:type="dxa" w:w="60"/>
+              <w:right w:type="dxa" w:w="90"/>
+            </w:tcMar>
+          </w:tcPr>
+          <w:p>
+            <w:r>
+              <w:rPr>
+                <w:sz w:val="18"/>
+                <w:szCs w:val="18"/>
+              </w:rPr>
+              <w:t xml:space="preserve">E10</w:t>
+            </w:r>
+          </w:p>
+        </w:tc>
+        <w:tc>
+          <w:tcPr>
+            <w:tcW w:type="dxa" w:w="2410"/>
+            <w:tcMar>
+              <w:top w:type="dxa" w:w="60"/>
+              <w:left w:type="dxa" w:w="90"/>
+              <w:bottom w:type="dxa" w:w="60"/>
+              <w:right w:type="dxa" w:w="90"/>
+            </w:tcMar>
+          </w:tcPr>
+          <w:p>
+            <w:r>
+              <w:rPr>
+                <w:sz w:val="18"/>
+                <w:szCs w:val="18"/>
+              </w:rPr>
+              <w:t xml:space="preserve">Bloqueo y alertas</w:t>
+            </w:r>
+          </w:p>
+        </w:tc>
+        <w:tc>
+          <w:tcPr>
+            <w:tcW w:type="dxa" w:w="2410"/>
+            <w:tcMar>
+              <w:top w:type="dxa" w:w="60"/>
+              <w:left w:type="dxa" w:w="90"/>
+              <w:bottom w:type="dxa" w:w="60"/>
+              <w:right w:type="dxa" w:w="90"/>
+            </w:tcMar>
+          </w:tcPr>
+          <w:p>
+            <w:r>
+              <w:rPr>
+                <w:sz w:val="18"/>
+                <w:szCs w:val="18"/>
+              </w:rPr>
+              <w:t xml:space="preserve">Buró: bloqueo 58 por 3 meses, Alertas 232 al año; Círculo: bloqueo 3 meses, Avísame gratis, Avísame Mucho Más 250</w:t>
+            </w:r>
+          </w:p>
+        </w:tc>
+        <w:tc>
+          <w:tcPr>
+            <w:tcW w:type="dxa" w:w="2410"/>
+            <w:tcMar>
+              <w:top w:type="dxa" w:w="60"/>
+              <w:left w:type="dxa" w:w="90"/>
+              <w:bottom w:type="dxa" w:w="60"/>
+              <w:right w:type="dxa" w:w="90"/>
+            </w:tcMar>
+          </w:tcPr>
+          <w:p>
+            <w:r>
+              <w:rPr>
+                <w:sz w:val="18"/>
+                <w:szCs w:val="18"/>
+              </w:rPr>
+              <w:t xml:space="preserve">Sitios oficiales; medios</w:t>
+            </w:r>
+          </w:p>
+        </w:tc>
+      </w:tr>
+      <w:tr>
+        <w:trPr>
+          <w:tblHeader w:val="off"/>
+        </w:trPr>
+        <w:tc>
+          <w:tcPr>
+            <w:tcW w:type="dxa" w:w="2410"/>
+            <w:tcMar>
+              <w:top w:type="dxa" w:w="60"/>
+              <w:left w:type="dxa" w:w="90"/>
+              <w:bottom w:type="dxa" w:w="60"/>
+              <w:right w:type="dxa" w:w="90"/>
+            </w:tcMar>
+          </w:tcPr>
+          <w:p>
+            <w:r>
+              <w:rPr>
+                <w:sz w:val="18"/>
+                <w:szCs w:val="18"/>
+              </w:rPr>
+              <w:t xml:space="preserve">E11</w:t>
+            </w:r>
+          </w:p>
+        </w:tc>
+        <w:tc>
+          <w:tcPr>
+            <w:tcW w:type="dxa" w:w="2410"/>
+            <w:tcMar>
+              <w:top w:type="dxa" w:w="60"/>
+              <w:left w:type="dxa" w:w="90"/>
+              <w:bottom w:type="dxa" w:w="60"/>
+              <w:right w:type="dxa" w:w="90"/>
+            </w:tcMar>
+          </w:tcPr>
+          <w:p>
+            <w:r>
+              <w:rPr>
+                <w:sz w:val="18"/>
+                <w:szCs w:val="18"/>
+              </w:rPr>
+              <w:t xml:space="preserve">Horario de cobranza</w:t>
+            </w:r>
+          </w:p>
+        </w:tc>
+        <w:tc>
+          <w:tcPr>
+            <w:tcW w:type="dxa" w:w="2410"/>
+            <w:tcMar>
+              <w:top w:type="dxa" w:w="60"/>
+              <w:left w:type="dxa" w:w="90"/>
+              <w:bottom w:type="dxa" w:w="60"/>
+              <w:right w:type="dxa" w:w="90"/>
+            </w:tcMar>
+          </w:tcPr>
+          <w:p>
+            <w:r>
+              <w:rPr>
+                <w:sz w:val="18"/>
+                <w:szCs w:val="18"/>
+              </w:rPr>
+              <w:t xml:space="preserve">7:00 a 22:00 horas del huso horario del deudor</w:t>
+            </w:r>
+          </w:p>
+        </w:tc>
+        <w:tc>
+          <w:tcPr>
+            <w:tcW w:type="dxa" w:w="2410"/>
+            <w:tcMar>
+              <w:top w:type="dxa" w:w="60"/>
+              <w:left w:type="dxa" w:w="90"/>
+              <w:bottom w:type="dxa" w:w="60"/>
+              <w:right w:type="dxa" w:w="90"/>
+            </w:tcMar>
+          </w:tcPr>
+          <w:p>
+            <w:r>
+              <w:rPr>
+                <w:sz w:val="18"/>
+                <w:szCs w:val="18"/>
+              </w:rPr>
+              <w:t xml:space="preserve">Disposiciones CONDUSEF, DOF 7-oct-2014</w:t>
+            </w:r>
+          </w:p>
+        </w:tc>
+      </w:tr>
+      <w:tr>
+        <w:trPr>
+          <w:tblHeader w:val="off"/>
+        </w:trPr>
+        <w:tc>
+          <w:tcPr>
+            <w:tcW w:type="dxa" w:w="2410"/>
+            <w:tcMar>
+              <w:top w:type="dxa" w:w="60"/>
+              <w:left w:type="dxa" w:w="90"/>
+              <w:bottom w:type="dxa" w:w="60"/>
+              <w:right w:type="dxa" w:w="90"/>
+            </w:tcMar>
+          </w:tcPr>
+          <w:p>
+            <w:r>
+              <w:rPr>
+                <w:sz w:val="18"/>
+                <w:szCs w:val="18"/>
+              </w:rPr>
+              <w:t xml:space="preserve">E12</w:t>
+            </w:r>
+          </w:p>
+        </w:tc>
+        <w:tc>
+          <w:tcPr>
+            <w:tcW w:type="dxa" w:w="2410"/>
+            <w:tcMar>
+              <w:top w:type="dxa" w:w="60"/>
+              <w:left w:type="dxa" w:w="90"/>
+              <w:bottom w:type="dxa" w:w="60"/>
+              <w:right w:type="dxa" w:w="90"/>
+            </w:tcMar>
+          </w:tcPr>
+          <w:p>
+            <w:r>
+              <w:rPr>
+                <w:sz w:val="18"/>
+                <w:szCs w:val="18"/>
+              </w:rPr>
+              <w:t xml:space="preserve">Pago anticipado</w:t>
+            </w:r>
+          </w:p>
+        </w:tc>
+        <w:tc>
+          <w:tcPr>
+            <w:tcW w:type="dxa" w:w="2410"/>
+            <w:tcMar>
+              <w:top w:type="dxa" w:w="60"/>
+              <w:left w:type="dxa" w:w="90"/>
+              <w:bottom w:type="dxa" w:w="60"/>
+              <w:right w:type="dxa" w:w="90"/>
+            </w:tcMar>
+          </w:tcPr>
+          <w:p>
+            <w:r>
+              <w:rPr>
+                <w:sz w:val="18"/>
+                <w:szCs w:val="18"/>
+              </w:rPr>
+              <w:t xml:space="preserve">Derecho a pagos anticipados; comisión solo si está pactada y registrada; prohibida en hipotecarios salvo opción</w:t>
+            </w:r>
+          </w:p>
+        </w:tc>
+        <w:tc>
+          <w:tcPr>
+            <w:tcW w:type="dxa" w:w="2410"/>
+            <w:tcMar>
+              <w:top w:type="dxa" w:w="60"/>
+              <w:left w:type="dxa" w:w="90"/>
+              <w:bottom w:type="dxa" w:w="60"/>
+              <w:right w:type="dxa" w:w="90"/>
+            </w:tcMar>
+          </w:tcPr>
+          <w:p>
+            <w:r>
+              <w:rPr>
+                <w:sz w:val="18"/>
+                <w:szCs w:val="18"/>
+              </w:rPr>
+              <w:t xml:space="preserve">LTOSF; Circular 22/2010 y 8/2016</w:t>
+            </w:r>
+          </w:p>
+        </w:tc>
+      </w:tr>
+      <w:tr>
+        <w:trPr>
+          <w:tblHeader w:val="off"/>
+        </w:trPr>
+        <w:tc>
+          <w:tcPr>
+            <w:tcW w:type="dxa" w:w="2410"/>
+            <w:tcMar>
+              <w:top w:type="dxa" w:w="60"/>
+              <w:left w:type="dxa" w:w="90"/>
+              <w:bottom w:type="dxa" w:w="60"/>
+              <w:right w:type="dxa" w:w="90"/>
+            </w:tcMar>
+          </w:tcPr>
+          <w:p>
+            <w:r>
+              <w:rPr>
+                <w:sz w:val="18"/>
+                <w:szCs w:val="18"/>
+              </w:rPr>
+              <w:t xml:space="preserve">E13</w:t>
+            </w:r>
+          </w:p>
+        </w:tc>
+        <w:tc>
+          <w:tcPr>
+            <w:tcW w:type="dxa" w:w="2410"/>
+            <w:tcMar>
+              <w:top w:type="dxa" w:w="60"/>
+              <w:left w:type="dxa" w:w="90"/>
+              <w:bottom w:type="dxa" w:w="60"/>
+              <w:right w:type="dxa" w:w="90"/>
+            </w:tcMar>
+          </w:tcPr>
+          <w:p>
+            <w:r>
+              <w:rPr>
+                <w:sz w:val="18"/>
+                <w:szCs w:val="18"/>
+              </w:rPr>
+              <w:t xml:space="preserve">Regalías</w:t>
+            </w:r>
+          </w:p>
+        </w:tc>
+        <w:tc>
+          <w:tcPr>
+            <w:tcW w:type="dxa" w:w="2410"/>
+            <w:tcMar>
+              <w:top w:type="dxa" w:w="60"/>
+              <w:left w:type="dxa" w:w="90"/>
+              <w:bottom w:type="dxa" w:w="60"/>
+              <w:right w:type="dxa" w:w="90"/>
+            </w:tcMar>
+          </w:tcPr>
+          <w:p>
+            <w:r>
+              <w:rPr>
+                <w:sz w:val="18"/>
+                <w:szCs w:val="18"/>
+              </w:rPr>
+              <w:t xml:space="preserve">Exenciones para autores: ISR hasta 20 UMA (93-XXIX) e IVA (15-XVI); intérpretes, revisar con contador</w:t>
+            </w:r>
+          </w:p>
+        </w:tc>
+        <w:tc>
+          <w:tcPr>
+            <w:tcW w:type="dxa" w:w="2410"/>
+            <w:tcMar>
+              <w:top w:type="dxa" w:w="60"/>
+              <w:left w:type="dxa" w:w="90"/>
+              <w:bottom w:type="dxa" w:w="60"/>
+              <w:right w:type="dxa" w:w="90"/>
+            </w:tcMar>
+          </w:tcPr>
+          <w:p>
+            <w:r>
+              <w:rPr>
+                <w:sz w:val="18"/>
+                <w:szCs w:val="18"/>
+              </w:rPr>
+              <w:t xml:space="preserve">LISR; LIVA</w:t>
+            </w:r>
+          </w:p>
+        </w:tc>
+      </w:tr>
+      <w:tr>
+        <w:trPr>
+          <w:tblHeader w:val="off"/>
+        </w:trPr>
+        <w:tc>
+          <w:tcPr>
+            <w:tcW w:type="dxa" w:w="2410"/>
+            <w:tcMar>
+              <w:top w:type="dxa" w:w="60"/>
+              <w:left w:type="dxa" w:w="90"/>
+              <w:bottom w:type="dxa" w:w="60"/>
+              <w:right w:type="dxa" w:w="90"/>
+            </w:tcMar>
+          </w:tcPr>
+          <w:p>
+            <w:r>
+              <w:rPr>
+                <w:sz w:val="18"/>
+                <w:szCs w:val="18"/>
+              </w:rPr>
+              <w:t xml:space="preserve">E14</w:t>
+            </w:r>
+          </w:p>
+        </w:tc>
+        <w:tc>
+          <w:tcPr>
+            <w:tcW w:type="dxa" w:w="2410"/>
+            <w:tcMar>
+              <w:top w:type="dxa" w:w="60"/>
+              <w:left w:type="dxa" w:w="90"/>
+              <w:bottom w:type="dxa" w:w="60"/>
+              <w:right w:type="dxa" w:w="90"/>
+            </w:tcMar>
+          </w:tcPr>
+          <w:p>
+            <w:r>
+              <w:rPr>
+                <w:sz w:val="18"/>
+                <w:szCs w:val="18"/>
+              </w:rPr>
+              <w:t xml:space="preserve">ANDA, salud</w:t>
+            </w:r>
+          </w:p>
+        </w:tc>
+        <w:tc>
+          <w:tcPr>
+            <w:tcW w:type="dxa" w:w="2410"/>
+            <w:tcMar>
+              <w:top w:type="dxa" w:w="60"/>
+              <w:left w:type="dxa" w:w="90"/>
+              <w:bottom w:type="dxa" w:w="60"/>
+              <w:right w:type="dxa" w:w="90"/>
+            </w:tcMar>
+          </w:tcPr>
+          <w:p>
+            <w:r>
+              <w:rPr>
+                <w:sz w:val="18"/>
+                <w:szCs w:val="18"/>
+              </w:rPr>
+              <w:t xml:space="preserve">Clínicas para agremiados con cuota de consulta; servicio completo para activos al corriente</w:t>
+            </w:r>
+          </w:p>
+        </w:tc>
+        <w:tc>
+          <w:tcPr>
+            <w:tcW w:type="dxa" w:w="2410"/>
+            <w:tcMar>
+              <w:top w:type="dxa" w:w="60"/>
+              <w:left w:type="dxa" w:w="90"/>
+              <w:bottom w:type="dxa" w:w="60"/>
+              <w:right w:type="dxa" w:w="90"/>
+            </w:tcMar>
+          </w:tcPr>
+          <w:p>
+            <w:r>
+              <w:rPr>
+                <w:sz w:val="18"/>
+                <w:szCs w:val="18"/>
+              </w:rPr>
+              <w:t xml:space="preserve">ANDA; medios</w:t>
+            </w:r>
+          </w:p>
+        </w:tc>
+      </w:tr>
+      <w:tr>
+        <w:trPr>
+          <w:tblHeader w:val="off"/>
+        </w:trPr>
+        <w:tc>
+          <w:tcPr>
+            <w:tcW w:type="dxa" w:w="2410"/>
+            <w:tcMar>
+              <w:top w:type="dxa" w:w="60"/>
+              <w:left w:type="dxa" w:w="90"/>
+              <w:bottom w:type="dxa" w:w="60"/>
+              <w:right w:type="dxa" w:w="90"/>
+            </w:tcMar>
+          </w:tcPr>
+          <w:p>
+            <w:r>
+              <w:rPr>
+                <w:sz w:val="18"/>
+                <w:szCs w:val="18"/>
+              </w:rPr>
+              <w:t xml:space="preserve">E15</w:t>
+            </w:r>
+          </w:p>
+        </w:tc>
+        <w:tc>
+          <w:tcPr>
+            <w:tcW w:type="dxa" w:w="2410"/>
+            <w:tcMar>
+              <w:top w:type="dxa" w:w="60"/>
+              <w:left w:type="dxa" w:w="90"/>
+              <w:bottom w:type="dxa" w:w="60"/>
+              <w:right w:type="dxa" w:w="90"/>
+            </w:tcMar>
+          </w:tcPr>
+          <w:p>
+            <w:r>
+              <w:rPr>
+                <w:sz w:val="18"/>
+                <w:szCs w:val="18"/>
+              </w:rPr>
+              <w:t xml:space="preserve">Reserva de derechos y marca</w:t>
+            </w:r>
+          </w:p>
+        </w:tc>
+        <w:tc>
+          <w:tcPr>
+            <w:tcW w:type="dxa" w:w="2410"/>
+            <w:tcMar>
+              <w:top w:type="dxa" w:w="60"/>
+              <w:left w:type="dxa" w:w="90"/>
+              <w:bottom w:type="dxa" w:w="60"/>
+              <w:right w:type="dxa" w:w="90"/>
+            </w:tcMar>
+          </w:tcPr>
+          <w:p>
+            <w:r>
+              <w:rPr>
+                <w:sz w:val="18"/>
+                <w:szCs w:val="18"/>
+              </w:rPr>
+              <w:t xml:space="preserve">INDAUTOR: 5 años, 5,739 (renovación 2,892); IMPI: 10 años, 2,695.18 más IVA por clase, uso a los 3 años</w:t>
+            </w:r>
+          </w:p>
+        </w:tc>
+        <w:tc>
+          <w:tcPr>
+            <w:tcW w:type="dxa" w:w="2410"/>
+            <w:tcMar>
+              <w:top w:type="dxa" w:w="60"/>
+              <w:left w:type="dxa" w:w="90"/>
+              <w:bottom w:type="dxa" w:w="60"/>
+              <w:right w:type="dxa" w:w="90"/>
+            </w:tcMar>
+          </w:tcPr>
+          <w:p>
+            <w:r>
+              <w:rPr>
+                <w:sz w:val="18"/>
+                <w:szCs w:val="18"/>
+              </w:rPr>
+              <w:t xml:space="preserve">Tarifas 2026</w:t>
+            </w:r>
+          </w:p>
+        </w:tc>
+      </w:tr>
+      <w:tr>
+        <w:trPr>
+          <w:tblHeader w:val="off"/>
+        </w:trPr>
+        <w:tc>
+          <w:tcPr>
+            <w:tcW w:type="dxa" w:w="2410"/>
+            <w:tcMar>
+              <w:top w:type="dxa" w:w="60"/>
+              <w:left w:type="dxa" w:w="90"/>
+              <w:bottom w:type="dxa" w:w="60"/>
+              <w:right w:type="dxa" w:w="90"/>
+            </w:tcMar>
+          </w:tcPr>
+          <w:p>
+            <w:r>
+              <w:rPr>
+                <w:sz w:val="18"/>
+                <w:szCs w:val="18"/>
+              </w:rPr>
+              <w:t xml:space="preserve">E16</w:t>
+            </w:r>
+          </w:p>
+        </w:tc>
+        <w:tc>
+          <w:tcPr>
+            <w:tcW w:type="dxa" w:w="2410"/>
+            <w:tcMar>
+              <w:top w:type="dxa" w:w="60"/>
+              <w:left w:type="dxa" w:w="90"/>
+              <w:bottom w:type="dxa" w:w="60"/>
+              <w:right w:type="dxa" w:w="90"/>
+            </w:tcMar>
+          </w:tcPr>
+          <w:p>
+            <w:r>
+              <w:rPr>
+                <w:sz w:val="18"/>
+                <w:szCs w:val="18"/>
+              </w:rPr>
+              <w:t xml:space="preserve">Mes del Testamento 2026</w:t>
+            </w:r>
+          </w:p>
+        </w:tc>
+        <w:tc>
+          <w:tcPr>
+            <w:tcW w:type="dxa" w:w="2410"/>
+            <w:tcMar>
+              <w:top w:type="dxa" w:w="60"/>
+              <w:left w:type="dxa" w:w="90"/>
+              <w:bottom w:type="dxa" w:w="60"/>
+              <w:right w:type="dxa" w:w="90"/>
+            </w:tcMar>
+          </w:tcPr>
+          <w:p>
+            <w:r>
+              <w:rPr>
+                <w:sz w:val="18"/>
+                <w:szCs w:val="18"/>
+              </w:rPr>
+              <w:t xml:space="preserve">Hasta 50% de descuento; desde unos 2,750 pesos</w:t>
+            </w:r>
+          </w:p>
+        </w:tc>
+        <w:tc>
+          <w:tcPr>
+            <w:tcW w:type="dxa" w:w="2410"/>
+            <w:tcMar>
+              <w:top w:type="dxa" w:w="60"/>
+              <w:left w:type="dxa" w:w="90"/>
+              <w:bottom w:type="dxa" w:w="60"/>
+              <w:right w:type="dxa" w:w="90"/>
+            </w:tcMar>
+          </w:tcPr>
+          <w:p>
+            <w:r>
+              <w:rPr>
+                <w:sz w:val="18"/>
+                <w:szCs w:val="18"/>
+              </w:rPr>
+              <w:t xml:space="preserve">Segob; medios</w:t>
+            </w:r>
+          </w:p>
+        </w:tc>
+      </w:tr>
+      <w:tr>
+        <w:trPr>
+          <w:tblHeader w:val="off"/>
+        </w:trPr>
+        <w:tc>
+          <w:tcPr>
+            <w:tcW w:type="dxa" w:w="2410"/>
+            <w:tcMar>
+              <w:top w:type="dxa" w:w="60"/>
+              <w:left w:type="dxa" w:w="90"/>
+              <w:bottom w:type="dxa" w:w="60"/>
+              <w:right w:type="dxa" w:w="90"/>
+            </w:tcMar>
+          </w:tcPr>
+          <w:p>
+            <w:r>
+              <w:rPr>
+                <w:sz w:val="18"/>
+                <w:szCs w:val="18"/>
+              </w:rPr>
+              <w:t xml:space="preserve">E17</w:t>
+            </w:r>
+          </w:p>
+        </w:tc>
+        <w:tc>
+          <w:tcPr>
+            <w:tcW w:type="dxa" w:w="2410"/>
+            <w:tcMar>
+              <w:top w:type="dxa" w:w="60"/>
+              <w:left w:type="dxa" w:w="90"/>
+              <w:bottom w:type="dxa" w:w="60"/>
+              <w:right w:type="dxa" w:w="90"/>
+            </w:tcMar>
+          </w:tcPr>
+          <w:p>
+            <w:r>
+              <w:rPr>
+                <w:sz w:val="18"/>
+                <w:szCs w:val="18"/>
+              </w:rPr>
+              <w:t xml:space="preserve">Infonavit y escrituración</w:t>
+            </w:r>
+          </w:p>
+        </w:tc>
+        <w:tc>
+          <w:tcPr>
+            <w:tcW w:type="dxa" w:w="2410"/>
+            <w:tcMar>
+              <w:top w:type="dxa" w:w="60"/>
+              <w:left w:type="dxa" w:w="90"/>
+              <w:bottom w:type="dxa" w:w="60"/>
+              <w:right w:type="dxa" w:w="90"/>
+            </w:tcMar>
+          </w:tcPr>
+          <w:p>
+            <w:r>
+              <w:rPr>
+                <w:sz w:val="18"/>
+                <w:szCs w:val="18"/>
+              </w:rPr>
+              <w:t xml:space="preserve">Crédito vía Modalidad 10 con aportación de 5%; escrituración de 4% a 7%</w:t>
+            </w:r>
+          </w:p>
+        </w:tc>
+        <w:tc>
+          <w:tcPr>
+            <w:tcW w:type="dxa" w:w="2410"/>
+            <w:tcMar>
+              <w:top w:type="dxa" w:w="60"/>
+              <w:left w:type="dxa" w:w="90"/>
+              <w:bottom w:type="dxa" w:w="60"/>
+              <w:right w:type="dxa" w:w="90"/>
+            </w:tcMar>
+          </w:tcPr>
+          <w:p>
+            <w:r>
+              <w:rPr>
+                <w:sz w:val="18"/>
+                <w:szCs w:val="18"/>
+              </w:rPr>
+              <w:t xml:space="preserve">IMSS; Infonavit; medios</w:t>
+            </w:r>
+          </w:p>
+        </w:tc>
+      </w:tr>
+      <w:tr>
+        <w:trPr>
+          <w:tblHeader w:val="off"/>
+        </w:trPr>
+        <w:tc>
+          <w:tcPr>
+            <w:tcW w:type="dxa" w:w="2410"/>
+            <w:tcMar>
+              <w:top w:type="dxa" w:w="60"/>
+              <w:left w:type="dxa" w:w="90"/>
+              <w:bottom w:type="dxa" w:w="60"/>
+              <w:right w:type="dxa" w:w="90"/>
+            </w:tcMar>
+          </w:tcPr>
+          <w:p>
+            <w:r>
+              <w:rPr>
+                <w:sz w:val="18"/>
+                <w:szCs w:val="18"/>
+              </w:rPr>
+              <w:t xml:space="preserve">E18</w:t>
+            </w:r>
+          </w:p>
+        </w:tc>
+        <w:tc>
+          <w:tcPr>
+            <w:tcW w:type="dxa" w:w="2410"/>
+            <w:tcMar>
+              <w:top w:type="dxa" w:w="60"/>
+              <w:left w:type="dxa" w:w="90"/>
+              <w:bottom w:type="dxa" w:w="60"/>
+              <w:right w:type="dxa" w:w="90"/>
+            </w:tcMar>
+          </w:tcPr>
+          <w:p>
+            <w:r>
+              <w:rPr>
+                <w:sz w:val="18"/>
+                <w:szCs w:val="18"/>
+              </w:rPr>
+              <w:t xml:space="preserve">Seguro de voz</w:t>
+            </w:r>
+          </w:p>
+        </w:tc>
+        <w:tc>
+          <w:tcPr>
+            <w:tcW w:type="dxa" w:w="2410"/>
+            <w:tcMar>
+              <w:top w:type="dxa" w:w="60"/>
+              <w:left w:type="dxa" w:w="90"/>
+              <w:bottom w:type="dxa" w:w="60"/>
+              <w:right w:type="dxa" w:w="90"/>
+            </w:tcMar>
+          </w:tcPr>
+          <w:p>
+            <w:r>
+              <w:rPr>
+                <w:sz w:val="18"/>
+                <w:szCs w:val="18"/>
+              </w:rPr>
+              <w:t xml:space="preserve">Sin producto estándar en México; combinar accidentes personales, gastos médicos e IMSS</w:t>
+            </w:r>
+          </w:p>
+        </w:tc>
+        <w:tc>
+          <w:tcPr>
+            <w:tcW w:type="dxa" w:w="2410"/>
+            <w:tcMar>
+              <w:top w:type="dxa" w:w="60"/>
+              <w:left w:type="dxa" w:w="90"/>
+              <w:bottom w:type="dxa" w:w="60"/>
+              <w:right w:type="dxa" w:w="90"/>
+            </w:tcMar>
+          </w:tcPr>
+          <w:p>
+            <w:r>
+              <w:rPr>
+                <w:sz w:val="18"/>
+                <w:szCs w:val="18"/>
+              </w:rPr>
+              <w:t xml:space="preserve">Búsqueda de mercado</w:t>
+            </w:r>
+          </w:p>
+        </w:tc>
+      </w:tr>
+      <w:tr>
+        <w:trPr>
+          <w:tblHeader w:val="off"/>
+        </w:trPr>
+        <w:tc>
+          <w:tcPr>
+            <w:tcW w:type="dxa" w:w="2410"/>
+            <w:tcMar>
+              <w:top w:type="dxa" w:w="60"/>
+              <w:left w:type="dxa" w:w="90"/>
+              <w:bottom w:type="dxa" w:w="60"/>
+              <w:right w:type="dxa" w:w="90"/>
+            </w:tcMar>
+          </w:tcPr>
+          <w:p>
+            <w:r>
+              <w:rPr>
+                <w:sz w:val="18"/>
+                <w:szCs w:val="18"/>
+              </w:rPr>
+              <w:t xml:space="preserve">E19</w:t>
+            </w:r>
+          </w:p>
+        </w:tc>
+        <w:tc>
+          <w:tcPr>
+            <w:tcW w:type="dxa" w:w="2410"/>
+            <w:tcMar>
+              <w:top w:type="dxa" w:w="60"/>
+              <w:left w:type="dxa" w:w="90"/>
+              <w:bottom w:type="dxa" w:w="60"/>
+              <w:right w:type="dxa" w:w="90"/>
+            </w:tcMar>
+          </w:tcPr>
+          <w:p>
+            <w:r>
+              <w:rPr>
+                <w:sz w:val="18"/>
+                <w:szCs w:val="18"/>
+              </w:rPr>
+              <w:t xml:space="preserve">Policía cibernética</w:t>
+            </w:r>
+          </w:p>
+        </w:tc>
+        <w:tc>
+          <w:tcPr>
+            <w:tcW w:type="dxa" w:w="2410"/>
+            <w:tcMar>
+              <w:top w:type="dxa" w:w="60"/>
+              <w:left w:type="dxa" w:w="90"/>
+              <w:bottom w:type="dxa" w:w="60"/>
+              <w:right w:type="dxa" w:w="90"/>
+            </w:tcMar>
+          </w:tcPr>
+          <w:p>
+            <w:r>
+              <w:rPr>
+                <w:sz w:val="18"/>
+                <w:szCs w:val="18"/>
+              </w:rPr>
+              <w:t xml:space="preserve">088 de la Guardia Nacional</w:t>
+            </w:r>
+          </w:p>
+        </w:tc>
+        <w:tc>
+          <w:tcPr>
+            <w:tcW w:type="dxa" w:w="2410"/>
+            <w:tcMar>
+              <w:top w:type="dxa" w:w="60"/>
+              <w:left w:type="dxa" w:w="90"/>
+              <w:bottom w:type="dxa" w:w="60"/>
+              <w:right w:type="dxa" w:w="90"/>
+            </w:tcMar>
+          </w:tcPr>
+          <w:p>
+            <w:r>
+              <w:rPr>
+                <w:sz w:val="18"/>
+                <w:szCs w:val="18"/>
+              </w:rPr>
+              <w:t xml:space="preserve">Guardia Nacional CERT-MX</w:t>
             </w:r>
           </w:p>
         </w:tc>
       </w:tr>
     </w:tbl>
     <w:p/>
+    <w:p>
+      <w:r>
+        <w:rPr>
+          <w:b/>
+          <w:bCs/>
+        </w:rPr>
+        <w:t xml:space="preserve">Quedan dos confirmaciones que conviene hacer en el sitio oficial antes de publicar:</w:t>
+      </w:r>
+      <w:r>
+        <w:t xml:space="preserve"> que los productos de ahorro de Nu ya estén en el banco (padrón de la CNBV) y los precios de Buró y Círculo del día (los sitios oficiales no fueron accesibles desde el entorno de trabajo; los montos vienen de fuentes que citan esos sitios).</w:t>
+      </w:r>
+    </w:p>
     <w:sectPr>
       <w:footerReference w:type="default" r:id="rId6"/>
       <w:pgSz w:w="12240" w:h="15840" w:orient="portrait"/>

</xml_diff>

<commit_message>
Tu Talento v1.2: lección M9 U08 sobre REPEP, REUS y líneas con CURP
Nueva lección para dejar de recibir llamadas y mensajes de publicidad
(REPEP de Profeco y REUS de CONDUSEF), qué no cubren, cómo denunciar,
consulta y desvinculación de líneas con CURP y registros falsos.
El plan de respuesta pasa a M9 U09. Se actualizan H5P (73), banco (219),
libro de apoyo, manual (E20-E22), guías y comunidad v1.1.

Co-Authored-By: Claude Opus 5.5 <noreply@anthropic.com>
Claude-Session: https://claude.ai/code/session_01P5F6YBSbmgYFHyY7RUeBgK
</commit_message>
<xml_diff>
--- a/proyecto-entretenimiento/manual/TTMF_manual_v2.docx
+++ b/proyecto-entretenimiento/manual/TTMF_manual_v2.docx
@@ -32,7 +32,7 @@
           <w:sz w:val="28"/>
           <w:szCs w:val="28"/>
         </w:rPr>
-        <w:t xml:space="preserve">Manual del programa · Versión 2.2 · Septiembre de 2026</w:t>
+        <w:t xml:space="preserve">Manual del programa · Versión 2.3 · Septiembre de 2026</w:t>
       </w:r>
     </w:p>
     <w:p>
@@ -379,7 +379,7 @@
                 <w:sz w:val="18"/>
                 <w:szCs w:val="18"/>
               </w:rPr>
-              <w:t xml:space="preserve">11 módulos, 72 lecciones de 5 a 10 minutos</w:t>
+              <w:t xml:space="preserve">11 módulos, 73 lecciones de 5 a 10 minutos</w:t>
             </w:r>
           </w:p>
         </w:tc>
@@ -3880,7 +3880,19 @@
           <w:b/>
           <w:bCs/>
         </w:rPr>
-        <w:t xml:space="preserve">M9 U08 · Si ya te pasó: tu plan de respuesta</w:t>
+        <w:t xml:space="preserve">M9 U08 · Que dejen de llamarte: REPEP, REUS y tu línea</w:t>
+      </w:r>
+      <w:r>
+        <w:t xml:space="preserve"> Objetivo: inscribir tus números en el REPEP de Profeco (publicidad de bienes y servicios; gratis, fijo o celular, 30 días para que dejen de llamar, sin vencimiento) y en el REUS de CONDUSEF (publicidad de instituciones financieras; hasta 45 días, dura dos años). Saber qué no cubren (cobranza, partidos, encuestas, beneficencia y fraudes), denunciar con evidencia, consultar las líneas registradas con tu CURP y desvincular las que no son tuyas. Reconocer "registros" falsos que cobran. Gancho: a Gael le llaman ocho veces al día para venderle algo; entre esas llamadas pierde la de un casting y contesta una de fraude.</w:t>
+      </w:r>
+    </w:p>
+    <w:p>
+      <w:r>
+        <w:rPr>
+          <w:b/>
+          <w:bCs/>
+        </w:rPr>
+        <w:t xml:space="preserve">M9 U09 · Si ya te pasó: tu plan de respuesta</w:t>
       </w:r>
       <w:r>
         <w:t xml:space="preserve"> Objetivo: seguir los pasos en orden: bloquear tarjetas y accesos, llamar a tu institución por el número oficial, reclamar por escrito, reportar a CONDUSEF, denunciar ante el Ministerio Público o la policía cibernética de tu estado, y avisar a tu comunidad sin exponer tus datos. Guardar evidencia.</w:t>
@@ -5094,7 +5106,7 @@
                 <w:sz w:val="18"/>
                 <w:szCs w:val="18"/>
               </w:rPr>
-              <w:t xml:space="preserve">Módulo 9 completo: fraudes, falsos castings, phishing, robo de identidad, robo de cuentas, montadeudas, inversiones milagro y plan de respuesta</w:t>
+              <w:t xml:space="preserve">Módulo 9 completo: fraudes, falsos castings, phishing, robo de identidad, robo de cuentas, montadeudas, inversiones milagro, registros para que no te llamen con publicidad (REPEP y REUS) y plan de respuesta</w:t>
             </w:r>
           </w:p>
         </w:tc>
@@ -5159,7 +5171,7 @@
                 <w:sz w:val="18"/>
                 <w:szCs w:val="18"/>
               </w:rPr>
-              <w:t xml:space="preserve">Módulo 10 (6 lecciones) y Módulo 11 (8 lecciones)</w:t>
+              <w:t xml:space="preserve">Módulo 10 (6 lecciones) y Módulo 11 (9 lecciones)</w:t>
             </w:r>
           </w:p>
         </w:tc>
@@ -6515,6 +6527,136 @@
                 <w:sz w:val="18"/>
                 <w:szCs w:val="18"/>
               </w:rPr>
+              <w:t xml:space="preserve">Profeco, REPEP</w:t>
+            </w:r>
+          </w:p>
+        </w:tc>
+        <w:tc>
+          <w:tcPr>
+            <w:tcW w:type="dxa" w:w="3213"/>
+            <w:tcMar>
+              <w:top w:type="dxa" w:w="60"/>
+              <w:left w:type="dxa" w:w="90"/>
+              <w:bottom w:type="dxa" w:w="60"/>
+              <w:right w:type="dxa" w:w="90"/>
+            </w:tcMar>
+          </w:tcPr>
+          <w:p>
+            <w:r>
+              <w:rPr>
+                <w:sz w:val="18"/>
+                <w:szCs w:val="18"/>
+              </w:rPr>
+              <w:t xml:space="preserve">https://repep.profeco.gob.mx</w:t>
+            </w:r>
+          </w:p>
+        </w:tc>
+        <w:tc>
+          <w:tcPr>
+            <w:tcW w:type="dxa" w:w="3214"/>
+            <w:tcMar>
+              <w:top w:type="dxa" w:w="60"/>
+              <w:left w:type="dxa" w:w="90"/>
+              <w:bottom w:type="dxa" w:w="60"/>
+              <w:right w:type="dxa" w:w="90"/>
+            </w:tcMar>
+          </w:tcPr>
+          <w:p>
+            <w:r>
+              <w:rPr>
+                <w:sz w:val="18"/>
+                <w:szCs w:val="18"/>
+              </w:rPr>
+              <w:t xml:space="preserve">Registrar tu teléfono para no recibir publicidad y denunciar</w:t>
+            </w:r>
+          </w:p>
+        </w:tc>
+      </w:tr>
+      <w:tr>
+        <w:trPr>
+          <w:tblHeader w:val="off"/>
+        </w:trPr>
+        <w:tc>
+          <w:tcPr>
+            <w:tcW w:type="dxa" w:w="3213"/>
+            <w:tcMar>
+              <w:top w:type="dxa" w:w="60"/>
+              <w:left w:type="dxa" w:w="90"/>
+              <w:bottom w:type="dxa" w:w="60"/>
+              <w:right w:type="dxa" w:w="90"/>
+            </w:tcMar>
+          </w:tcPr>
+          <w:p>
+            <w:r>
+              <w:rPr>
+                <w:sz w:val="18"/>
+                <w:szCs w:val="18"/>
+              </w:rPr>
+              <w:t xml:space="preserve">Comisión Reguladora de Telecomunicaciones</w:t>
+            </w:r>
+          </w:p>
+        </w:tc>
+        <w:tc>
+          <w:tcPr>
+            <w:tcW w:type="dxa" w:w="3213"/>
+            <w:tcMar>
+              <w:top w:type="dxa" w:w="60"/>
+              <w:left w:type="dxa" w:w="90"/>
+              <w:bottom w:type="dxa" w:w="60"/>
+              <w:right w:type="dxa" w:w="90"/>
+            </w:tcMar>
+          </w:tcPr>
+          <w:p>
+            <w:r>
+              <w:rPr>
+                <w:sz w:val="18"/>
+                <w:szCs w:val="18"/>
+              </w:rPr>
+              <w:t xml:space="preserve">https://portal.crt.gob.mx</w:t>
+            </w:r>
+          </w:p>
+        </w:tc>
+        <w:tc>
+          <w:tcPr>
+            <w:tcW w:type="dxa" w:w="3214"/>
+            <w:tcMar>
+              <w:top w:type="dxa" w:w="60"/>
+              <w:left w:type="dxa" w:w="90"/>
+              <w:bottom w:type="dxa" w:w="60"/>
+              <w:right w:type="dxa" w:w="90"/>
+            </w:tcMar>
+          </w:tcPr>
+          <w:p>
+            <w:r>
+              <w:rPr>
+                <w:sz w:val="18"/>
+                <w:szCs w:val="18"/>
+              </w:rPr>
+              <w:t xml:space="preserve">Consultar y desvincular líneas registradas con tu CURP</w:t>
+            </w:r>
+          </w:p>
+        </w:tc>
+      </w:tr>
+      <w:tr>
+        <w:trPr>
+          <w:tblHeader w:val="off"/>
+        </w:trPr>
+        <w:tc>
+          <w:tcPr>
+            <w:tcW w:type="dxa" w:w="3213"/>
+            <w:tcMar>
+              <w:top w:type="dxa" w:w="60"/>
+              <w:left w:type="dxa" w:w="90"/>
+              <w:bottom w:type="dxa" w:w="60"/>
+              <w:right w:type="dxa" w:w="90"/>
+            </w:tcMar>
+          </w:tcPr>
+          <w:p>
+            <w:r>
+              <w:rPr>
+                <w:sz w:val="18"/>
+                <w:szCs w:val="18"/>
+              </w:rPr>
               <w:t xml:space="preserve">Círculo de Crédito</w:t>
             </w:r>
           </w:p>
@@ -9112,6 +9254,261 @@
                 <w:szCs w:val="18"/>
               </w:rPr>
               <w:t xml:space="preserve">Guardia Nacional CERT-MX</w:t>
+            </w:r>
+          </w:p>
+        </w:tc>
+      </w:tr>
+      <w:tr>
+        <w:trPr>
+          <w:tblHeader w:val="off"/>
+        </w:trPr>
+        <w:tc>
+          <w:tcPr>
+            <w:tcW w:type="dxa" w:w="2410"/>
+            <w:tcMar>
+              <w:top w:type="dxa" w:w="60"/>
+              <w:left w:type="dxa" w:w="90"/>
+              <w:bottom w:type="dxa" w:w="60"/>
+              <w:right w:type="dxa" w:w="90"/>
+            </w:tcMar>
+          </w:tcPr>
+          <w:p>
+            <w:r>
+              <w:rPr>
+                <w:sz w:val="18"/>
+                <w:szCs w:val="18"/>
+              </w:rPr>
+              <w:t xml:space="preserve">E20</w:t>
+            </w:r>
+          </w:p>
+        </w:tc>
+        <w:tc>
+          <w:tcPr>
+            <w:tcW w:type="dxa" w:w="2410"/>
+            <w:tcMar>
+              <w:top w:type="dxa" w:w="60"/>
+              <w:left w:type="dxa" w:w="90"/>
+              <w:bottom w:type="dxa" w:w="60"/>
+              <w:right w:type="dxa" w:w="90"/>
+            </w:tcMar>
+          </w:tcPr>
+          <w:p>
+            <w:r>
+              <w:rPr>
+                <w:sz w:val="18"/>
+                <w:szCs w:val="18"/>
+              </w:rPr>
+              <w:t xml:space="preserve">REPEP</w:t>
+            </w:r>
+          </w:p>
+        </w:tc>
+        <w:tc>
+          <w:tcPr>
+            <w:tcW w:type="dxa" w:w="2410"/>
+            <w:tcMar>
+              <w:top w:type="dxa" w:w="60"/>
+              <w:left w:type="dxa" w:w="90"/>
+              <w:bottom w:type="dxa" w:w="60"/>
+              <w:right w:type="dxa" w:w="90"/>
+            </w:tcMar>
+          </w:tcPr>
+          <w:p>
+            <w:r>
+              <w:rPr>
+                <w:sz w:val="18"/>
+                <w:szCs w:val="18"/>
+              </w:rPr>
+              <w:t xml:space="preserve">Gratis, fijo o celular, en repep.profeco.gob.mx o 55 5568 8722 / 800 468 8722; 30 días para dejar de llamar; sin vencimiento; no cubre cobranza, partidos, beneficencia ni encuestas</w:t>
+            </w:r>
+          </w:p>
+        </w:tc>
+        <w:tc>
+          <w:tcPr>
+            <w:tcW w:type="dxa" w:w="2410"/>
+            <w:tcMar>
+              <w:top w:type="dxa" w:w="60"/>
+              <w:left w:type="dxa" w:w="90"/>
+              <w:bottom w:type="dxa" w:w="60"/>
+              <w:right w:type="dxa" w:w="90"/>
+            </w:tcMar>
+          </w:tcPr>
+          <w:p>
+            <w:r>
+              <w:rPr>
+                <w:sz w:val="18"/>
+                <w:szCs w:val="18"/>
+              </w:rPr>
+              <w:t xml:space="preserve">Profeco</w:t>
+            </w:r>
+          </w:p>
+        </w:tc>
+      </w:tr>
+      <w:tr>
+        <w:trPr>
+          <w:tblHeader w:val="off"/>
+        </w:trPr>
+        <w:tc>
+          <w:tcPr>
+            <w:tcW w:type="dxa" w:w="2410"/>
+            <w:tcMar>
+              <w:top w:type="dxa" w:w="60"/>
+              <w:left w:type="dxa" w:w="90"/>
+              <w:bottom w:type="dxa" w:w="60"/>
+              <w:right w:type="dxa" w:w="90"/>
+            </w:tcMar>
+          </w:tcPr>
+          <w:p>
+            <w:r>
+              <w:rPr>
+                <w:sz w:val="18"/>
+                <w:szCs w:val="18"/>
+              </w:rPr>
+              <w:t xml:space="preserve">E21</w:t>
+            </w:r>
+          </w:p>
+        </w:tc>
+        <w:tc>
+          <w:tcPr>
+            <w:tcW w:type="dxa" w:w="2410"/>
+            <w:tcMar>
+              <w:top w:type="dxa" w:w="60"/>
+              <w:left w:type="dxa" w:w="90"/>
+              <w:bottom w:type="dxa" w:w="60"/>
+              <w:right w:type="dxa" w:w="90"/>
+            </w:tcMar>
+          </w:tcPr>
+          <w:p>
+            <w:r>
+              <w:rPr>
+                <w:sz w:val="18"/>
+                <w:szCs w:val="18"/>
+              </w:rPr>
+              <w:t xml:space="preserve">REUS</w:t>
+            </w:r>
+          </w:p>
+        </w:tc>
+        <w:tc>
+          <w:tcPr>
+            <w:tcW w:type="dxa" w:w="2410"/>
+            <w:tcMar>
+              <w:top w:type="dxa" w:w="60"/>
+              <w:left w:type="dxa" w:w="90"/>
+              <w:bottom w:type="dxa" w:w="60"/>
+              <w:right w:type="dxa" w:w="90"/>
+            </w:tcMar>
+          </w:tcPr>
+          <w:p>
+            <w:r>
+              <w:rPr>
+                <w:sz w:val="18"/>
+                <w:szCs w:val="18"/>
+              </w:rPr>
+              <w:t xml:space="preserve">Hasta 45 días naturales para aplicar; vigencia de dos años; 55 5340 0999 / 800 999 8080</w:t>
+            </w:r>
+          </w:p>
+        </w:tc>
+        <w:tc>
+          <w:tcPr>
+            <w:tcW w:type="dxa" w:w="2410"/>
+            <w:tcMar>
+              <w:top w:type="dxa" w:w="60"/>
+              <w:left w:type="dxa" w:w="90"/>
+              <w:bottom w:type="dxa" w:w="60"/>
+              <w:right w:type="dxa" w:w="90"/>
+            </w:tcMar>
+          </w:tcPr>
+          <w:p>
+            <w:r>
+              <w:rPr>
+                <w:sz w:val="18"/>
+                <w:szCs w:val="18"/>
+              </w:rPr>
+              <w:t xml:space="preserve">CONDUSEF; Reglas del Registro Público de Usuarios (DOF)</w:t>
+            </w:r>
+          </w:p>
+        </w:tc>
+      </w:tr>
+      <w:tr>
+        <w:trPr>
+          <w:tblHeader w:val="off"/>
+        </w:trPr>
+        <w:tc>
+          <w:tcPr>
+            <w:tcW w:type="dxa" w:w="2410"/>
+            <w:tcMar>
+              <w:top w:type="dxa" w:w="60"/>
+              <w:left w:type="dxa" w:w="90"/>
+              <w:bottom w:type="dxa" w:w="60"/>
+              <w:right w:type="dxa" w:w="90"/>
+            </w:tcMar>
+          </w:tcPr>
+          <w:p>
+            <w:r>
+              <w:rPr>
+                <w:sz w:val="18"/>
+                <w:szCs w:val="18"/>
+              </w:rPr>
+              <w:t xml:space="preserve">E22</w:t>
+            </w:r>
+          </w:p>
+        </w:tc>
+        <w:tc>
+          <w:tcPr>
+            <w:tcW w:type="dxa" w:w="2410"/>
+            <w:tcMar>
+              <w:top w:type="dxa" w:w="60"/>
+              <w:left w:type="dxa" w:w="90"/>
+              <w:bottom w:type="dxa" w:w="60"/>
+              <w:right w:type="dxa" w:w="90"/>
+            </w:tcMar>
+          </w:tcPr>
+          <w:p>
+            <w:r>
+              <w:rPr>
+                <w:sz w:val="18"/>
+                <w:szCs w:val="18"/>
+              </w:rPr>
+              <w:t xml:space="preserve">Líneas móviles y CURP</w:t>
+            </w:r>
+          </w:p>
+        </w:tc>
+        <w:tc>
+          <w:tcPr>
+            <w:tcW w:type="dxa" w:w="2410"/>
+            <w:tcMar>
+              <w:top w:type="dxa" w:w="60"/>
+              <w:left w:type="dxa" w:w="90"/>
+              <w:bottom w:type="dxa" w:w="60"/>
+              <w:right w:type="dxa" w:w="90"/>
+            </w:tcMar>
+          </w:tcPr>
+          <w:p>
+            <w:r>
+              <w:rPr>
+                <w:sz w:val="18"/>
+                <w:szCs w:val="18"/>
+              </w:rPr>
+              <w:t xml:space="preserve">Registro obligatorio desde el 9-ene-2026, escalonado por terminación, plazo final 31-dic-2026; consulta y desvinculación gratuitas</w:t>
+            </w:r>
+          </w:p>
+        </w:tc>
+        <w:tc>
+          <w:tcPr>
+            <w:tcW w:type="dxa" w:w="2410"/>
+            <w:tcMar>
+              <w:top w:type="dxa" w:w="60"/>
+              <w:left w:type="dxa" w:w="90"/>
+              <w:bottom w:type="dxa" w:w="60"/>
+              <w:right w:type="dxa" w:w="90"/>
+            </w:tcMar>
+          </w:tcPr>
+          <w:p>
+            <w:r>
+              <w:rPr>
+                <w:sz w:val="18"/>
+                <w:szCs w:val="18"/>
+              </w:rPr>
+              <w:t xml:space="preserve">Comisión Reguladora de Telecomunicaciones</w:t>
             </w:r>
           </w:p>
         </w:tc>

</xml_diff>

<commit_message>
Versión final limpia de los cuatro cursos, sin parches
- Manual del operador de Tu Dinero v3.0 (ES/EN): estructura de lección,
  H5P, evaluación, insignias y constancia como están en Moodle; sin
  historial de cambios. Se retiran los manuales v2.0 y del participante v2.1.
- Instalador único de Tu Dinero ES, sin depender del de actualización.
- READMEs de instalación independientes; LEEMEs sin notas de versiones.
- Manual de Tu Talento v2.3 sin la sección de cambios.
- Carpetas finales completas (manual, contenido, guía y paquete de Moodle);
  las entregas anteriores pasan a entregas/archivo_versiones_anteriores.

Co-Authored-By: Claude Opus 5.5 <noreply@anthropic.com>
Claude-Session: https://claude.ai/code/session_01P5F6YBSbmgYFHyY7RUeBgK
</commit_message>
<xml_diff>
--- a/proyecto-entretenimiento/manual/TTMF_manual_v2.docx
+++ b/proyecto-entretenimiento/manual/TTMF_manual_v2.docx
@@ -50,7 +50,7 @@
     </w:p>
     <w:p>
       <w:r>
-        <w:t xml:space="preserve">Manual del programa · Versión 2 · Desarrolla Talento · 28 de septiembre de 2026</w:t>
+        <w:t xml:space="preserve">Manual del programa · Versión 2.3 · Desarrolla Talento · 29 de septiembre de 2026</w:t>
       </w:r>
     </w:p>
     <w:p>
@@ -4104,1221 +4104,7 @@
         <w:pStyle w:val="Heading1"/>
       </w:pPr>
       <w:r>
-        <w:t xml:space="preserve">4. Qué cambió respecto a la versión 1</w:t>
-      </w:r>
-    </w:p>
-    <w:tbl>
-      <w:tblPr>
-        <w:tblW w:type="dxa" w:w="9640"/>
-        <w:tblBorders>
-          <w:top w:val="single" w:color="B7C9C0" w:sz="4"/>
-          <w:left w:val="single" w:color="B7C9C0" w:sz="4"/>
-          <w:bottom w:val="single" w:color="B7C9C0" w:sz="4"/>
-          <w:right w:val="single" w:color="B7C9C0" w:sz="4"/>
-          <w:insideH w:val="single" w:color="B7C9C0" w:sz="4"/>
-          <w:insideV w:val="single" w:color="B7C9C0" w:sz="4"/>
-        </w:tblBorders>
-      </w:tblPr>
-      <w:tblGrid>
-        <w:gridCol w:w="3213"/>
-        <w:gridCol w:w="3213"/>
-        <w:gridCol w:w="3214"/>
-      </w:tblGrid>
-      <w:tr>
-        <w:trPr>
-          <w:tblHeader/>
-        </w:trPr>
-        <w:tc>
-          <w:tcPr>
-            <w:tcW w:type="dxa" w:w="3213"/>
-            <w:shd w:fill="1F5C4A" w:color="auto" w:val="clear"/>
-            <w:tcMar>
-              <w:top w:type="dxa" w:w="60"/>
-              <w:left w:type="dxa" w:w="90"/>
-              <w:bottom w:type="dxa" w:w="60"/>
-              <w:right w:type="dxa" w:w="90"/>
-            </w:tcMar>
-          </w:tcPr>
-          <w:p>
-            <w:r>
-              <w:rPr>
-                <w:b/>
-                <w:bCs/>
-                <w:color w:val="FFFFFF"/>
-                <w:sz w:val="18"/>
-                <w:szCs w:val="18"/>
-              </w:rPr>
-              <w:t xml:space="preserve">Tema</w:t>
-            </w:r>
-          </w:p>
-        </w:tc>
-        <w:tc>
-          <w:tcPr>
-            <w:tcW w:type="dxa" w:w="3213"/>
-            <w:shd w:fill="1F5C4A" w:color="auto" w:val="clear"/>
-            <w:tcMar>
-              <w:top w:type="dxa" w:w="60"/>
-              <w:left w:type="dxa" w:w="90"/>
-              <w:bottom w:type="dxa" w:w="60"/>
-              <w:right w:type="dxa" w:w="90"/>
-            </w:tcMar>
-          </w:tcPr>
-          <w:p>
-            <w:r>
-              <w:rPr>
-                <w:b/>
-                <w:bCs/>
-                <w:color w:val="FFFFFF"/>
-                <w:sz w:val="18"/>
-                <w:szCs w:val="18"/>
-              </w:rPr>
-              <w:t xml:space="preserve">Versión 1</w:t>
-            </w:r>
-          </w:p>
-        </w:tc>
-        <w:tc>
-          <w:tcPr>
-            <w:tcW w:type="dxa" w:w="3214"/>
-            <w:shd w:fill="1F5C4A" w:color="auto" w:val="clear"/>
-            <w:tcMar>
-              <w:top w:type="dxa" w:w="60"/>
-              <w:left w:type="dxa" w:w="90"/>
-              <w:bottom w:type="dxa" w:w="60"/>
-              <w:right w:type="dxa" w:w="90"/>
-            </w:tcMar>
-          </w:tcPr>
-          <w:p>
-            <w:r>
-              <w:rPr>
-                <w:b/>
-                <w:bCs/>
-                <w:color w:val="FFFFFF"/>
-                <w:sz w:val="18"/>
-                <w:szCs w:val="18"/>
-              </w:rPr>
-              <w:t xml:space="preserve">Versión 2</w:t>
-            </w:r>
-          </w:p>
-        </w:tc>
-      </w:tr>
-      <w:tr>
-        <w:trPr>
-          <w:tblHeader w:val="off"/>
-        </w:trPr>
-        <w:tc>
-          <w:tcPr>
-            <w:tcW w:type="dxa" w:w="3213"/>
-            <w:tcMar>
-              <w:top w:type="dxa" w:w="60"/>
-              <w:left w:type="dxa" w:w="90"/>
-              <w:bottom w:type="dxa" w:w="60"/>
-              <w:right w:type="dxa" w:w="90"/>
-            </w:tcMar>
-          </w:tcPr>
-          <w:p>
-            <w:r>
-              <w:rPr>
-                <w:sz w:val="18"/>
-                <w:szCs w:val="18"/>
-              </w:rPr>
-              <w:t xml:space="preserve">Enfoque</w:t>
-            </w:r>
-          </w:p>
-        </w:tc>
-        <w:tc>
-          <w:tcPr>
-            <w:tcW w:type="dxa" w:w="3213"/>
-            <w:tcMar>
-              <w:top w:type="dxa" w:w="60"/>
-              <w:left w:type="dxa" w:w="90"/>
-              <w:bottom w:type="dxa" w:w="60"/>
-              <w:right w:type="dxa" w:w="90"/>
-            </w:tcMar>
-          </w:tcPr>
-          <w:p>
-            <w:r>
-              <w:rPr>
-                <w:sz w:val="18"/>
-                <w:szCs w:val="18"/>
-              </w:rPr>
-              <w:t xml:space="preserve">Crédito en un módulo de 4 lecciones, como "herramienta en la sequía"</w:t>
-            </w:r>
-          </w:p>
-        </w:tc>
-        <w:tc>
-          <w:tcPr>
-            <w:tcW w:type="dxa" w:w="3214"/>
-            <w:tcMar>
-              <w:top w:type="dxa" w:w="60"/>
-              <w:left w:type="dxa" w:w="90"/>
-              <w:bottom w:type="dxa" w:w="60"/>
-              <w:right w:type="dxa" w:w="90"/>
-            </w:tcMar>
-          </w:tcPr>
-          <w:p>
-            <w:r>
-              <w:rPr>
-                <w:sz w:val="18"/>
-                <w:szCs w:val="18"/>
-              </w:rPr>
-              <w:t xml:space="preserve">Crédito como eje: 5 módulos (sistema, comparar, deuda, Buró, salir de deudas)</w:t>
-            </w:r>
-          </w:p>
-        </w:tc>
-      </w:tr>
-      <w:tr>
-        <w:trPr>
-          <w:tblHeader w:val="off"/>
-        </w:trPr>
-        <w:tc>
-          <w:tcPr>
-            <w:tcW w:type="dxa" w:w="3213"/>
-            <w:tcMar>
-              <w:top w:type="dxa" w:w="60"/>
-              <w:left w:type="dxa" w:w="90"/>
-              <w:bottom w:type="dxa" w:w="60"/>
-              <w:right w:type="dxa" w:w="90"/>
-            </w:tcMar>
-          </w:tcPr>
-          <w:p>
-            <w:r>
-              <w:rPr>
-                <w:sz w:val="18"/>
-                <w:szCs w:val="18"/>
-              </w:rPr>
-              <w:t xml:space="preserve">RESICO</w:t>
-            </w:r>
-          </w:p>
-        </w:tc>
-        <w:tc>
-          <w:tcPr>
-            <w:tcW w:type="dxa" w:w="3213"/>
-            <w:tcMar>
-              <w:top w:type="dxa" w:w="60"/>
-              <w:left w:type="dxa" w:w="90"/>
-              <w:bottom w:type="dxa" w:w="60"/>
-              <w:right w:type="dxa" w:w="90"/>
-            </w:tcMar>
-          </w:tcPr>
-          <w:p>
-            <w:r>
-              <w:rPr>
-                <w:sz w:val="18"/>
-                <w:szCs w:val="18"/>
-              </w:rPr>
-              <w:t xml:space="preserve">"Deducir" vestuario y gastos en RESICO</w:t>
-            </w:r>
-          </w:p>
-        </w:tc>
-        <w:tc>
-          <w:tcPr>
-            <w:tcW w:type="dxa" w:w="3214"/>
-            <w:tcMar>
-              <w:top w:type="dxa" w:w="60"/>
-              <w:left w:type="dxa" w:w="90"/>
-              <w:bottom w:type="dxa" w:w="60"/>
-              <w:right w:type="dxa" w:w="90"/>
-            </w:tcMar>
-          </w:tcPr>
-          <w:p>
-            <w:r>
-              <w:rPr>
-                <w:sz w:val="18"/>
-                <w:szCs w:val="18"/>
-              </w:rPr>
-              <w:t xml:space="preserve">RESICO no permite deducir; las deducciones aplican en Actividad Empresarial</w:t>
-            </w:r>
-          </w:p>
-        </w:tc>
-      </w:tr>
-      <w:tr>
-        <w:trPr>
-          <w:tblHeader w:val="off"/>
-        </w:trPr>
-        <w:tc>
-          <w:tcPr>
-            <w:tcW w:type="dxa" w:w="3213"/>
-            <w:tcMar>
-              <w:top w:type="dxa" w:w="60"/>
-              <w:left w:type="dxa" w:w="90"/>
-              <w:bottom w:type="dxa" w:w="60"/>
-              <w:right w:type="dxa" w:w="90"/>
-            </w:tcMar>
-          </w:tcPr>
-          <w:p>
-            <w:r>
-              <w:rPr>
-                <w:sz w:val="18"/>
-                <w:szCs w:val="18"/>
-              </w:rPr>
-              <w:t xml:space="preserve">Tasa RESICO</w:t>
-            </w:r>
-          </w:p>
-        </w:tc>
-        <w:tc>
-          <w:tcPr>
-            <w:tcW w:type="dxa" w:w="3213"/>
-            <w:tcMar>
-              <w:top w:type="dxa" w:w="60"/>
-              <w:left w:type="dxa" w:w="90"/>
-              <w:bottom w:type="dxa" w:w="60"/>
-              <w:right w:type="dxa" w:w="90"/>
-            </w:tcMar>
-          </w:tcPr>
-          <w:p>
-            <w:r>
-              <w:rPr>
-                <w:sz w:val="18"/>
-                <w:szCs w:val="18"/>
-              </w:rPr>
-              <w:t xml:space="preserve">2.5% fija</w:t>
-            </w:r>
-          </w:p>
-        </w:tc>
-        <w:tc>
-          <w:tcPr>
-            <w:tcW w:type="dxa" w:w="3214"/>
-            <w:tcMar>
-              <w:top w:type="dxa" w:w="60"/>
-              <w:left w:type="dxa" w:w="90"/>
-              <w:bottom w:type="dxa" w:w="60"/>
-              <w:right w:type="dxa" w:w="90"/>
-            </w:tcMar>
-          </w:tcPr>
-          <w:p>
-            <w:r>
-              <w:rPr>
-                <w:sz w:val="18"/>
-                <w:szCs w:val="18"/>
-              </w:rPr>
-              <w:t xml:space="preserve">De 1% a 2.5% según el ingreso del mes; retención de 1.25% al facturar a empresas</w:t>
-            </w:r>
-          </w:p>
-        </w:tc>
-      </w:tr>
-      <w:tr>
-        <w:trPr>
-          <w:tblHeader w:val="off"/>
-        </w:trPr>
-        <w:tc>
-          <w:tcPr>
-            <w:tcW w:type="dxa" w:w="3213"/>
-            <w:tcMar>
-              <w:top w:type="dxa" w:w="60"/>
-              <w:left w:type="dxa" w:w="90"/>
-              <w:bottom w:type="dxa" w:w="60"/>
-              <w:right w:type="dxa" w:w="90"/>
-            </w:tcMar>
-          </w:tcPr>
-          <w:p>
-            <w:r>
-              <w:rPr>
-                <w:sz w:val="18"/>
-                <w:szCs w:val="18"/>
-              </w:rPr>
-              <w:t xml:space="preserve">IVA</w:t>
-            </w:r>
-          </w:p>
-        </w:tc>
-        <w:tc>
-          <w:tcPr>
-            <w:tcW w:type="dxa" w:w="3213"/>
-            <w:tcMar>
-              <w:top w:type="dxa" w:w="60"/>
-              <w:left w:type="dxa" w:w="90"/>
-              <w:bottom w:type="dxa" w:w="60"/>
-              <w:right w:type="dxa" w:w="90"/>
-            </w:tcMar>
-          </w:tcPr>
-          <w:p>
-            <w:r>
-              <w:rPr>
-                <w:sz w:val="18"/>
-                <w:szCs w:val="18"/>
-              </w:rPr>
-              <w:t xml:space="preserve">Casi no aparecía</w:t>
-            </w:r>
-          </w:p>
-        </w:tc>
-        <w:tc>
-          <w:tcPr>
-            <w:tcW w:type="dxa" w:w="3214"/>
-            <w:tcMar>
-              <w:top w:type="dxa" w:w="60"/>
-              <w:left w:type="dxa" w:w="90"/>
-              <w:bottom w:type="dxa" w:w="60"/>
-              <w:right w:type="dxa" w:w="90"/>
-            </w:tcMar>
-          </w:tcPr>
-          <w:p>
-            <w:r>
-              <w:rPr>
-                <w:sz w:val="18"/>
-                <w:szCs w:val="18"/>
-              </w:rPr>
-              <w:t xml:space="preserve">Lección propia (M2 U02)</w:t>
-            </w:r>
-          </w:p>
-        </w:tc>
-      </w:tr>
-      <w:tr>
-        <w:trPr>
-          <w:tblHeader w:val="off"/>
-        </w:trPr>
-        <w:tc>
-          <w:tcPr>
-            <w:tcW w:type="dxa" w:w="3213"/>
-            <w:tcMar>
-              <w:top w:type="dxa" w:w="60"/>
-              <w:left w:type="dxa" w:w="90"/>
-              <w:bottom w:type="dxa" w:w="60"/>
-              <w:right w:type="dxa" w:w="90"/>
-            </w:tcMar>
-          </w:tcPr>
-          <w:p>
-            <w:r>
-              <w:rPr>
-                <w:sz w:val="18"/>
-                <w:szCs w:val="18"/>
-              </w:rPr>
-              <w:t xml:space="preserve">IMSS</w:t>
-            </w:r>
-          </w:p>
-        </w:tc>
-        <w:tc>
-          <w:tcPr>
-            <w:tcW w:type="dxa" w:w="3213"/>
-            <w:tcMar>
-              <w:top w:type="dxa" w:w="60"/>
-              <w:left w:type="dxa" w:w="90"/>
-              <w:bottom w:type="dxa" w:w="60"/>
-              <w:right w:type="dxa" w:w="90"/>
-            </w:tcMar>
-          </w:tcPr>
-          <w:p>
-            <w:r>
-              <w:rPr>
-                <w:sz w:val="18"/>
-                <w:szCs w:val="18"/>
-              </w:rPr>
-              <w:t xml:space="preserve">Modalidad 10 sin detalle</w:t>
-            </w:r>
-          </w:p>
-        </w:tc>
-        <w:tc>
-          <w:tcPr>
-            <w:tcW w:type="dxa" w:w="3214"/>
-            <w:tcMar>
-              <w:top w:type="dxa" w:w="60"/>
-              <w:left w:type="dxa" w:w="90"/>
-              <w:bottom w:type="dxa" w:w="60"/>
-              <w:right w:type="dxa" w:w="90"/>
-            </w:tcMar>
-          </w:tcPr>
-          <w:p>
-            <w:r>
-              <w:rPr>
-                <w:sz w:val="18"/>
-                <w:szCs w:val="18"/>
-              </w:rPr>
-              <w:t xml:space="preserve">Modalidad 10 en protección (M10 U02) y Modalidad 40 en futuro (M11 U03)</w:t>
-            </w:r>
-          </w:p>
-        </w:tc>
-      </w:tr>
-      <w:tr>
-        <w:trPr>
-          <w:tblHeader w:val="off"/>
-        </w:trPr>
-        <w:tc>
-          <w:tcPr>
-            <w:tcW w:type="dxa" w:w="3213"/>
-            <w:tcMar>
-              <w:top w:type="dxa" w:w="60"/>
-              <w:left w:type="dxa" w:w="90"/>
-              <w:bottom w:type="dxa" w:w="60"/>
-              <w:right w:type="dxa" w:w="90"/>
-            </w:tcMar>
-          </w:tcPr>
-          <w:p>
-            <w:r>
-              <w:rPr>
-                <w:sz w:val="18"/>
-                <w:szCs w:val="18"/>
-              </w:rPr>
-              <w:t xml:space="preserve">Regalías</w:t>
-            </w:r>
-          </w:p>
-        </w:tc>
-        <w:tc>
-          <w:tcPr>
-            <w:tcW w:type="dxa" w:w="3213"/>
-            <w:tcMar>
-              <w:top w:type="dxa" w:w="60"/>
-              <w:left w:type="dxa" w:w="90"/>
-              <w:bottom w:type="dxa" w:w="60"/>
-              <w:right w:type="dxa" w:w="90"/>
-            </w:tcMar>
-          </w:tcPr>
-          <w:p>
-            <w:r>
-              <w:rPr>
-                <w:sz w:val="18"/>
-                <w:szCs w:val="18"/>
-              </w:rPr>
-              <w:t xml:space="preserve">AADI y "SOMEMEX"</w:t>
-            </w:r>
-          </w:p>
-        </w:tc>
-        <w:tc>
-          <w:tcPr>
-            <w:tcW w:type="dxa" w:w="3214"/>
-            <w:tcMar>
-              <w:top w:type="dxa" w:w="60"/>
-              <w:left w:type="dxa" w:w="90"/>
-              <w:bottom w:type="dxa" w:w="60"/>
-              <w:right w:type="dxa" w:w="90"/>
-            </w:tcMar>
-          </w:tcPr>
-          <w:p>
-            <w:r>
-              <w:rPr>
-                <w:sz w:val="18"/>
-                <w:szCs w:val="18"/>
-              </w:rPr>
-              <w:t xml:space="preserve">Organizaciones mexicanas: ANDA (sindicato), ANDI, SACM, EJE y SOMEXFON</w:t>
-            </w:r>
-          </w:p>
-        </w:tc>
-      </w:tr>
-      <w:tr>
-        <w:trPr>
-          <w:tblHeader w:val="off"/>
-        </w:trPr>
-        <w:tc>
-          <w:tcPr>
-            <w:tcW w:type="dxa" w:w="3213"/>
-            <w:tcMar>
-              <w:top w:type="dxa" w:w="60"/>
-              <w:left w:type="dxa" w:w="90"/>
-              <w:bottom w:type="dxa" w:w="60"/>
-              <w:right w:type="dxa" w:w="90"/>
-            </w:tcMar>
-          </w:tcPr>
-          <w:p>
-            <w:r>
-              <w:rPr>
-                <w:sz w:val="18"/>
-                <w:szCs w:val="18"/>
-              </w:rPr>
-              <w:t xml:space="preserve">Buró</w:t>
-            </w:r>
-          </w:p>
-        </w:tc>
-        <w:tc>
-          <w:tcPr>
-            <w:tcW w:type="dxa" w:w="3213"/>
-            <w:tcMar>
-              <w:top w:type="dxa" w:w="60"/>
-              <w:left w:type="dxa" w:w="90"/>
-              <w:bottom w:type="dxa" w:w="60"/>
-              <w:right w:type="dxa" w:w="90"/>
-            </w:tcMar>
-          </w:tcPr>
-          <w:p>
-            <w:r>
-              <w:rPr>
-                <w:sz w:val="18"/>
-                <w:szCs w:val="18"/>
-              </w:rPr>
-              <w:t xml:space="preserve">Una lección</w:t>
-            </w:r>
-          </w:p>
-        </w:tc>
-        <w:tc>
-          <w:tcPr>
-            <w:tcW w:type="dxa" w:w="3214"/>
-            <w:tcMar>
-              <w:top w:type="dxa" w:w="60"/>
-              <w:left w:type="dxa" w:w="90"/>
-              <w:bottom w:type="dxa" w:w="60"/>
-              <w:right w:type="dxa" w:w="90"/>
-            </w:tcMar>
-          </w:tcPr>
-          <w:p>
-            <w:r>
-              <w:rPr>
-                <w:sz w:val="18"/>
-                <w:szCs w:val="18"/>
-              </w:rPr>
-              <w:t xml:space="preserve">Módulo de 10 lecciones: Buró vs. Círculo, reportes gratis, plazos, reclamaciones, bloqueo y alertas</w:t>
-            </w:r>
-          </w:p>
-        </w:tc>
-      </w:tr>
-      <w:tr>
-        <w:trPr>
-          <w:tblHeader w:val="off"/>
-        </w:trPr>
-        <w:tc>
-          <w:tcPr>
-            <w:tcW w:type="dxa" w:w="3213"/>
-            <w:tcMar>
-              <w:top w:type="dxa" w:w="60"/>
-              <w:left w:type="dxa" w:w="90"/>
-              <w:bottom w:type="dxa" w:w="60"/>
-              <w:right w:type="dxa" w:w="90"/>
-            </w:tcMar>
-          </w:tcPr>
-          <w:p>
-            <w:r>
-              <w:rPr>
-                <w:sz w:val="18"/>
-                <w:szCs w:val="18"/>
-              </w:rPr>
-              <w:t xml:space="preserve">RESICO</w:t>
-            </w:r>
-          </w:p>
-        </w:tc>
-        <w:tc>
-          <w:tcPr>
-            <w:tcW w:type="dxa" w:w="3213"/>
-            <w:tcMar>
-              <w:top w:type="dxa" w:w="60"/>
-              <w:left w:type="dxa" w:w="90"/>
-              <w:bottom w:type="dxa" w:w="60"/>
-              <w:right w:type="dxa" w:w="90"/>
-            </w:tcMar>
-          </w:tcPr>
-          <w:p>
-            <w:r>
-              <w:rPr>
-                <w:sz w:val="18"/>
-                <w:szCs w:val="18"/>
-              </w:rPr>
-              <w:t xml:space="preserve">Sin exclusiones</w:t>
-            </w:r>
-          </w:p>
-        </w:tc>
-        <w:tc>
-          <w:tcPr>
-            <w:tcW w:type="dxa" w:w="3214"/>
-            <w:tcMar>
-              <w:top w:type="dxa" w:w="60"/>
-              <w:left w:type="dxa" w:w="90"/>
-              <w:bottom w:type="dxa" w:w="60"/>
-              <w:right w:type="dxa" w:w="90"/>
-            </w:tcMar>
-          </w:tcPr>
-          <w:p>
-            <w:r>
-              <w:rPr>
-                <w:sz w:val="18"/>
-                <w:szCs w:val="18"/>
-              </w:rPr>
-              <w:t xml:space="preserve">Exclusión por asimilados, sin deducciones personales, declaración anual según RMF</w:t>
-            </w:r>
-          </w:p>
-        </w:tc>
-      </w:tr>
-      <w:tr>
-        <w:trPr>
-          <w:tblHeader w:val="off"/>
-        </w:trPr>
-        <w:tc>
-          <w:tcPr>
-            <w:tcW w:type="dxa" w:w="3213"/>
-            <w:tcMar>
-              <w:top w:type="dxa" w:w="60"/>
-              <w:left w:type="dxa" w:w="90"/>
-              <w:bottom w:type="dxa" w:w="60"/>
-              <w:right w:type="dxa" w:w="90"/>
-            </w:tcMar>
-          </w:tcPr>
-          <w:p>
-            <w:r>
-              <w:rPr>
-                <w:sz w:val="18"/>
-                <w:szCs w:val="18"/>
-              </w:rPr>
-              <w:t xml:space="preserve">Fuente F02</w:t>
-            </w:r>
-          </w:p>
-        </w:tc>
-        <w:tc>
-          <w:tcPr>
-            <w:tcW w:type="dxa" w:w="3213"/>
-            <w:tcMar>
-              <w:top w:type="dxa" w:w="60"/>
-              <w:left w:type="dxa" w:w="90"/>
-              <w:bottom w:type="dxa" w:w="60"/>
-              <w:right w:type="dxa" w:w="90"/>
-            </w:tcMar>
-          </w:tcPr>
-          <w:p>
-            <w:r>
-              <w:rPr>
-                <w:sz w:val="18"/>
-                <w:szCs w:val="18"/>
-              </w:rPr>
-              <w:t xml:space="preserve">Guía ANDI / SAG-AFTRA (no verificable)</w:t>
-            </w:r>
-          </w:p>
-        </w:tc>
-        <w:tc>
-          <w:tcPr>
-            <w:tcW w:type="dxa" w:w="3214"/>
-            <w:tcMar>
-              <w:top w:type="dxa" w:w="60"/>
-              <w:left w:type="dxa" w:w="90"/>
-              <w:bottom w:type="dxa" w:w="60"/>
-              <w:right w:type="dxa" w:w="90"/>
-            </w:tcMar>
-          </w:tcPr>
-          <w:p>
-            <w:r>
-              <w:rPr>
-                <w:sz w:val="18"/>
-                <w:szCs w:val="18"/>
-              </w:rPr>
-              <w:t xml:space="preserve">Eliminada</w:t>
-            </w:r>
-          </w:p>
-        </w:tc>
-      </w:tr>
-      <w:tr>
-        <w:trPr>
-          <w:tblHeader w:val="off"/>
-        </w:trPr>
-        <w:tc>
-          <w:tcPr>
-            <w:tcW w:type="dxa" w:w="3213"/>
-            <w:tcMar>
-              <w:top w:type="dxa" w:w="60"/>
-              <w:left w:type="dxa" w:w="90"/>
-              <w:bottom w:type="dxa" w:w="60"/>
-              <w:right w:type="dxa" w:w="90"/>
-            </w:tcMar>
-          </w:tcPr>
-          <w:p>
-            <w:r>
-              <w:rPr>
-                <w:sz w:val="18"/>
-                <w:szCs w:val="18"/>
-              </w:rPr>
-              <w:t xml:space="preserve">Fondo de sequía</w:t>
-            </w:r>
-          </w:p>
-        </w:tc>
-        <w:tc>
-          <w:tcPr>
-            <w:tcW w:type="dxa" w:w="3213"/>
-            <w:tcMar>
-              <w:top w:type="dxa" w:w="60"/>
-              <w:left w:type="dxa" w:w="90"/>
-              <w:bottom w:type="dxa" w:w="60"/>
-              <w:right w:type="dxa" w:w="90"/>
-            </w:tcMar>
-          </w:tcPr>
-          <w:p>
-            <w:r>
-              <w:rPr>
-                <w:sz w:val="18"/>
-                <w:szCs w:val="18"/>
-              </w:rPr>
-              <w:t xml:space="preserve">"CETES a la vista", NAFTRAC, SOFIPO</w:t>
-            </w:r>
-          </w:p>
-        </w:tc>
-        <w:tc>
-          <w:tcPr>
-            <w:tcW w:type="dxa" w:w="3214"/>
-            <w:tcMar>
-              <w:top w:type="dxa" w:w="60"/>
-              <w:left w:type="dxa" w:w="90"/>
-              <w:bottom w:type="dxa" w:w="60"/>
-              <w:right w:type="dxa" w:w="90"/>
-            </w:tcMar>
-          </w:tcPr>
-          <w:p>
-            <w:r>
-              <w:rPr>
-                <w:sz w:val="18"/>
-                <w:szCs w:val="18"/>
-              </w:rPr>
-              <w:t xml:space="preserve">Cetes en Cetesdirecto (BONDDIA) y cuentas a la vista de bancos protegidos por el IPAB</w:t>
-            </w:r>
-          </w:p>
-        </w:tc>
-      </w:tr>
-      <w:tr>
-        <w:trPr>
-          <w:tblHeader w:val="off"/>
-        </w:trPr>
-        <w:tc>
-          <w:tcPr>
-            <w:tcW w:type="dxa" w:w="3213"/>
-            <w:tcMar>
-              <w:top w:type="dxa" w:w="60"/>
-              <w:left w:type="dxa" w:w="90"/>
-              <w:bottom w:type="dxa" w:w="60"/>
-              <w:right w:type="dxa" w:w="90"/>
-            </w:tcMar>
-          </w:tcPr>
-          <w:p>
-            <w:r>
-              <w:rPr>
-                <w:sz w:val="18"/>
-                <w:szCs w:val="18"/>
-              </w:rPr>
-              <w:t xml:space="preserve">e-SAR</w:t>
-            </w:r>
-          </w:p>
-        </w:tc>
-        <w:tc>
-          <w:tcPr>
-            <w:tcW w:type="dxa" w:w="3213"/>
-            <w:tcMar>
-              <w:top w:type="dxa" w:w="60"/>
-              <w:left w:type="dxa" w:w="90"/>
-              <w:bottom w:type="dxa" w:w="60"/>
-              <w:right w:type="dxa" w:w="90"/>
-            </w:tcMar>
-          </w:tcPr>
-          <w:p>
-            <w:r>
-              <w:rPr>
-                <w:sz w:val="18"/>
-                <w:szCs w:val="18"/>
-              </w:rPr>
-              <w:t xml:space="preserve">esar.com.mx</w:t>
-            </w:r>
-          </w:p>
-        </w:tc>
-        <w:tc>
-          <w:tcPr>
-            <w:tcW w:type="dxa" w:w="3214"/>
-            <w:tcMar>
-              <w:top w:type="dxa" w:w="60"/>
-              <w:left w:type="dxa" w:w="90"/>
-              <w:bottom w:type="dxa" w:w="60"/>
-              <w:right w:type="dxa" w:w="90"/>
-            </w:tcMar>
-          </w:tcPr>
-          <w:p>
-            <w:r>
-              <w:rPr>
-                <w:sz w:val="18"/>
-                <w:szCs w:val="18"/>
-              </w:rPr>
-              <w:t xml:space="preserve">e-sar.com.mx</w:t>
-            </w:r>
-          </w:p>
-        </w:tc>
-      </w:tr>
-      <w:tr>
-        <w:trPr>
-          <w:tblHeader w:val="off"/>
-        </w:trPr>
-        <w:tc>
-          <w:tcPr>
-            <w:tcW w:type="dxa" w:w="3213"/>
-            <w:tcMar>
-              <w:top w:type="dxa" w:w="60"/>
-              <w:left w:type="dxa" w:w="90"/>
-              <w:bottom w:type="dxa" w:w="60"/>
-              <w:right w:type="dxa" w:w="90"/>
-            </w:tcMar>
-          </w:tcPr>
-          <w:p>
-            <w:r>
-              <w:rPr>
-                <w:sz w:val="18"/>
-                <w:szCs w:val="18"/>
-              </w:rPr>
-              <w:t xml:space="preserve">Fórmula</w:t>
-            </w:r>
-          </w:p>
-        </w:tc>
-        <w:tc>
-          <w:tcPr>
-            <w:tcW w:type="dxa" w:w="3213"/>
-            <w:tcMar>
-              <w:top w:type="dxa" w:w="60"/>
-              <w:left w:type="dxa" w:w="90"/>
-              <w:bottom w:type="dxa" w:w="60"/>
-              <w:right w:type="dxa" w:w="90"/>
-            </w:tcMar>
-          </w:tcPr>
-          <w:p>
-            <w:r>
-              <w:rPr>
-                <w:sz w:val="18"/>
-                <w:szCs w:val="18"/>
-              </w:rPr>
-              <w:t xml:space="preserve">Texto dañado</w:t>
-            </w:r>
-          </w:p>
-        </w:tc>
-        <w:tc>
-          <w:tcPr>
-            <w:tcW w:type="dxa" w:w="3214"/>
-            <w:tcMar>
-              <w:top w:type="dxa" w:w="60"/>
-              <w:left w:type="dxa" w:w="90"/>
-              <w:bottom w:type="dxa" w:w="60"/>
-              <w:right w:type="dxa" w:w="90"/>
-            </w:tcMar>
-          </w:tcPr>
-          <w:p>
-            <w:r>
-              <w:rPr>
-                <w:sz w:val="18"/>
-                <w:szCs w:val="18"/>
-              </w:rPr>
-              <w:t xml:space="preserve">Corregida</w:t>
-            </w:r>
-          </w:p>
-        </w:tc>
-      </w:tr>
-      <w:tr>
-        <w:trPr>
-          <w:tblHeader w:val="off"/>
-        </w:trPr>
-        <w:tc>
-          <w:tcPr>
-            <w:tcW w:type="dxa" w:w="3213"/>
-            <w:tcMar>
-              <w:top w:type="dxa" w:w="60"/>
-              <w:left w:type="dxa" w:w="90"/>
-              <w:bottom w:type="dxa" w:w="60"/>
-              <w:right w:type="dxa" w:w="90"/>
-            </w:tcMar>
-          </w:tcPr>
-          <w:p>
-            <w:r>
-              <w:rPr>
-                <w:sz w:val="18"/>
-                <w:szCs w:val="18"/>
-              </w:rPr>
-              <w:t xml:space="preserve">Comparar</w:t>
-            </w:r>
-          </w:p>
-        </w:tc>
-        <w:tc>
-          <w:tcPr>
-            <w:tcW w:type="dxa" w:w="3213"/>
-            <w:tcMar>
-              <w:top w:type="dxa" w:w="60"/>
-              <w:left w:type="dxa" w:w="90"/>
-              <w:bottom w:type="dxa" w:w="60"/>
-              <w:right w:type="dxa" w:w="90"/>
-            </w:tcMar>
-          </w:tcPr>
-          <w:p>
-            <w:r>
-              <w:rPr>
-                <w:sz w:val="18"/>
-                <w:szCs w:val="18"/>
-              </w:rPr>
-              <w:t xml:space="preserve">Solo tarjetas</w:t>
-            </w:r>
-          </w:p>
-        </w:tc>
-        <w:tc>
-          <w:tcPr>
-            <w:tcW w:type="dxa" w:w="3214"/>
-            <w:tcMar>
-              <w:top w:type="dxa" w:w="60"/>
-              <w:left w:type="dxa" w:w="90"/>
-              <w:bottom w:type="dxa" w:w="60"/>
-              <w:right w:type="dxa" w:w="90"/>
-            </w:tcMar>
-          </w:tcPr>
-          <w:p>
-            <w:r>
-              <w:rPr>
-                <w:sz w:val="18"/>
-                <w:szCs w:val="18"/>
-              </w:rPr>
-              <w:t xml:space="preserve">Módulo completo: institución, cuenta, ahorro, seguro y crédito</w:t>
-            </w:r>
-          </w:p>
-        </w:tc>
-      </w:tr>
-      <w:tr>
-        <w:trPr>
-          <w:tblHeader w:val="off"/>
-        </w:trPr>
-        <w:tc>
-          <w:tcPr>
-            <w:tcW w:type="dxa" w:w="3213"/>
-            <w:tcMar>
-              <w:top w:type="dxa" w:w="60"/>
-              <w:left w:type="dxa" w:w="90"/>
-              <w:bottom w:type="dxa" w:w="60"/>
-              <w:right w:type="dxa" w:w="90"/>
-            </w:tcMar>
-          </w:tcPr>
-          <w:p>
-            <w:r>
-              <w:rPr>
-                <w:sz w:val="18"/>
-                <w:szCs w:val="18"/>
-              </w:rPr>
-              <w:t xml:space="preserve">Fraudes</w:t>
-            </w:r>
-          </w:p>
-        </w:tc>
-        <w:tc>
-          <w:tcPr>
-            <w:tcW w:type="dxa" w:w="3213"/>
-            <w:tcMar>
-              <w:top w:type="dxa" w:w="60"/>
-              <w:left w:type="dxa" w:w="90"/>
-              <w:bottom w:type="dxa" w:w="60"/>
-              <w:right w:type="dxa" w:w="90"/>
-            </w:tcMar>
-          </w:tcPr>
-          <w:p>
-            <w:r>
-              <w:rPr>
-                <w:sz w:val="18"/>
-                <w:szCs w:val="18"/>
-              </w:rPr>
-              <w:t xml:space="preserve">Sin módulo</w:t>
-            </w:r>
-          </w:p>
-        </w:tc>
-        <w:tc>
-          <w:tcPr>
-            <w:tcW w:type="dxa" w:w="3214"/>
-            <w:tcMar>
-              <w:top w:type="dxa" w:w="60"/>
-              <w:left w:type="dxa" w:w="90"/>
-              <w:bottom w:type="dxa" w:w="60"/>
-              <w:right w:type="dxa" w:w="90"/>
-            </w:tcMar>
-          </w:tcPr>
-          <w:p>
-            <w:r>
-              <w:rPr>
-                <w:sz w:val="18"/>
-                <w:szCs w:val="18"/>
-              </w:rPr>
-              <w:t xml:space="preserve">Módulo 9 completo: fraudes, falsos castings, phishing, robo de identidad, robo de cuentas, montadeudas, inversiones milagro, registros para que no te llamen con publicidad (REPEP y REUS) y plan de respuesta</w:t>
-            </w:r>
-          </w:p>
-        </w:tc>
-      </w:tr>
-      <w:tr>
-        <w:trPr>
-          <w:tblHeader w:val="off"/>
-        </w:trPr>
-        <w:tc>
-          <w:tcPr>
-            <w:tcW w:type="dxa" w:w="3213"/>
-            <w:tcMar>
-              <w:top w:type="dxa" w:w="60"/>
-              <w:left w:type="dxa" w:w="90"/>
-              <w:bottom w:type="dxa" w:w="60"/>
-              <w:right w:type="dxa" w:w="90"/>
-            </w:tcMar>
-          </w:tcPr>
-          <w:p>
-            <w:r>
-              <w:rPr>
-                <w:sz w:val="18"/>
-                <w:szCs w:val="18"/>
-              </w:rPr>
-              <w:t xml:space="preserve">Futuro y prevención</w:t>
-            </w:r>
-          </w:p>
-        </w:tc>
-        <w:tc>
-          <w:tcPr>
-            <w:tcW w:type="dxa" w:w="3213"/>
-            <w:tcMar>
-              <w:top w:type="dxa" w:w="60"/>
-              <w:left w:type="dxa" w:w="90"/>
-              <w:bottom w:type="dxa" w:w="60"/>
-              <w:right w:type="dxa" w:w="90"/>
-            </w:tcMar>
-          </w:tcPr>
-          <w:p>
-            <w:r>
-              <w:rPr>
-                <w:sz w:val="18"/>
-                <w:szCs w:val="18"/>
-              </w:rPr>
-              <w:t xml:space="preserve">2 módulos cortos</w:t>
-            </w:r>
-          </w:p>
-        </w:tc>
-        <w:tc>
-          <w:tcPr>
-            <w:tcW w:type="dxa" w:w="3214"/>
-            <w:tcMar>
-              <w:top w:type="dxa" w:w="60"/>
-              <w:left w:type="dxa" w:w="90"/>
-              <w:bottom w:type="dxa" w:w="60"/>
-              <w:right w:type="dxa" w:w="90"/>
-            </w:tcMar>
-          </w:tcPr>
-          <w:p>
-            <w:r>
-              <w:rPr>
-                <w:sz w:val="18"/>
-                <w:szCs w:val="18"/>
-              </w:rPr>
-              <w:t xml:space="preserve">Módulo 10 (6 lecciones) y Módulo 11 (9 lecciones)</w:t>
-            </w:r>
-          </w:p>
-        </w:tc>
-      </w:tr>
-      <w:tr>
-        <w:trPr>
-          <w:tblHeader w:val="off"/>
-        </w:trPr>
-        <w:tc>
-          <w:tcPr>
-            <w:tcW w:type="dxa" w:w="3213"/>
-            <w:tcMar>
-              <w:top w:type="dxa" w:w="60"/>
-              <w:left w:type="dxa" w:w="90"/>
-              <w:bottom w:type="dxa" w:w="60"/>
-              <w:right w:type="dxa" w:w="90"/>
-            </w:tcMar>
-          </w:tcPr>
-          <w:p>
-            <w:r>
-              <w:rPr>
-                <w:sz w:val="18"/>
-                <w:szCs w:val="18"/>
-              </w:rPr>
-              <w:t xml:space="preserve">Monetización</w:t>
-            </w:r>
-          </w:p>
-        </w:tc>
-        <w:tc>
-          <w:tcPr>
-            <w:tcW w:type="dxa" w:w="3213"/>
-            <w:tcMar>
-              <w:top w:type="dxa" w:w="60"/>
-              <w:left w:type="dxa" w:w="90"/>
-              <w:bottom w:type="dxa" w:w="60"/>
-              <w:right w:type="dxa" w:w="90"/>
-            </w:tcMar>
-          </w:tcPr>
-          <w:p>
-            <w:r>
-              <w:rPr>
-                <w:sz w:val="18"/>
-                <w:szCs w:val="18"/>
-              </w:rPr>
-              <w:t xml:space="preserve">Puntos de venta dentro de las lecciones</w:t>
-            </w:r>
-          </w:p>
-        </w:tc>
-        <w:tc>
-          <w:tcPr>
-            <w:tcW w:type="dxa" w:w="3214"/>
-            <w:tcMar>
-              <w:top w:type="dxa" w:w="60"/>
-              <w:left w:type="dxa" w:w="90"/>
-              <w:bottom w:type="dxa" w:w="60"/>
-              <w:right w:type="dxa" w:w="90"/>
-            </w:tcMar>
-          </w:tcPr>
-          <w:p>
-            <w:r>
-              <w:rPr>
-                <w:sz w:val="18"/>
-                <w:szCs w:val="18"/>
-              </w:rPr>
-              <w:t xml:space="preserve">Fuera de las lecciones; solo en canales, identificada como referencia</w:t>
-            </w:r>
-          </w:p>
-        </w:tc>
-      </w:tr>
-      <w:tr>
-        <w:trPr>
-          <w:tblHeader w:val="off"/>
-        </w:trPr>
-        <w:tc>
-          <w:tcPr>
-            <w:tcW w:type="dxa" w:w="3213"/>
-            <w:tcMar>
-              <w:top w:type="dxa" w:w="60"/>
-              <w:left w:type="dxa" w:w="90"/>
-              <w:bottom w:type="dxa" w:w="60"/>
-              <w:right w:type="dxa" w:w="90"/>
-            </w:tcMar>
-          </w:tcPr>
-          <w:p>
-            <w:r>
-              <w:rPr>
-                <w:sz w:val="18"/>
-                <w:szCs w:val="18"/>
-              </w:rPr>
-              <w:t xml:space="preserve">Quiz</w:t>
-            </w:r>
-          </w:p>
-        </w:tc>
-        <w:tc>
-          <w:tcPr>
-            <w:tcW w:type="dxa" w:w="3213"/>
-            <w:tcMar>
-              <w:top w:type="dxa" w:w="60"/>
-              <w:left w:type="dxa" w:w="90"/>
-              <w:bottom w:type="dxa" w:w="60"/>
-              <w:right w:type="dxa" w:w="90"/>
-            </w:tcMar>
-          </w:tcPr>
-          <w:p>
-            <w:r>
-              <w:rPr>
-                <w:sz w:val="18"/>
-                <w:szCs w:val="18"/>
-              </w:rPr>
-              <w:t xml:space="preserve">Preguntas de memoria</w:t>
-            </w:r>
-          </w:p>
-        </w:tc>
-        <w:tc>
-          <w:tcPr>
-            <w:tcW w:type="dxa" w:w="3214"/>
-            <w:tcMar>
-              <w:top w:type="dxa" w:w="60"/>
-              <w:left w:type="dxa" w:w="90"/>
-              <w:bottom w:type="dxa" w:w="60"/>
-              <w:right w:type="dxa" w:w="90"/>
-            </w:tcMar>
-          </w:tcPr>
-          <w:p>
-            <w:r>
-              <w:rPr>
-                <w:sz w:val="18"/>
-                <w:szCs w:val="18"/>
-              </w:rPr>
-              <w:t xml:space="preserve">Preguntas de decisión</w:t>
-            </w:r>
-          </w:p>
-        </w:tc>
-      </w:tr>
-    </w:tbl>
-    <w:p/>
-    <w:p>
-      <w:r>
-        <w:br w:type="page"/>
-      </w:r>
-    </w:p>
-    <w:p>
-      <w:pPr>
-        <w:pStyle w:val="Heading1"/>
-      </w:pPr>
-      <w:r>
-        <w:t xml:space="preserve">5. Comunidad, canales y referencias</w:t>
+        <w:t xml:space="preserve">4. Comunidad, canales y referencias</w:t>
       </w:r>
     </w:p>
     <w:p>
@@ -5873,7 +4659,7 @@
         <w:pStyle w:val="Heading1"/>
       </w:pPr>
       <w:r>
-        <w:t xml:space="preserve">6. Bibliografía y fuentes oficiales</w:t>
+        <w:t xml:space="preserve">5. Bibliografía y fuentes oficiales</w:t>
       </w:r>
     </w:p>
     <w:p>
@@ -7521,7 +6307,7 @@
         <w:pStyle w:val="Heading1"/>
       </w:pPr>
       <w:r>
-        <w:t xml:space="preserve">7. Datos verificados (29 de septiembre de 2026)</w:t>
+        <w:t xml:space="preserve">6. Datos verificados (29 de septiembre de 2026)</w:t>
       </w:r>
     </w:p>
     <w:tbl>

</xml_diff>

<commit_message>
Tu Talento: lecciones de estrés, apuestas, IA y desastres; salario mínimo sin descuentos de ISR e IMSS; generador de paquetes de actualización
Co-Authored-By: Claude Opus 5.5 <noreply@anthropic.com>
Claude-Session: https://claude.ai/code/session_01P5F6YBSbmgYFHyY7RUeBgK
</commit_message>
<xml_diff>
--- a/proyecto-entretenimiento/manual/TTMF_manual_v2.docx
+++ b/proyecto-entretenimiento/manual/TTMF_manual_v2.docx
@@ -32,7 +32,7 @@
           <w:sz w:val="28"/>
           <w:szCs w:val="28"/>
         </w:rPr>
-        <w:t xml:space="preserve">Manual del programa · Versión 2.3 · Septiembre de 2026</w:t>
+        <w:t xml:space="preserve">Manual del programa · Versión 2.4 · Septiembre de 2026</w:t>
       </w:r>
     </w:p>
     <w:p>
@@ -50,7 +50,7 @@
     </w:p>
     <w:p>
       <w:r>
-        <w:t xml:space="preserve">Manual del programa · Versión 2.3 · Desarrolla Talento · 29 de septiembre de 2026</w:t>
+        <w:t xml:space="preserve">Manual del programa · Versión 2.4 · Desarrolla Talento · 30 de septiembre de 2026</w:t>
       </w:r>
     </w:p>
     <w:p>
@@ -379,7 +379,7 @@
                 <w:sz w:val="18"/>
                 <w:szCs w:val="18"/>
               </w:rPr>
-              <w:t xml:space="preserve">11 módulos, 73 lecciones de 5 a 10 minutos</w:t>
+              <w:t xml:space="preserve">11 módulos, 77 lecciones de 5 a 10 minutos</w:t>
             </w:r>
           </w:p>
         </w:tc>
@@ -1964,6 +1964,18 @@
       </w:r>
       <w:r>
         <w:t xml:space="preserve"> Objetivo: hacer un calendario de cobros y pagos con los tiempos reales de pago de las productoras, agencias y plataformas. Gancho: Gael terminó de grabar en marzo y le pagan en junio; su tarjeta vence en abril.</w:t>
+      </w:r>
+    </w:p>
+    <w:p>
+      <w:r>
+        <w:rPr>
+          <w:b/>
+          <w:bCs/>
+        </w:rPr>
+        <w:t xml:space="preserve">M1 U07 · Meses sin llamados: estrés, rechazo y dinero</w:t>
+      </w:r>
+      <w:r>
+        <w:t xml:space="preserve"> Objetivo: reconocer cómo el estrés y los rechazos empujan a gastar o a endeudarse, y usar tres hábitos: pausa de 48 horas, revisión semanal y plática mensual de dinero en casa. Línea de la Vida (800 911 2000) si el estrés no baja. Gancho: Renata lleva cuatro castings sin quedarse y cada rechazo termina en una compra con la tarjeta.</w:t>
       </w:r>
     </w:p>
     <w:p>
@@ -3783,6 +3795,18 @@
       </w:r>
     </w:p>
     <w:p>
+      <w:r>
+        <w:rPr>
+          <w:b/>
+          <w:bCs/>
+        </w:rPr>
+        <w:t xml:space="preserve">M8 U06 · Apuestas en línea: el pago gordo no es para apostar</w:t>
+      </w:r>
+      <w:r>
+        <w:t xml:space="preserve"> Objetivo: reconocer las señales (apostar para recuperar, usar el fondo de sequía o crédito), verificar que el sitio tenga permiso de Gobernación y saber dónde pedir ayuda. Gancho: Toño metió 8,000 de su fondo de sequía a las apuestas «para recuperar» y se atrasó con su tarjeta.</w:t>
+      </w:r>
+    </w:p>
+    <w:p>
       <w:pPr>
         <w:pStyle w:val="Heading2"/>
       </w:pPr>
@@ -3899,6 +3923,18 @@
       </w:r>
     </w:p>
     <w:p>
+      <w:r>
+        <w:rPr>
+          <w:b/>
+          <w:bCs/>
+        </w:rPr>
+        <w:t xml:space="preserve">M9 U10 · Tu voz y tu cara con inteligencia artificial: deepfakes y fraudes</w:t>
+      </w:r>
+      <w:r>
+        <w:t xml:space="preserve"> Objetivo: reconocer voces y videos falsos, confirmar todo pedido de dinero por un canal propio, acordar una palabra clave, proteger la voz y la imagen con cláusulas de IA en los contratos y responder si usan tu cara para estafar. Gancho: circula un video falso de Valeria recomendando una plataforma de inversión.</w:t>
+      </w:r>
+    </w:p>
+    <w:p>
       <w:pPr>
         <w:pStyle w:val="Heading2"/>
       </w:pPr>
@@ -3976,6 +4012,18 @@
       </w:r>
       <w:r>
         <w:t xml:space="preserve"> Objetivo: hacer tu testamento (en septiembre, el Mes del Testamento suele bajar costos), ordenar tus documentos y dejar instrucciones sobre tus regalías y derechos.</w:t>
+      </w:r>
+    </w:p>
+    <w:p>
+      <w:r>
+        <w:rPr>
+          <w:b/>
+          <w:bCs/>
+        </w:rPr>
+        <w:t xml:space="preserve">M10 U07 · Si llega un sismo o una inundación: tu equipo y tu trabajo</w:t>
+      </w:r>
+      <w:r>
+        <w:t xml:space="preserve"> Objetivo: respaldar proyectos en la nube, guardar fotos y facturas del equipo, revisar que el seguro cubra equipo de trabajo y tu zona, reclamar sin pagar por adelantado y evitar colectas falsas. Gancho: una inundación llega al estudio de Toño; pierde equipo y proyectos sin seguro ni respaldo.</w:t>
       </w:r>
     </w:p>
     <w:p>
@@ -8295,6 +8343,261 @@
                 <w:szCs w:val="18"/>
               </w:rPr>
               <w:t xml:space="preserve">Comisión Reguladora de Telecomunicaciones</w:t>
+            </w:r>
+          </w:p>
+        </w:tc>
+      </w:tr>
+      <w:tr>
+        <w:trPr>
+          <w:tblHeader w:val="off"/>
+        </w:trPr>
+        <w:tc>
+          <w:tcPr>
+            <w:tcW w:type="dxa" w:w="2410"/>
+            <w:tcMar>
+              <w:top w:type="dxa" w:w="60"/>
+              <w:left w:type="dxa" w:w="90"/>
+              <w:bottom w:type="dxa" w:w="60"/>
+              <w:right w:type="dxa" w:w="90"/>
+            </w:tcMar>
+          </w:tcPr>
+          <w:p>
+            <w:r>
+              <w:rPr>
+                <w:sz w:val="18"/>
+                <w:szCs w:val="18"/>
+              </w:rPr>
+              <w:t xml:space="preserve">E23</w:t>
+            </w:r>
+          </w:p>
+        </w:tc>
+        <w:tc>
+          <w:tcPr>
+            <w:tcW w:type="dxa" w:w="2410"/>
+            <w:tcMar>
+              <w:top w:type="dxa" w:w="60"/>
+              <w:left w:type="dxa" w:w="90"/>
+              <w:bottom w:type="dxa" w:w="60"/>
+              <w:right w:type="dxa" w:w="90"/>
+            </w:tcMar>
+          </w:tcPr>
+          <w:p>
+            <w:r>
+              <w:rPr>
+                <w:sz w:val="18"/>
+                <w:szCs w:val="18"/>
+              </w:rPr>
+              <w:t xml:space="preserve">Línea de la Vida</w:t>
+            </w:r>
+          </w:p>
+        </w:tc>
+        <w:tc>
+          <w:tcPr>
+            <w:tcW w:type="dxa" w:w="2410"/>
+            <w:tcMar>
+              <w:top w:type="dxa" w:w="60"/>
+              <w:left w:type="dxa" w:w="90"/>
+              <w:bottom w:type="dxa" w:w="60"/>
+              <w:right w:type="dxa" w:w="90"/>
+            </w:tcMar>
+          </w:tcPr>
+          <w:p>
+            <w:r>
+              <w:rPr>
+                <w:sz w:val="18"/>
+                <w:szCs w:val="18"/>
+              </w:rPr>
+              <w:t xml:space="preserve">800 911 2000, gratuita, 24 horas, todos los días; salud mental y adicciones, incluido el juego</w:t>
+            </w:r>
+          </w:p>
+        </w:tc>
+        <w:tc>
+          <w:tcPr>
+            <w:tcW w:type="dxa" w:w="2410"/>
+            <w:tcMar>
+              <w:top w:type="dxa" w:w="60"/>
+              <w:left w:type="dxa" w:w="90"/>
+              <w:bottom w:type="dxa" w:w="60"/>
+              <w:right w:type="dxa" w:w="90"/>
+            </w:tcMar>
+          </w:tcPr>
+          <w:p>
+            <w:r>
+              <w:rPr>
+                <w:sz w:val="18"/>
+                <w:szCs w:val="18"/>
+              </w:rPr>
+              <w:t xml:space="preserve">CONASAMA</w:t>
+            </w:r>
+          </w:p>
+        </w:tc>
+      </w:tr>
+      <w:tr>
+        <w:trPr>
+          <w:tblHeader w:val="off"/>
+        </w:trPr>
+        <w:tc>
+          <w:tcPr>
+            <w:tcW w:type="dxa" w:w="2410"/>
+            <w:tcMar>
+              <w:top w:type="dxa" w:w="60"/>
+              <w:left w:type="dxa" w:w="90"/>
+              <w:bottom w:type="dxa" w:w="60"/>
+              <w:right w:type="dxa" w:w="90"/>
+            </w:tcMar>
+          </w:tcPr>
+          <w:p>
+            <w:r>
+              <w:rPr>
+                <w:sz w:val="18"/>
+                <w:szCs w:val="18"/>
+              </w:rPr>
+              <w:t xml:space="preserve">E24</w:t>
+            </w:r>
+          </w:p>
+        </w:tc>
+        <w:tc>
+          <w:tcPr>
+            <w:tcW w:type="dxa" w:w="2410"/>
+            <w:tcMar>
+              <w:top w:type="dxa" w:w="60"/>
+              <w:left w:type="dxa" w:w="90"/>
+              <w:bottom w:type="dxa" w:w="60"/>
+              <w:right w:type="dxa" w:w="90"/>
+            </w:tcMar>
+          </w:tcPr>
+          <w:p>
+            <w:r>
+              <w:rPr>
+                <w:sz w:val="18"/>
+                <w:szCs w:val="18"/>
+              </w:rPr>
+              <w:t xml:space="preserve">Juegos con apuestas</w:t>
+            </w:r>
+          </w:p>
+        </w:tc>
+        <w:tc>
+          <w:tcPr>
+            <w:tcW w:type="dxa" w:w="2410"/>
+            <w:tcMar>
+              <w:top w:type="dxa" w:w="60"/>
+              <w:left w:type="dxa" w:w="90"/>
+              <w:bottom w:type="dxa" w:w="60"/>
+              <w:right w:type="dxa" w:w="90"/>
+            </w:tcMar>
+          </w:tcPr>
+          <w:p>
+            <w:r>
+              <w:rPr>
+                <w:sz w:val="18"/>
+                <w:szCs w:val="18"/>
+              </w:rPr>
+              <w:t xml:space="preserve">Casinos y apuestas, también en línea, requieren permiso de la Secretaría de Gobernación</w:t>
+            </w:r>
+          </w:p>
+        </w:tc>
+        <w:tc>
+          <w:tcPr>
+            <w:tcW w:type="dxa" w:w="2410"/>
+            <w:tcMar>
+              <w:top w:type="dxa" w:w="60"/>
+              <w:left w:type="dxa" w:w="90"/>
+              <w:bottom w:type="dxa" w:w="60"/>
+              <w:right w:type="dxa" w:w="90"/>
+            </w:tcMar>
+          </w:tcPr>
+          <w:p>
+            <w:r>
+              <w:rPr>
+                <w:sz w:val="18"/>
+                <w:szCs w:val="18"/>
+              </w:rPr>
+              <w:t xml:space="preserve">Ley Federal de Juegos y Sorteos; Segob</w:t>
+            </w:r>
+          </w:p>
+        </w:tc>
+      </w:tr>
+      <w:tr>
+        <w:trPr>
+          <w:tblHeader w:val="off"/>
+        </w:trPr>
+        <w:tc>
+          <w:tcPr>
+            <w:tcW w:type="dxa" w:w="2410"/>
+            <w:tcMar>
+              <w:top w:type="dxa" w:w="60"/>
+              <w:left w:type="dxa" w:w="90"/>
+              <w:bottom w:type="dxa" w:w="60"/>
+              <w:right w:type="dxa" w:w="90"/>
+            </w:tcMar>
+          </w:tcPr>
+          <w:p>
+            <w:r>
+              <w:rPr>
+                <w:sz w:val="18"/>
+                <w:szCs w:val="18"/>
+              </w:rPr>
+              <w:t xml:space="preserve">E25</w:t>
+            </w:r>
+          </w:p>
+        </w:tc>
+        <w:tc>
+          <w:tcPr>
+            <w:tcW w:type="dxa" w:w="2410"/>
+            <w:tcMar>
+              <w:top w:type="dxa" w:w="60"/>
+              <w:left w:type="dxa" w:w="90"/>
+              <w:bottom w:type="dxa" w:w="60"/>
+              <w:right w:type="dxa" w:w="90"/>
+            </w:tcMar>
+          </w:tcPr>
+          <w:p>
+            <w:r>
+              <w:rPr>
+                <w:sz w:val="18"/>
+                <w:szCs w:val="18"/>
+              </w:rPr>
+              <w:t xml:space="preserve">Pago de siniestros</w:t>
+            </w:r>
+          </w:p>
+        </w:tc>
+        <w:tc>
+          <w:tcPr>
+            <w:tcW w:type="dxa" w:w="2410"/>
+            <w:tcMar>
+              <w:top w:type="dxa" w:w="60"/>
+              <w:left w:type="dxa" w:w="90"/>
+              <w:bottom w:type="dxa" w:w="60"/>
+              <w:right w:type="dxa" w:w="90"/>
+            </w:tcMar>
+          </w:tcPr>
+          <w:p>
+            <w:r>
+              <w:rPr>
+                <w:sz w:val="18"/>
+                <w:szCs w:val="18"/>
+              </w:rPr>
+              <w:t xml:space="preserve">La aseguradora tiene 30 días para pagar después de recibir documentos e información; reclamación gratuita en CONDUSEF</w:t>
+            </w:r>
+          </w:p>
+        </w:tc>
+        <w:tc>
+          <w:tcPr>
+            <w:tcW w:type="dxa" w:w="2410"/>
+            <w:tcMar>
+              <w:top w:type="dxa" w:w="60"/>
+              <w:left w:type="dxa" w:w="90"/>
+              <w:bottom w:type="dxa" w:w="60"/>
+              <w:right w:type="dxa" w:w="90"/>
+            </w:tcMar>
+          </w:tcPr>
+          <w:p>
+            <w:r>
+              <w:rPr>
+                <w:sz w:val="18"/>
+                <w:szCs w:val="18"/>
+              </w:rPr>
+              <w:t xml:space="preserve">Ley sobre el Contrato de Seguro; CONDUSEF</w:t>
             </w:r>
           </w:p>
         </w:tc>

</xml_diff>